<commit_message>
test: normalize office fixture metadata
</commit_message>
<xml_diff>
--- a/apps/api/src/lib/docx/fixtures/spa-template-with-placeholders.docx
+++ b/apps/api/src/lib/docx/fixtures/spa-template-with-placeholders.docx
@@ -3198,7 +3198,7 @@
         <w:ind w:left="567" w:hanging="567"/>
         <w:contextualSpacing w:val="0"/>
         <w:rPr>
-          <w:del w:id="8" w:author="Damian Struk" w:date="2024-11-09T13:09:00Z" w16du:dateUtc="2024-11-09T12:09:00Z"/>
+          <w:del w:id="8" w:author="stella" w:date="2024-11-09T13:09:00Z" w16du:dateUtc="2024-11-09T12:09:00Z"/>
           <w:rFonts w:ascii="Corbel" w:hAnsi="Corbel"/>
           <w:bCs/>
           <w:color w:val="575757"/>
@@ -3206,7 +3206,7 @@
         </w:rPr>
       </w:pPr>
       <w:bookmarkStart w:id="9" w:name="_Hlk98163135"/>
-      <w:del w:id="10" w:author="Damian Struk" w:date="2024-11-09T13:09:00Z" w16du:dateUtc="2024-11-09T12:09:00Z">
+      <w:del w:id="10" w:author="stella" w:date="2024-11-09T13:09:00Z" w16du:dateUtc="2024-11-09T12:09:00Z">
         <w:r>
           <w:rPr>
             <w:rFonts w:ascii="Corbel" w:hAnsi="Corbel"/>
@@ -3233,14 +3233,14 @@
         <w:widowControl w:val="0"/>
         <w:spacing w:before="120" w:after="120" w:line="300" w:lineRule="exact"/>
         <w:rPr>
-          <w:del w:id="11" w:author="Damian Struk" w:date="2024-11-09T13:09:00Z" w16du:dateUtc="2024-11-09T12:09:00Z"/>
+          <w:del w:id="11" w:author="stella" w:date="2024-11-09T13:09:00Z" w16du:dateUtc="2024-11-09T12:09:00Z"/>
           <w:rFonts w:ascii="Corbel" w:hAnsi="Corbel"/>
           <w:bCs/>
           <w:color w:val="575757"/>
           <w:lang w:eastAsia="en-US"/>
         </w:rPr>
       </w:pPr>
-      <w:del w:id="12" w:author="Damian Struk" w:date="2024-11-09T13:09:00Z" w16du:dateUtc="2024-11-09T12:09:00Z">
+      <w:del w:id="12" w:author="stella" w:date="2024-11-09T13:09:00Z" w16du:dateUtc="2024-11-09T12:09:00Z">
         <w:r>
           <w:rPr>
             <w:rFonts w:ascii="Corbel" w:hAnsi="Corbel"/>
@@ -5573,7 +5573,7 @@
           <w:tblW w:w="9498" w:type="dxa"/>
           <w:tblInd w:w="567" w:type="dxa"/>
           <w:tblLayout w:type="fixed"/>
-          <w:tblPrExChange w:id="15" w:author="Damian Struk" w:date="2024-11-09T13:09:00Z" w16du:dateUtc="2024-11-09T12:09:00Z">
+          <w:tblPrExChange w:id="15" w:author="stella" w:date="2024-11-09T13:09:00Z" w16du:dateUtc="2024-11-09T12:09:00Z">
             <w:tblPrEx>
               <w:tblW w:w="9498" w:type="dxa"/>
               <w:tblInd w:w="567" w:type="dxa"/>
@@ -5584,7 +5584,7 @@
         <w:tc>
           <w:tcPr>
             <w:tcW w:w="709" w:type="dxa"/>
-            <w:tcPrChange w:id="16" w:author="Damian Struk" w:date="2024-11-09T13:09:00Z" w16du:dateUtc="2024-11-09T12:09:00Z">
+            <w:tcPrChange w:id="16" w:author="stella" w:date="2024-11-09T13:09:00Z" w16du:dateUtc="2024-11-09T12:09:00Z">
               <w:tcPr>
                 <w:tcW w:w="709" w:type="dxa"/>
               </w:tcPr>
@@ -5612,7 +5612,7 @@
         <w:tc>
           <w:tcPr>
             <w:tcW w:w="2226" w:type="dxa"/>
-            <w:tcPrChange w:id="17" w:author="Damian Struk" w:date="2024-11-09T13:09:00Z" w16du:dateUtc="2024-11-09T12:09:00Z">
+            <w:tcPrChange w:id="17" w:author="stella" w:date="2024-11-09T13:09:00Z" w16du:dateUtc="2024-11-09T12:09:00Z">
               <w:tcPr>
                 <w:tcW w:w="2226" w:type="dxa"/>
               </w:tcPr>
@@ -5632,7 +5632,7 @@
                 <w:lang w:eastAsia="ja-JP"/>
               </w:rPr>
             </w:pPr>
-            <w:ins w:id="18" w:author="Damian Struk" w:date="2024-11-09T13:09:00Z" w16du:dateUtc="2024-11-09T12:09:00Z">
+            <w:ins w:id="18" w:author="stella" w:date="2024-11-09T13:09:00Z" w16du:dateUtc="2024-11-09T12:09:00Z">
               <w:r>
                 <w:rPr>
                   <w:rFonts w:ascii="Corbel" w:hAnsi="Corbel"/>
@@ -5643,7 +5643,7 @@
                 <w:t>Podíl</w:t>
               </w:r>
             </w:ins>
-            <w:del w:id="19" w:author="Damian Struk" w:date="2024-11-09T13:09:00Z" w16du:dateUtc="2024-11-09T12:09:00Z">
+            <w:del w:id="19" w:author="stella" w:date="2024-11-09T13:09:00Z" w16du:dateUtc="2024-11-09T12:09:00Z">
               <w:r>
                 <w:rPr>
                   <w:rFonts w:ascii="Corbel" w:hAnsi="Corbel"/>
@@ -5659,7 +5659,7 @@
         <w:tc>
           <w:tcPr>
             <w:tcW w:w="6563" w:type="dxa"/>
-            <w:tcPrChange w:id="20" w:author="Damian Struk" w:date="2024-11-09T13:09:00Z" w16du:dateUtc="2024-11-09T12:09:00Z">
+            <w:tcPrChange w:id="20" w:author="stella" w:date="2024-11-09T13:09:00Z" w16du:dateUtc="2024-11-09T12:09:00Z">
               <w:tcPr>
                 <w:tcW w:w="6563" w:type="dxa"/>
               </w:tcPr>
@@ -5678,7 +5678,7 @@
                 <w:lang w:eastAsia="ja-JP"/>
               </w:rPr>
             </w:pPr>
-            <w:ins w:id="21" w:author="Damian Struk" w:date="2024-11-09T13:09:00Z" w16du:dateUtc="2024-11-09T12:09:00Z">
+            <w:ins w:id="21" w:author="stella" w:date="2024-11-09T13:09:00Z" w16du:dateUtc="2024-11-09T12:09:00Z">
               <w:r>
                 <w:rPr>
                   <w:rFonts w:ascii="Corbel" w:hAnsi="Corbel"/>
@@ -5688,7 +5688,7 @@
                 <w:t>znamená kterýkoli z Podílů, nebo dle kontextu jen některý z Podílů.</w:t>
               </w:r>
             </w:ins>
-            <w:del w:id="22" w:author="Damian Struk" w:date="2024-11-09T13:09:00Z" w16du:dateUtc="2024-11-09T12:09:00Z">
+            <w:del w:id="22" w:author="stella" w:date="2024-11-09T13:09:00Z" w16du:dateUtc="2024-11-09T12:09:00Z">
               <w:r>
                 <w:rPr>
                   <w:rFonts w:ascii="Corbel" w:hAnsi="Corbel"/>
@@ -5761,7 +5761,7 @@
           <w:tblW w:w="9498" w:type="dxa"/>
           <w:tblInd w:w="567" w:type="dxa"/>
           <w:tblLayout w:type="fixed"/>
-          <w:tblPrExChange w:id="23" w:author="Damian Struk" w:date="2024-11-09T13:09:00Z" w16du:dateUtc="2024-11-09T12:09:00Z">
+          <w:tblPrExChange w:id="23" w:author="stella" w:date="2024-11-09T13:09:00Z" w16du:dateUtc="2024-11-09T12:09:00Z">
             <w:tblPrEx>
               <w:tblW w:w="9498" w:type="dxa"/>
               <w:tblInd w:w="567" w:type="dxa"/>
@@ -5771,7 +5771,7 @@
         </w:tblPrEx>
         <w:trPr>
           <w:trHeight w:val="265"/>
-          <w:trPrChange w:id="24" w:author="Damian Struk" w:date="2024-11-09T13:09:00Z" w16du:dateUtc="2024-11-09T12:09:00Z">
+          <w:trPrChange w:id="24" w:author="stella" w:date="2024-11-09T13:09:00Z" w16du:dateUtc="2024-11-09T12:09:00Z">
             <w:trPr>
               <w:trHeight w:val="265"/>
             </w:trPr>
@@ -5780,7 +5780,7 @@
         <w:tc>
           <w:tcPr>
             <w:tcW w:w="709" w:type="dxa"/>
-            <w:tcPrChange w:id="25" w:author="Damian Struk" w:date="2024-11-09T13:09:00Z" w16du:dateUtc="2024-11-09T12:09:00Z">
+            <w:tcPrChange w:id="25" w:author="stella" w:date="2024-11-09T13:09:00Z" w16du:dateUtc="2024-11-09T12:09:00Z">
               <w:tcPr>
                 <w:tcW w:w="709" w:type="dxa"/>
               </w:tcPr>
@@ -5808,7 +5808,7 @@
         <w:tc>
           <w:tcPr>
             <w:tcW w:w="2226" w:type="dxa"/>
-            <w:tcPrChange w:id="26" w:author="Damian Struk" w:date="2024-11-09T13:09:00Z" w16du:dateUtc="2024-11-09T12:09:00Z">
+            <w:tcPrChange w:id="26" w:author="stella" w:date="2024-11-09T13:09:00Z" w16du:dateUtc="2024-11-09T12:09:00Z">
               <w:tcPr>
                 <w:tcW w:w="2226" w:type="dxa"/>
               </w:tcPr>
@@ -5828,7 +5828,7 @@
                 <w:lang w:eastAsia="ja-JP"/>
               </w:rPr>
             </w:pPr>
-            <w:ins w:id="27" w:author="Damian Struk" w:date="2024-11-09T13:09:00Z" w16du:dateUtc="2024-11-09T12:09:00Z">
+            <w:ins w:id="27" w:author="stella" w:date="2024-11-09T13:09:00Z" w16du:dateUtc="2024-11-09T12:09:00Z">
               <w:r>
                 <w:rPr>
                   <w:rFonts w:ascii="Corbel" w:hAnsi="Corbel"/>
@@ -5848,7 +5848,7 @@
                 <w:t>1</w:t>
               </w:r>
             </w:ins>
-            <w:del w:id="28" w:author="Damian Struk" w:date="2024-11-09T13:09:00Z" w16du:dateUtc="2024-11-09T12:09:00Z">
+            <w:del w:id="28" w:author="stella" w:date="2024-11-09T13:09:00Z" w16du:dateUtc="2024-11-09T12:09:00Z">
               <w:r>
                 <w:rPr>
                   <w:rFonts w:ascii="Corbel" w:hAnsi="Corbel"/>
@@ -5864,7 +5864,7 @@
         <w:tc>
           <w:tcPr>
             <w:tcW w:w="6563" w:type="dxa"/>
-            <w:tcPrChange w:id="29" w:author="Damian Struk" w:date="2024-11-09T13:09:00Z" w16du:dateUtc="2024-11-09T12:09:00Z">
+            <w:tcPrChange w:id="29" w:author="stella" w:date="2024-11-09T13:09:00Z" w16du:dateUtc="2024-11-09T12:09:00Z">
               <w:tcPr>
                 <w:tcW w:w="6563" w:type="dxa"/>
               </w:tcPr>
@@ -5883,7 +5883,7 @@
                 <w:lang w:eastAsia="ja-JP"/>
               </w:rPr>
             </w:pPr>
-            <w:ins w:id="30" w:author="Damian Struk" w:date="2024-11-09T13:09:00Z" w16du:dateUtc="2024-11-09T12:09:00Z">
+            <w:ins w:id="30" w:author="stella" w:date="2024-11-09T13:09:00Z" w16du:dateUtc="2024-11-09T12:09:00Z">
               <w:r>
                 <w:rPr>
                   <w:rFonts w:ascii="Corbel" w:hAnsi="Corbel"/>
@@ -5973,7 +5973,7 @@
                 <w:t>.</w:t>
               </w:r>
             </w:ins>
-            <w:del w:id="31" w:author="Damian Struk" w:date="2024-11-09T13:09:00Z" w16du:dateUtc="2024-11-09T12:09:00Z">
+            <w:del w:id="31" w:author="stella" w:date="2024-11-09T13:09:00Z" w16du:dateUtc="2024-11-09T12:09:00Z">
               <w:r>
                 <w:rPr>
                   <w:rFonts w:ascii="Corbel" w:hAnsi="Corbel"/>
@@ -5991,7 +5991,7 @@
           <w:tblW w:w="9498" w:type="dxa"/>
           <w:tblInd w:w="567" w:type="dxa"/>
           <w:tblLayout w:type="fixed"/>
-          <w:tblPrExChange w:id="32" w:author="Damian Struk" w:date="2024-11-09T13:09:00Z" w16du:dateUtc="2024-11-09T12:09:00Z">
+          <w:tblPrExChange w:id="32" w:author="stella" w:date="2024-11-09T13:09:00Z" w16du:dateUtc="2024-11-09T12:09:00Z">
             <w:tblPrEx>
               <w:tblW w:w="9498" w:type="dxa"/>
               <w:tblInd w:w="567" w:type="dxa"/>
@@ -6001,7 +6001,7 @@
         </w:tblPrEx>
         <w:trPr>
           <w:trHeight w:val="265"/>
-          <w:trPrChange w:id="33" w:author="Damian Struk" w:date="2024-11-09T13:09:00Z" w16du:dateUtc="2024-11-09T12:09:00Z">
+          <w:trPrChange w:id="33" w:author="stella" w:date="2024-11-09T13:09:00Z" w16du:dateUtc="2024-11-09T12:09:00Z">
             <w:trPr>
               <w:trHeight w:val="265"/>
             </w:trPr>
@@ -6010,7 +6010,7 @@
         <w:tc>
           <w:tcPr>
             <w:tcW w:w="709" w:type="dxa"/>
-            <w:tcPrChange w:id="34" w:author="Damian Struk" w:date="2024-11-09T13:09:00Z" w16du:dateUtc="2024-11-09T12:09:00Z">
+            <w:tcPrChange w:id="34" w:author="stella" w:date="2024-11-09T13:09:00Z" w16du:dateUtc="2024-11-09T12:09:00Z">
               <w:tcPr>
                 <w:tcW w:w="709" w:type="dxa"/>
               </w:tcPr>
@@ -6038,7 +6038,7 @@
         <w:tc>
           <w:tcPr>
             <w:tcW w:w="2226" w:type="dxa"/>
-            <w:tcPrChange w:id="35" w:author="Damian Struk" w:date="2024-11-09T13:09:00Z" w16du:dateUtc="2024-11-09T12:09:00Z">
+            <w:tcPrChange w:id="35" w:author="stella" w:date="2024-11-09T13:09:00Z" w16du:dateUtc="2024-11-09T12:09:00Z">
               <w:tcPr>
                 <w:tcW w:w="2226" w:type="dxa"/>
               </w:tcPr>
@@ -6058,7 +6058,7 @@
                 <w:lang w:eastAsia="ja-JP"/>
               </w:rPr>
             </w:pPr>
-            <w:ins w:id="36" w:author="Damian Struk" w:date="2024-11-09T13:09:00Z" w16du:dateUtc="2024-11-09T12:09:00Z">
+            <w:ins w:id="36" w:author="stella" w:date="2024-11-09T13:09:00Z" w16du:dateUtc="2024-11-09T12:09:00Z">
               <w:r>
                 <w:rPr>
                   <w:rFonts w:ascii="Corbel" w:hAnsi="Corbel"/>
@@ -6078,7 +6078,7 @@
                 <w:t>2</w:t>
               </w:r>
             </w:ins>
-            <w:del w:id="37" w:author="Damian Struk" w:date="2024-11-09T13:09:00Z" w16du:dateUtc="2024-11-09T12:09:00Z">
+            <w:del w:id="37" w:author="stella" w:date="2024-11-09T13:09:00Z" w16du:dateUtc="2024-11-09T12:09:00Z">
               <w:r>
                 <w:rPr>
                   <w:rFonts w:ascii="Corbel" w:hAnsi="Corbel"/>
@@ -6103,7 +6103,7 @@
         <w:tc>
           <w:tcPr>
             <w:tcW w:w="6563" w:type="dxa"/>
-            <w:tcPrChange w:id="38" w:author="Damian Struk" w:date="2024-11-09T13:09:00Z" w16du:dateUtc="2024-11-09T12:09:00Z">
+            <w:tcPrChange w:id="38" w:author="stella" w:date="2024-11-09T13:09:00Z" w16du:dateUtc="2024-11-09T12:09:00Z">
               <w:tcPr>
                 <w:tcW w:w="6563" w:type="dxa"/>
               </w:tcPr>
@@ -6122,7 +6122,7 @@
                 <w:lang w:eastAsia="ja-JP"/>
               </w:rPr>
             </w:pPr>
-            <w:ins w:id="39" w:author="Damian Struk" w:date="2024-11-09T13:09:00Z" w16du:dateUtc="2024-11-09T12:09:00Z">
+            <w:ins w:id="39" w:author="stella" w:date="2024-11-09T13:09:00Z" w16du:dateUtc="2024-11-09T12:09:00Z">
               <w:r>
                 <w:rPr>
                   <w:rFonts w:ascii="Corbel" w:hAnsi="Corbel"/>
@@ -6196,7 +6196,7 @@
                 <w:t>.</w:t>
               </w:r>
             </w:ins>
-            <w:del w:id="40" w:author="Damian Struk" w:date="2024-11-09T13:09:00Z" w16du:dateUtc="2024-11-09T12:09:00Z">
+            <w:del w:id="40" w:author="stella" w:date="2024-11-09T13:09:00Z" w16du:dateUtc="2024-11-09T12:09:00Z">
               <w:r>
                 <w:rPr>
                   <w:rFonts w:ascii="Corbel" w:hAnsi="Corbel"/>
@@ -6294,7 +6294,7 @@
           <w:tblW w:w="9498" w:type="dxa"/>
           <w:tblInd w:w="567" w:type="dxa"/>
           <w:tblLayout w:type="fixed"/>
-          <w:tblPrExChange w:id="41" w:author="Damian Struk" w:date="2024-11-09T13:09:00Z" w16du:dateUtc="2024-11-09T12:09:00Z">
+          <w:tblPrExChange w:id="41" w:author="stella" w:date="2024-11-09T13:09:00Z" w16du:dateUtc="2024-11-09T12:09:00Z">
             <w:tblPrEx>
               <w:tblW w:w="9498" w:type="dxa"/>
               <w:tblInd w:w="567" w:type="dxa"/>
@@ -6304,7 +6304,7 @@
         </w:tblPrEx>
         <w:trPr>
           <w:trHeight w:val="265"/>
-          <w:trPrChange w:id="42" w:author="Damian Struk" w:date="2024-11-09T13:09:00Z" w16du:dateUtc="2024-11-09T12:09:00Z">
+          <w:trPrChange w:id="42" w:author="stella" w:date="2024-11-09T13:09:00Z" w16du:dateUtc="2024-11-09T12:09:00Z">
             <w:trPr>
               <w:trHeight w:val="265"/>
             </w:trPr>
@@ -6313,7 +6313,7 @@
         <w:tc>
           <w:tcPr>
             <w:tcW w:w="709" w:type="dxa"/>
-            <w:tcPrChange w:id="43" w:author="Damian Struk" w:date="2024-11-09T13:09:00Z" w16du:dateUtc="2024-11-09T12:09:00Z">
+            <w:tcPrChange w:id="43" w:author="stella" w:date="2024-11-09T13:09:00Z" w16du:dateUtc="2024-11-09T12:09:00Z">
               <w:tcPr>
                 <w:tcW w:w="709" w:type="dxa"/>
               </w:tcPr>
@@ -6341,7 +6341,7 @@
         <w:tc>
           <w:tcPr>
             <w:tcW w:w="2226" w:type="dxa"/>
-            <w:tcPrChange w:id="44" w:author="Damian Struk" w:date="2024-11-09T13:09:00Z" w16du:dateUtc="2024-11-09T12:09:00Z">
+            <w:tcPrChange w:id="44" w:author="stella" w:date="2024-11-09T13:09:00Z" w16du:dateUtc="2024-11-09T12:09:00Z">
               <w:tcPr>
                 <w:tcW w:w="2226" w:type="dxa"/>
               </w:tcPr>
@@ -6361,7 +6361,7 @@
                 <w:lang w:eastAsia="ja-JP"/>
               </w:rPr>
             </w:pPr>
-            <w:ins w:id="45" w:author="Damian Struk" w:date="2024-11-09T13:09:00Z" w16du:dateUtc="2024-11-09T12:09:00Z">
+            <w:ins w:id="45" w:author="stella" w:date="2024-11-09T13:09:00Z" w16du:dateUtc="2024-11-09T12:09:00Z">
               <w:r>
                 <w:rPr>
                   <w:rFonts w:ascii="Corbel" w:hAnsi="Corbel"/>
@@ -6381,7 +6381,7 @@
                 <w:t>3</w:t>
               </w:r>
             </w:ins>
-            <w:del w:id="46" w:author="Damian Struk" w:date="2024-11-09T13:09:00Z" w16du:dateUtc="2024-11-09T12:09:00Z">
+            <w:del w:id="46" w:author="stella" w:date="2024-11-09T13:09:00Z" w16du:dateUtc="2024-11-09T12:09:00Z">
               <w:r>
                 <w:rPr>
                   <w:rFonts w:ascii="Corbel" w:hAnsi="Corbel"/>
@@ -6406,7 +6406,7 @@
         <w:tc>
           <w:tcPr>
             <w:tcW w:w="6563" w:type="dxa"/>
-            <w:tcPrChange w:id="47" w:author="Damian Struk" w:date="2024-11-09T13:09:00Z" w16du:dateUtc="2024-11-09T12:09:00Z">
+            <w:tcPrChange w:id="47" w:author="stella" w:date="2024-11-09T13:09:00Z" w16du:dateUtc="2024-11-09T12:09:00Z">
               <w:tcPr>
                 <w:tcW w:w="6563" w:type="dxa"/>
               </w:tcPr>
@@ -6425,7 +6425,7 @@
                 <w:lang w:eastAsia="ja-JP"/>
               </w:rPr>
             </w:pPr>
-            <w:ins w:id="48" w:author="Damian Struk" w:date="2024-11-09T13:09:00Z" w16du:dateUtc="2024-11-09T12:09:00Z">
+            <w:ins w:id="48" w:author="stella" w:date="2024-11-09T13:09:00Z" w16du:dateUtc="2024-11-09T12:09:00Z">
               <w:r>
                 <w:rPr>
                   <w:rFonts w:ascii="Corbel" w:hAnsi="Corbel"/>
@@ -6499,7 +6499,7 @@
                 <w:t>.</w:t>
               </w:r>
             </w:ins>
-            <w:del w:id="49" w:author="Damian Struk" w:date="2024-11-09T13:09:00Z" w16du:dateUtc="2024-11-09T12:09:00Z">
+            <w:del w:id="49" w:author="stella" w:date="2024-11-09T13:09:00Z" w16du:dateUtc="2024-11-09T12:09:00Z">
               <w:r>
                 <w:rPr>
                   <w:rFonts w:ascii="Corbel" w:hAnsi="Corbel"/>
@@ -6581,7 +6581,7 @@
           <w:tblW w:w="9498" w:type="dxa"/>
           <w:tblInd w:w="567" w:type="dxa"/>
           <w:tblLayout w:type="fixed"/>
-          <w:tblPrExChange w:id="50" w:author="Damian Struk" w:date="2024-11-09T13:09:00Z" w16du:dateUtc="2024-11-09T12:09:00Z">
+          <w:tblPrExChange w:id="50" w:author="stella" w:date="2024-11-09T13:09:00Z" w16du:dateUtc="2024-11-09T12:09:00Z">
             <w:tblPrEx>
               <w:tblW w:w="9498" w:type="dxa"/>
               <w:tblInd w:w="567" w:type="dxa"/>
@@ -6591,7 +6591,7 @@
         </w:tblPrEx>
         <w:trPr>
           <w:trHeight w:val="265"/>
-          <w:trPrChange w:id="51" w:author="Damian Struk" w:date="2024-11-09T13:09:00Z" w16du:dateUtc="2024-11-09T12:09:00Z">
+          <w:trPrChange w:id="51" w:author="stella" w:date="2024-11-09T13:09:00Z" w16du:dateUtc="2024-11-09T12:09:00Z">
             <w:trPr>
               <w:trHeight w:val="265"/>
             </w:trPr>
@@ -6600,7 +6600,7 @@
         <w:tc>
           <w:tcPr>
             <w:tcW w:w="709" w:type="dxa"/>
-            <w:tcPrChange w:id="52" w:author="Damian Struk" w:date="2024-11-09T13:09:00Z" w16du:dateUtc="2024-11-09T12:09:00Z">
+            <w:tcPrChange w:id="52" w:author="stella" w:date="2024-11-09T13:09:00Z" w16du:dateUtc="2024-11-09T12:09:00Z">
               <w:tcPr>
                 <w:tcW w:w="709" w:type="dxa"/>
               </w:tcPr>
@@ -6628,7 +6628,7 @@
         <w:tc>
           <w:tcPr>
             <w:tcW w:w="2226" w:type="dxa"/>
-            <w:tcPrChange w:id="53" w:author="Damian Struk" w:date="2024-11-09T13:09:00Z" w16du:dateUtc="2024-11-09T12:09:00Z">
+            <w:tcPrChange w:id="53" w:author="stella" w:date="2024-11-09T13:09:00Z" w16du:dateUtc="2024-11-09T12:09:00Z">
               <w:tcPr>
                 <w:tcW w:w="2226" w:type="dxa"/>
               </w:tcPr>
@@ -6648,7 +6648,7 @@
                 <w:lang w:eastAsia="ja-JP"/>
               </w:rPr>
             </w:pPr>
-            <w:ins w:id="54" w:author="Damian Struk" w:date="2024-11-09T13:09:00Z" w16du:dateUtc="2024-11-09T12:09:00Z">
+            <w:ins w:id="54" w:author="stella" w:date="2024-11-09T13:09:00Z" w16du:dateUtc="2024-11-09T12:09:00Z">
               <w:r>
                 <w:rPr>
                   <w:rFonts w:ascii="Corbel" w:hAnsi="Corbel"/>
@@ -6668,7 +6668,7 @@
                 <w:t>4</w:t>
               </w:r>
             </w:ins>
-            <w:del w:id="55" w:author="Damian Struk" w:date="2024-11-09T13:09:00Z" w16du:dateUtc="2024-11-09T12:09:00Z">
+            <w:del w:id="55" w:author="stella" w:date="2024-11-09T13:09:00Z" w16du:dateUtc="2024-11-09T12:09:00Z">
               <w:r>
                 <w:rPr>
                   <w:rFonts w:ascii="Corbel" w:hAnsi="Corbel"/>
@@ -6693,7 +6693,7 @@
         <w:tc>
           <w:tcPr>
             <w:tcW w:w="6563" w:type="dxa"/>
-            <w:tcPrChange w:id="56" w:author="Damian Struk" w:date="2024-11-09T13:09:00Z" w16du:dateUtc="2024-11-09T12:09:00Z">
+            <w:tcPrChange w:id="56" w:author="stella" w:date="2024-11-09T13:09:00Z" w16du:dateUtc="2024-11-09T12:09:00Z">
               <w:tcPr>
                 <w:tcW w:w="6563" w:type="dxa"/>
               </w:tcPr>
@@ -6712,7 +6712,7 @@
                 <w:lang w:eastAsia="ja-JP"/>
               </w:rPr>
             </w:pPr>
-            <w:ins w:id="57" w:author="Damian Struk" w:date="2024-11-09T13:09:00Z" w16du:dateUtc="2024-11-09T12:09:00Z">
+            <w:ins w:id="57" w:author="stella" w:date="2024-11-09T13:09:00Z" w16du:dateUtc="2024-11-09T12:09:00Z">
               <w:r>
                 <w:rPr>
                   <w:rFonts w:ascii="Corbel" w:hAnsi="Corbel"/>
@@ -6786,7 +6786,7 @@
                 <w:t>.</w:t>
               </w:r>
             </w:ins>
-            <w:del w:id="58" w:author="Damian Struk" w:date="2024-11-09T13:09:00Z" w16du:dateUtc="2024-11-09T12:09:00Z">
+            <w:del w:id="58" w:author="stella" w:date="2024-11-09T13:09:00Z" w16du:dateUtc="2024-11-09T12:09:00Z">
               <w:r>
                 <w:rPr>
                   <w:rFonts w:ascii="Corbel" w:hAnsi="Corbel"/>
@@ -6868,7 +6868,7 @@
           <w:tblW w:w="9498" w:type="dxa"/>
           <w:tblInd w:w="567" w:type="dxa"/>
           <w:tblLayout w:type="fixed"/>
-          <w:tblPrExChange w:id="59" w:author="Damian Struk" w:date="2024-11-09T13:09:00Z" w16du:dateUtc="2024-11-09T12:09:00Z">
+          <w:tblPrExChange w:id="59" w:author="stella" w:date="2024-11-09T13:09:00Z" w16du:dateUtc="2024-11-09T12:09:00Z">
             <w:tblPrEx>
               <w:tblW w:w="9498" w:type="dxa"/>
               <w:tblInd w:w="567" w:type="dxa"/>
@@ -6878,7 +6878,7 @@
         </w:tblPrEx>
         <w:trPr>
           <w:trHeight w:val="265"/>
-          <w:trPrChange w:id="60" w:author="Damian Struk" w:date="2024-11-09T13:09:00Z" w16du:dateUtc="2024-11-09T12:09:00Z">
+          <w:trPrChange w:id="60" w:author="stella" w:date="2024-11-09T13:09:00Z" w16du:dateUtc="2024-11-09T12:09:00Z">
             <w:trPr>
               <w:trHeight w:val="265"/>
             </w:trPr>
@@ -6887,7 +6887,7 @@
         <w:tc>
           <w:tcPr>
             <w:tcW w:w="709" w:type="dxa"/>
-            <w:tcPrChange w:id="61" w:author="Damian Struk" w:date="2024-11-09T13:09:00Z" w16du:dateUtc="2024-11-09T12:09:00Z">
+            <w:tcPrChange w:id="61" w:author="stella" w:date="2024-11-09T13:09:00Z" w16du:dateUtc="2024-11-09T12:09:00Z">
               <w:tcPr>
                 <w:tcW w:w="709" w:type="dxa"/>
               </w:tcPr>
@@ -6915,7 +6915,7 @@
         <w:tc>
           <w:tcPr>
             <w:tcW w:w="2226" w:type="dxa"/>
-            <w:tcPrChange w:id="62" w:author="Damian Struk" w:date="2024-11-09T13:09:00Z" w16du:dateUtc="2024-11-09T12:09:00Z">
+            <w:tcPrChange w:id="62" w:author="stella" w:date="2024-11-09T13:09:00Z" w16du:dateUtc="2024-11-09T12:09:00Z">
               <w:tcPr>
                 <w:tcW w:w="2226" w:type="dxa"/>
               </w:tcPr>
@@ -6935,7 +6935,7 @@
                 <w:lang w:eastAsia="ja-JP"/>
               </w:rPr>
             </w:pPr>
-            <w:ins w:id="63" w:author="Damian Struk" w:date="2024-11-09T13:09:00Z" w16du:dateUtc="2024-11-09T12:09:00Z">
+            <w:ins w:id="63" w:author="stella" w:date="2024-11-09T13:09:00Z" w16du:dateUtc="2024-11-09T12:09:00Z">
               <w:r>
                 <w:rPr>
                   <w:rFonts w:ascii="Corbel" w:hAnsi="Corbel"/>
@@ -6955,7 +6955,7 @@
                 <w:t>5</w:t>
               </w:r>
             </w:ins>
-            <w:del w:id="64" w:author="Damian Struk" w:date="2024-11-09T13:09:00Z" w16du:dateUtc="2024-11-09T12:09:00Z">
+            <w:del w:id="64" w:author="stella" w:date="2024-11-09T13:09:00Z" w16du:dateUtc="2024-11-09T12:09:00Z">
               <w:r>
                 <w:rPr>
                   <w:rFonts w:ascii="Corbel" w:hAnsi="Corbel"/>
@@ -6980,7 +6980,7 @@
         <w:tc>
           <w:tcPr>
             <w:tcW w:w="6563" w:type="dxa"/>
-            <w:tcPrChange w:id="65" w:author="Damian Struk" w:date="2024-11-09T13:09:00Z" w16du:dateUtc="2024-11-09T12:09:00Z">
+            <w:tcPrChange w:id="65" w:author="stella" w:date="2024-11-09T13:09:00Z" w16du:dateUtc="2024-11-09T12:09:00Z">
               <w:tcPr>
                 <w:tcW w:w="6563" w:type="dxa"/>
               </w:tcPr>
@@ -6999,7 +6999,7 @@
                 <w:lang w:eastAsia="ja-JP"/>
               </w:rPr>
             </w:pPr>
-            <w:ins w:id="66" w:author="Damian Struk" w:date="2024-11-09T13:09:00Z" w16du:dateUtc="2024-11-09T12:09:00Z">
+            <w:ins w:id="66" w:author="stella" w:date="2024-11-09T13:09:00Z" w16du:dateUtc="2024-11-09T12:09:00Z">
               <w:r>
                 <w:rPr>
                   <w:rFonts w:ascii="Corbel" w:hAnsi="Corbel"/>
@@ -7073,7 +7073,7 @@
                 <w:t>.</w:t>
               </w:r>
             </w:ins>
-            <w:del w:id="67" w:author="Damian Struk" w:date="2024-11-09T13:09:00Z" w16du:dateUtc="2024-11-09T12:09:00Z">
+            <w:del w:id="67" w:author="stella" w:date="2024-11-09T13:09:00Z" w16du:dateUtc="2024-11-09T12:09:00Z">
               <w:r>
                 <w:rPr>
                   <w:rFonts w:ascii="Corbel" w:hAnsi="Corbel"/>
@@ -7155,7 +7155,7 @@
           <w:tblW w:w="9498" w:type="dxa"/>
           <w:tblInd w:w="567" w:type="dxa"/>
           <w:tblLayout w:type="fixed"/>
-          <w:tblPrExChange w:id="68" w:author="Damian Struk" w:date="2024-11-09T13:09:00Z" w16du:dateUtc="2024-11-09T12:09:00Z">
+          <w:tblPrExChange w:id="68" w:author="stella" w:date="2024-11-09T13:09:00Z" w16du:dateUtc="2024-11-09T12:09:00Z">
             <w:tblPrEx>
               <w:tblW w:w="9498" w:type="dxa"/>
               <w:tblInd w:w="567" w:type="dxa"/>
@@ -7165,7 +7165,7 @@
         </w:tblPrEx>
         <w:trPr>
           <w:trHeight w:val="265"/>
-          <w:trPrChange w:id="69" w:author="Damian Struk" w:date="2024-11-09T13:09:00Z" w16du:dateUtc="2024-11-09T12:09:00Z">
+          <w:trPrChange w:id="69" w:author="stella" w:date="2024-11-09T13:09:00Z" w16du:dateUtc="2024-11-09T12:09:00Z">
             <w:trPr>
               <w:trHeight w:val="265"/>
             </w:trPr>
@@ -7174,7 +7174,7 @@
         <w:tc>
           <w:tcPr>
             <w:tcW w:w="709" w:type="dxa"/>
-            <w:tcPrChange w:id="70" w:author="Damian Struk" w:date="2024-11-09T13:09:00Z" w16du:dateUtc="2024-11-09T12:09:00Z">
+            <w:tcPrChange w:id="70" w:author="stella" w:date="2024-11-09T13:09:00Z" w16du:dateUtc="2024-11-09T12:09:00Z">
               <w:tcPr>
                 <w:tcW w:w="709" w:type="dxa"/>
               </w:tcPr>
@@ -7202,7 +7202,7 @@
         <w:tc>
           <w:tcPr>
             <w:tcW w:w="2226" w:type="dxa"/>
-            <w:tcPrChange w:id="71" w:author="Damian Struk" w:date="2024-11-09T13:09:00Z" w16du:dateUtc="2024-11-09T12:09:00Z">
+            <w:tcPrChange w:id="71" w:author="stella" w:date="2024-11-09T13:09:00Z" w16du:dateUtc="2024-11-09T12:09:00Z">
               <w:tcPr>
                 <w:tcW w:w="2226" w:type="dxa"/>
               </w:tcPr>
@@ -7222,7 +7222,7 @@
                 <w:lang w:eastAsia="ja-JP"/>
               </w:rPr>
             </w:pPr>
-            <w:ins w:id="72" w:author="Damian Struk" w:date="2024-11-09T13:09:00Z" w16du:dateUtc="2024-11-09T12:09:00Z">
+            <w:ins w:id="72" w:author="stella" w:date="2024-11-09T13:09:00Z" w16du:dateUtc="2024-11-09T12:09:00Z">
               <w:r>
                 <w:rPr>
                   <w:rFonts w:ascii="Corbel" w:hAnsi="Corbel"/>
@@ -7233,7 +7233,7 @@
                 <w:t>Podíly</w:t>
               </w:r>
             </w:ins>
-            <w:del w:id="73" w:author="Damian Struk" w:date="2024-11-09T13:09:00Z" w16du:dateUtc="2024-11-09T12:09:00Z">
+            <w:del w:id="73" w:author="stella" w:date="2024-11-09T13:09:00Z" w16du:dateUtc="2024-11-09T12:09:00Z">
               <w:r>
                 <w:rPr>
                   <w:rFonts w:ascii="Corbel" w:hAnsi="Corbel"/>
@@ -7258,7 +7258,7 @@
         <w:tc>
           <w:tcPr>
             <w:tcW w:w="6563" w:type="dxa"/>
-            <w:tcPrChange w:id="74" w:author="Damian Struk" w:date="2024-11-09T13:09:00Z" w16du:dateUtc="2024-11-09T12:09:00Z">
+            <w:tcPrChange w:id="74" w:author="stella" w:date="2024-11-09T13:09:00Z" w16du:dateUtc="2024-11-09T12:09:00Z">
               <w:tcPr>
                 <w:tcW w:w="6563" w:type="dxa"/>
               </w:tcPr>
@@ -7277,7 +7277,7 @@
                 <w:lang w:eastAsia="ja-JP"/>
               </w:rPr>
             </w:pPr>
-            <w:ins w:id="75" w:author="Damian Struk" w:date="2024-11-09T13:09:00Z" w16du:dateUtc="2024-11-09T12:09:00Z">
+            <w:ins w:id="75" w:author="stella" w:date="2024-11-09T13:09:00Z" w16du:dateUtc="2024-11-09T12:09:00Z">
               <w:r>
                 <w:rPr>
                   <w:rFonts w:ascii="Corbel" w:hAnsi="Corbel"/>
@@ -7287,7 +7287,7 @@
                 <w:t>znamená společně Podíl 1, Podíl 2, Podíl 3, Podíl 4 a Podíl 5.</w:t>
               </w:r>
             </w:ins>
-            <w:del w:id="76" w:author="Damian Struk" w:date="2024-11-09T13:09:00Z" w16du:dateUtc="2024-11-09T12:09:00Z">
+            <w:del w:id="76" w:author="stella" w:date="2024-11-09T13:09:00Z" w16du:dateUtc="2024-11-09T12:09:00Z">
               <w:r>
                 <w:rPr>
                   <w:rFonts w:ascii="Corbel" w:hAnsi="Corbel"/>
@@ -7369,7 +7369,7 @@
           <w:tblW w:w="9498" w:type="dxa"/>
           <w:tblInd w:w="567" w:type="dxa"/>
           <w:tblLayout w:type="fixed"/>
-          <w:tblPrExChange w:id="77" w:author="Damian Struk" w:date="2024-11-09T13:09:00Z" w16du:dateUtc="2024-11-09T12:09:00Z">
+          <w:tblPrExChange w:id="77" w:author="stella" w:date="2024-11-09T13:09:00Z" w16du:dateUtc="2024-11-09T12:09:00Z">
             <w:tblPrEx>
               <w:tblW w:w="9498" w:type="dxa"/>
               <w:tblInd w:w="567" w:type="dxa"/>
@@ -7379,7 +7379,7 @@
         </w:tblPrEx>
         <w:trPr>
           <w:trHeight w:val="265"/>
-          <w:trPrChange w:id="78" w:author="Damian Struk" w:date="2024-11-09T13:09:00Z" w16du:dateUtc="2024-11-09T12:09:00Z">
+          <w:trPrChange w:id="78" w:author="stella" w:date="2024-11-09T13:09:00Z" w16du:dateUtc="2024-11-09T12:09:00Z">
             <w:trPr>
               <w:trHeight w:val="265"/>
             </w:trPr>
@@ -7388,7 +7388,7 @@
         <w:tc>
           <w:tcPr>
             <w:tcW w:w="709" w:type="dxa"/>
-            <w:tcPrChange w:id="79" w:author="Damian Struk" w:date="2024-11-09T13:09:00Z" w16du:dateUtc="2024-11-09T12:09:00Z">
+            <w:tcPrChange w:id="79" w:author="stella" w:date="2024-11-09T13:09:00Z" w16du:dateUtc="2024-11-09T12:09:00Z">
               <w:tcPr>
                 <w:tcW w:w="709" w:type="dxa"/>
               </w:tcPr>
@@ -7416,7 +7416,7 @@
         <w:tc>
           <w:tcPr>
             <w:tcW w:w="2226" w:type="dxa"/>
-            <w:tcPrChange w:id="80" w:author="Damian Struk" w:date="2024-11-09T13:09:00Z" w16du:dateUtc="2024-11-09T12:09:00Z">
+            <w:tcPrChange w:id="80" w:author="stella" w:date="2024-11-09T13:09:00Z" w16du:dateUtc="2024-11-09T12:09:00Z">
               <w:tcPr>
                 <w:tcW w:w="2226" w:type="dxa"/>
               </w:tcPr>
@@ -7430,14 +7430,14 @@
               <w:ind w:left="-108"/>
               <w:contextualSpacing w:val="0"/>
               <w:rPr>
-                <w:ins w:id="81" w:author="Damian Struk" w:date="2024-11-09T13:09:00Z" w16du:dateUtc="2024-11-09T12:09:00Z"/>
+                <w:ins w:id="81" w:author="stella" w:date="2024-11-09T13:09:00Z" w16du:dateUtc="2024-11-09T12:09:00Z"/>
                 <w:rFonts w:ascii="Corbel" w:hAnsi="Corbel"/>
                 <w:b/>
                 <w:color w:val="575757"/>
                 <w:lang w:eastAsia="ja-JP"/>
               </w:rPr>
             </w:pPr>
-            <w:ins w:id="82" w:author="Damian Struk" w:date="2024-11-09T13:09:00Z" w16du:dateUtc="2024-11-09T12:09:00Z">
+            <w:ins w:id="82" w:author="stella" w:date="2024-11-09T13:09:00Z" w16du:dateUtc="2024-11-09T12:09:00Z">
               <w:r>
                 <w:rPr>
                   <w:rFonts w:ascii="Corbel" w:hAnsi="Corbel"/>
@@ -7472,7 +7472,7 @@
                 <w:lang w:eastAsia="ja-JP"/>
               </w:rPr>
             </w:pPr>
-            <w:del w:id="83" w:author="Damian Struk" w:date="2024-11-09T13:09:00Z" w16du:dateUtc="2024-11-09T12:09:00Z">
+            <w:del w:id="83" w:author="stella" w:date="2024-11-09T13:09:00Z" w16du:dateUtc="2024-11-09T12:09:00Z">
               <w:r>
                 <w:rPr>
                   <w:rFonts w:ascii="Corbel" w:hAnsi="Corbel"/>
@@ -7488,7 +7488,7 @@
         <w:tc>
           <w:tcPr>
             <w:tcW w:w="6563" w:type="dxa"/>
-            <w:tcPrChange w:id="84" w:author="Damian Struk" w:date="2024-11-09T13:09:00Z" w16du:dateUtc="2024-11-09T12:09:00Z">
+            <w:tcPrChange w:id="84" w:author="stella" w:date="2024-11-09T13:09:00Z" w16du:dateUtc="2024-11-09T12:09:00Z">
               <w:tcPr>
                 <w:tcW w:w="6563" w:type="dxa"/>
               </w:tcPr>
@@ -7502,13 +7502,13 @@
               <w:ind w:left="0"/>
               <w:contextualSpacing w:val="0"/>
               <w:rPr>
-                <w:ins w:id="85" w:author="Damian Struk" w:date="2024-11-09T13:09:00Z" w16du:dateUtc="2024-11-09T12:09:00Z"/>
+                <w:ins w:id="85" w:author="stella" w:date="2024-11-09T13:09:00Z" w16du:dateUtc="2024-11-09T12:09:00Z"/>
                 <w:rFonts w:ascii="Corbel" w:hAnsi="Corbel"/>
                 <w:color w:val="575757"/>
                 <w:lang w:eastAsia="ja-JP"/>
               </w:rPr>
             </w:pPr>
-            <w:ins w:id="86" w:author="Damian Struk" w:date="2024-11-09T13:09:00Z" w16du:dateUtc="2024-11-09T12:09:00Z">
+            <w:ins w:id="86" w:author="stella" w:date="2024-11-09T13:09:00Z" w16du:dateUtc="2024-11-09T12:09:00Z">
               <w:r>
                 <w:rPr>
                   <w:rFonts w:ascii="Corbel" w:hAnsi="Corbel"/>
@@ -7642,13 +7642,13 @@
               <w:spacing w:before="120" w:after="120" w:line="300" w:lineRule="exact"/>
               <w:contextualSpacing w:val="0"/>
               <w:rPr>
-                <w:ins w:id="87" w:author="Damian Struk" w:date="2024-11-09T13:09:00Z" w16du:dateUtc="2024-11-09T12:09:00Z"/>
+                <w:ins w:id="87" w:author="stella" w:date="2024-11-09T13:09:00Z" w16du:dateUtc="2024-11-09T12:09:00Z"/>
                 <w:rFonts w:ascii="Corbel" w:hAnsi="Corbel"/>
                 <w:color w:val="575757"/>
                 <w:lang w:eastAsia="ja-JP"/>
               </w:rPr>
             </w:pPr>
-            <w:ins w:id="88" w:author="Damian Struk" w:date="2024-11-09T13:09:00Z" w16du:dateUtc="2024-11-09T12:09:00Z">
+            <w:ins w:id="88" w:author="stella" w:date="2024-11-09T13:09:00Z" w16du:dateUtc="2024-11-09T12:09:00Z">
               <w:r>
                 <w:rPr>
                   <w:rFonts w:ascii="Corbel" w:hAnsi="Corbel"/>
@@ -7686,13 +7686,13 @@
               <w:spacing w:before="120" w:after="120" w:line="300" w:lineRule="exact"/>
               <w:contextualSpacing w:val="0"/>
               <w:rPr>
-                <w:ins w:id="89" w:author="Damian Struk" w:date="2024-11-09T13:09:00Z" w16du:dateUtc="2024-11-09T12:09:00Z"/>
+                <w:ins w:id="89" w:author="stella" w:date="2024-11-09T13:09:00Z" w16du:dateUtc="2024-11-09T12:09:00Z"/>
                 <w:rFonts w:ascii="Corbel" w:hAnsi="Corbel"/>
                 <w:color w:val="575757"/>
                 <w:lang w:eastAsia="ja-JP"/>
               </w:rPr>
             </w:pPr>
-            <w:ins w:id="90" w:author="Damian Struk" w:date="2024-11-09T13:09:00Z" w16du:dateUtc="2024-11-09T12:09:00Z">
+            <w:ins w:id="90" w:author="stella" w:date="2024-11-09T13:09:00Z" w16du:dateUtc="2024-11-09T12:09:00Z">
               <w:r>
                 <w:rPr>
                   <w:rFonts w:ascii="Corbel" w:hAnsi="Corbel"/>
@@ -7772,7 +7772,7 @@
                 <w:lang w:eastAsia="ja-JP"/>
               </w:rPr>
             </w:pPr>
-            <w:ins w:id="91" w:author="Damian Struk" w:date="2024-11-09T13:09:00Z" w16du:dateUtc="2024-11-09T12:09:00Z">
+            <w:ins w:id="91" w:author="stella" w:date="2024-11-09T13:09:00Z" w16du:dateUtc="2024-11-09T12:09:00Z">
               <w:r>
                 <w:rPr>
                   <w:rFonts w:ascii="Corbel" w:hAnsi="Corbel"/>
@@ -7815,7 +7815,7 @@
                 <w:t>upujícího.</w:t>
               </w:r>
             </w:ins>
-            <w:del w:id="92" w:author="Damian Struk" w:date="2024-11-09T13:09:00Z" w16du:dateUtc="2024-11-09T12:09:00Z">
+            <w:del w:id="92" w:author="stella" w:date="2024-11-09T13:09:00Z" w16du:dateUtc="2024-11-09T12:09:00Z">
               <w:r>
                 <w:rPr>
                   <w:rFonts w:ascii="Corbel" w:hAnsi="Corbel"/>
@@ -7833,7 +7833,7 @@
           <w:tblW w:w="9498" w:type="dxa"/>
           <w:tblInd w:w="567" w:type="dxa"/>
           <w:tblLayout w:type="fixed"/>
-          <w:tblPrExChange w:id="93" w:author="Damian Struk" w:date="2024-11-09T13:09:00Z" w16du:dateUtc="2024-11-09T12:09:00Z">
+          <w:tblPrExChange w:id="93" w:author="stella" w:date="2024-11-09T13:09:00Z" w16du:dateUtc="2024-11-09T12:09:00Z">
             <w:tblPrEx>
               <w:tblW w:w="9498" w:type="dxa"/>
               <w:tblInd w:w="567" w:type="dxa"/>
@@ -7843,7 +7843,7 @@
         </w:tblPrEx>
         <w:trPr>
           <w:trHeight w:val="265"/>
-          <w:trPrChange w:id="94" w:author="Damian Struk" w:date="2024-11-09T13:09:00Z" w16du:dateUtc="2024-11-09T12:09:00Z">
+          <w:trPrChange w:id="94" w:author="stella" w:date="2024-11-09T13:09:00Z" w16du:dateUtc="2024-11-09T12:09:00Z">
             <w:trPr>
               <w:trHeight w:val="265"/>
             </w:trPr>
@@ -7852,7 +7852,7 @@
         <w:tc>
           <w:tcPr>
             <w:tcW w:w="709" w:type="dxa"/>
-            <w:tcPrChange w:id="95" w:author="Damian Struk" w:date="2024-11-09T13:09:00Z" w16du:dateUtc="2024-11-09T12:09:00Z">
+            <w:tcPrChange w:id="95" w:author="stella" w:date="2024-11-09T13:09:00Z" w16du:dateUtc="2024-11-09T12:09:00Z">
               <w:tcPr>
                 <w:tcW w:w="709" w:type="dxa"/>
               </w:tcPr>
@@ -7880,7 +7880,7 @@
         <w:tc>
           <w:tcPr>
             <w:tcW w:w="2226" w:type="dxa"/>
-            <w:tcPrChange w:id="96" w:author="Damian Struk" w:date="2024-11-09T13:09:00Z" w16du:dateUtc="2024-11-09T12:09:00Z">
+            <w:tcPrChange w:id="96" w:author="stella" w:date="2024-11-09T13:09:00Z" w16du:dateUtc="2024-11-09T12:09:00Z">
               <w:tcPr>
                 <w:tcW w:w="2226" w:type="dxa"/>
               </w:tcPr>
@@ -7894,14 +7894,14 @@
               <w:ind w:left="-108"/>
               <w:contextualSpacing w:val="0"/>
               <w:rPr>
-                <w:del w:id="97" w:author="Damian Struk" w:date="2024-11-09T13:09:00Z" w16du:dateUtc="2024-11-09T12:09:00Z"/>
+                <w:del w:id="97" w:author="stella" w:date="2024-11-09T13:09:00Z" w16du:dateUtc="2024-11-09T12:09:00Z"/>
                 <w:rFonts w:ascii="Corbel" w:hAnsi="Corbel"/>
                 <w:b/>
                 <w:color w:val="575757"/>
                 <w:lang w:eastAsia="ja-JP"/>
               </w:rPr>
             </w:pPr>
-            <w:ins w:id="98" w:author="Damian Struk" w:date="2024-11-09T13:09:00Z" w16du:dateUtc="2024-11-09T12:09:00Z">
+            <w:ins w:id="98" w:author="stella" w:date="2024-11-09T13:09:00Z" w16du:dateUtc="2024-11-09T12:09:00Z">
               <w:r>
                 <w:rPr>
                   <w:rFonts w:ascii="Corbel" w:hAnsi="Corbel"/>
@@ -7912,7 +7912,7 @@
                 <w:t>Podstatné snížení hodnoty</w:t>
               </w:r>
             </w:ins>
-            <w:del w:id="99" w:author="Damian Struk" w:date="2024-11-09T13:09:00Z" w16du:dateUtc="2024-11-09T12:09:00Z">
+            <w:del w:id="99" w:author="stella" w:date="2024-11-09T13:09:00Z" w16du:dateUtc="2024-11-09T12:09:00Z">
               <w:r>
                 <w:rPr>
                   <w:rFonts w:ascii="Corbel" w:hAnsi="Corbel"/>
@@ -7953,7 +7953,7 @@
         <w:tc>
           <w:tcPr>
             <w:tcW w:w="6563" w:type="dxa"/>
-            <w:tcPrChange w:id="100" w:author="Damian Struk" w:date="2024-11-09T13:09:00Z" w16du:dateUtc="2024-11-09T12:09:00Z">
+            <w:tcPrChange w:id="100" w:author="stella" w:date="2024-11-09T13:09:00Z" w16du:dateUtc="2024-11-09T12:09:00Z">
               <w:tcPr>
                 <w:tcW w:w="6563" w:type="dxa"/>
               </w:tcPr>
@@ -7967,13 +7967,13 @@
               <w:ind w:left="0"/>
               <w:contextualSpacing w:val="0"/>
               <w:rPr>
-                <w:del w:id="101" w:author="Damian Struk" w:date="2024-11-09T13:09:00Z" w16du:dateUtc="2024-11-09T12:09:00Z"/>
+                <w:del w:id="101" w:author="stella" w:date="2024-11-09T13:09:00Z" w16du:dateUtc="2024-11-09T12:09:00Z"/>
                 <w:rFonts w:ascii="Corbel" w:hAnsi="Corbel"/>
                 <w:color w:val="575757"/>
                 <w:lang w:eastAsia="ja-JP"/>
               </w:rPr>
             </w:pPr>
-            <w:ins w:id="102" w:author="Damian Struk" w:date="2024-11-09T13:09:00Z" w16du:dateUtc="2024-11-09T12:09:00Z">
+            <w:ins w:id="102" w:author="stella" w:date="2024-11-09T13:09:00Z" w16du:dateUtc="2024-11-09T12:09:00Z">
               <w:r>
                 <w:rPr>
                   <w:rFonts w:ascii="Corbel" w:hAnsi="Corbel"/>
@@ -8006,7 +8006,7 @@
                 <w:lang w:eastAsia="ja-JP"/>
               </w:rPr>
             </w:r>
-            <w:ins w:id="103" w:author="Damian Struk" w:date="2024-11-09T13:09:00Z" w16du:dateUtc="2024-11-09T12:09:00Z">
+            <w:ins w:id="103" w:author="stella" w:date="2024-11-09T13:09:00Z" w16du:dateUtc="2024-11-09T12:09:00Z">
               <w:r>
                 <w:rPr>
                   <w:rFonts w:ascii="Corbel" w:hAnsi="Corbel"/>
@@ -8040,7 +8040,7 @@
                 <w:t>.</w:t>
               </w:r>
             </w:ins>
-            <w:del w:id="104" w:author="Damian Struk" w:date="2024-11-09T13:09:00Z" w16du:dateUtc="2024-11-09T12:09:00Z">
+            <w:del w:id="104" w:author="stella" w:date="2024-11-09T13:09:00Z" w16du:dateUtc="2024-11-09T12:09:00Z">
               <w:r>
                 <w:rPr>
                   <w:rFonts w:ascii="Corbel" w:hAnsi="Corbel"/>
@@ -8174,13 +8174,13 @@
               <w:spacing w:before="120" w:after="120" w:line="300" w:lineRule="exact"/>
               <w:contextualSpacing w:val="0"/>
               <w:rPr>
-                <w:del w:id="105" w:author="Damian Struk" w:date="2024-11-09T13:09:00Z" w16du:dateUtc="2024-11-09T12:09:00Z"/>
+                <w:del w:id="105" w:author="stella" w:date="2024-11-09T13:09:00Z" w16du:dateUtc="2024-11-09T12:09:00Z"/>
                 <w:rFonts w:ascii="Corbel" w:hAnsi="Corbel"/>
                 <w:color w:val="575757"/>
                 <w:lang w:eastAsia="ja-JP"/>
               </w:rPr>
             </w:pPr>
-            <w:del w:id="106" w:author="Damian Struk" w:date="2024-11-09T13:09:00Z" w16du:dateUtc="2024-11-09T12:09:00Z">
+            <w:del w:id="106" w:author="stella" w:date="2024-11-09T13:09:00Z" w16du:dateUtc="2024-11-09T12:09:00Z">
               <w:r>
                 <w:rPr>
                   <w:rFonts w:ascii="Corbel" w:hAnsi="Corbel"/>
@@ -8218,13 +8218,13 @@
               <w:spacing w:before="120" w:after="120" w:line="300" w:lineRule="exact"/>
               <w:contextualSpacing w:val="0"/>
               <w:rPr>
-                <w:del w:id="107" w:author="Damian Struk" w:date="2024-11-09T13:09:00Z" w16du:dateUtc="2024-11-09T12:09:00Z"/>
+                <w:del w:id="107" w:author="stella" w:date="2024-11-09T13:09:00Z" w16du:dateUtc="2024-11-09T12:09:00Z"/>
                 <w:rFonts w:ascii="Corbel" w:hAnsi="Corbel"/>
                 <w:color w:val="575757"/>
                 <w:lang w:eastAsia="ja-JP"/>
               </w:rPr>
             </w:pPr>
-            <w:del w:id="108" w:author="Damian Struk" w:date="2024-11-09T13:09:00Z" w16du:dateUtc="2024-11-09T12:09:00Z">
+            <w:del w:id="108" w:author="stella" w:date="2024-11-09T13:09:00Z" w16du:dateUtc="2024-11-09T12:09:00Z">
               <w:r>
                 <w:rPr>
                   <w:rFonts w:ascii="Corbel" w:hAnsi="Corbel"/>
@@ -8307,7 +8307,7 @@
                 <w:lang w:eastAsia="ja-JP"/>
               </w:rPr>
             </w:pPr>
-            <w:del w:id="109" w:author="Damian Struk" w:date="2024-11-09T13:09:00Z" w16du:dateUtc="2024-11-09T12:09:00Z">
+            <w:del w:id="109" w:author="stella" w:date="2024-11-09T13:09:00Z" w16du:dateUtc="2024-11-09T12:09:00Z">
               <w:r>
                 <w:rPr>
                   <w:rFonts w:ascii="Corbel" w:hAnsi="Corbel"/>
@@ -8357,7 +8357,7 @@
           <w:tblW w:w="9498" w:type="dxa"/>
           <w:tblInd w:w="567" w:type="dxa"/>
           <w:tblLayout w:type="fixed"/>
-          <w:tblPrExChange w:id="110" w:author="Damian Struk" w:date="2024-11-09T13:09:00Z" w16du:dateUtc="2024-11-09T12:09:00Z">
+          <w:tblPrExChange w:id="110" w:author="stella" w:date="2024-11-09T13:09:00Z" w16du:dateUtc="2024-11-09T12:09:00Z">
             <w:tblPrEx>
               <w:tblW w:w="9498" w:type="dxa"/>
               <w:tblInd w:w="567" w:type="dxa"/>
@@ -8367,7 +8367,7 @@
         </w:tblPrEx>
         <w:trPr>
           <w:trHeight w:val="265"/>
-          <w:trPrChange w:id="111" w:author="Damian Struk" w:date="2024-11-09T13:09:00Z" w16du:dateUtc="2024-11-09T12:09:00Z">
+          <w:trPrChange w:id="111" w:author="stella" w:date="2024-11-09T13:09:00Z" w16du:dateUtc="2024-11-09T12:09:00Z">
             <w:trPr>
               <w:trHeight w:val="265"/>
             </w:trPr>
@@ -8376,7 +8376,7 @@
         <w:tc>
           <w:tcPr>
             <w:tcW w:w="709" w:type="dxa"/>
-            <w:tcPrChange w:id="112" w:author="Damian Struk" w:date="2024-11-09T13:09:00Z" w16du:dateUtc="2024-11-09T12:09:00Z">
+            <w:tcPrChange w:id="112" w:author="stella" w:date="2024-11-09T13:09:00Z" w16du:dateUtc="2024-11-09T12:09:00Z">
               <w:tcPr>
                 <w:tcW w:w="709" w:type="dxa"/>
               </w:tcPr>
@@ -8404,7 +8404,7 @@
         <w:tc>
           <w:tcPr>
             <w:tcW w:w="2226" w:type="dxa"/>
-            <w:tcPrChange w:id="113" w:author="Damian Struk" w:date="2024-11-09T13:09:00Z" w16du:dateUtc="2024-11-09T12:09:00Z">
+            <w:tcPrChange w:id="113" w:author="stella" w:date="2024-11-09T13:09:00Z" w16du:dateUtc="2024-11-09T12:09:00Z">
               <w:tcPr>
                 <w:tcW w:w="2226" w:type="dxa"/>
               </w:tcPr>
@@ -8424,7 +8424,7 @@
                 <w:lang w:eastAsia="ja-JP"/>
               </w:rPr>
             </w:pPr>
-            <w:ins w:id="114" w:author="Damian Struk" w:date="2024-11-09T13:09:00Z" w16du:dateUtc="2024-11-09T12:09:00Z">
+            <w:ins w:id="114" w:author="stella" w:date="2024-11-09T13:09:00Z" w16du:dateUtc="2024-11-09T12:09:00Z">
               <w:r>
                 <w:rPr>
                   <w:rFonts w:ascii="Corbel" w:hAnsi="Corbel"/>
@@ -8435,7 +8435,7 @@
                 <w:t>Porušení záruky</w:t>
               </w:r>
             </w:ins>
-            <w:del w:id="115" w:author="Damian Struk" w:date="2024-11-09T13:09:00Z" w16du:dateUtc="2024-11-09T12:09:00Z">
+            <w:del w:id="115" w:author="stella" w:date="2024-11-09T13:09:00Z" w16du:dateUtc="2024-11-09T12:09:00Z">
               <w:r>
                 <w:rPr>
                   <w:rFonts w:ascii="Corbel" w:hAnsi="Corbel"/>
@@ -8451,7 +8451,7 @@
         <w:tc>
           <w:tcPr>
             <w:tcW w:w="6563" w:type="dxa"/>
-            <w:tcPrChange w:id="116" w:author="Damian Struk" w:date="2024-11-09T13:09:00Z" w16du:dateUtc="2024-11-09T12:09:00Z">
+            <w:tcPrChange w:id="116" w:author="stella" w:date="2024-11-09T13:09:00Z" w16du:dateUtc="2024-11-09T12:09:00Z">
               <w:tcPr>
                 <w:tcW w:w="6563" w:type="dxa"/>
               </w:tcPr>
@@ -8470,7 +8470,7 @@
                 <w:lang w:eastAsia="ja-JP"/>
               </w:rPr>
             </w:pPr>
-            <w:ins w:id="117" w:author="Damian Struk" w:date="2024-11-09T13:09:00Z" w16du:dateUtc="2024-11-09T12:09:00Z">
+            <w:ins w:id="117" w:author="stella" w:date="2024-11-09T13:09:00Z" w16du:dateUtc="2024-11-09T12:09:00Z">
               <w:r>
                 <w:rPr>
                   <w:rFonts w:ascii="Corbel" w:hAnsi="Corbel"/>
@@ -8503,7 +8503,7 @@
                 <w:lang w:eastAsia="ja-JP"/>
               </w:rPr>
             </w:r>
-            <w:ins w:id="118" w:author="Damian Struk" w:date="2024-11-09T13:09:00Z" w16du:dateUtc="2024-11-09T12:09:00Z">
+            <w:ins w:id="118" w:author="stella" w:date="2024-11-09T13:09:00Z" w16du:dateUtc="2024-11-09T12:09:00Z">
               <w:r>
                 <w:rPr>
                   <w:rFonts w:ascii="Corbel" w:hAnsi="Corbel"/>
@@ -8537,7 +8537,7 @@
                 <w:t>.</w:t>
               </w:r>
             </w:ins>
-            <w:del w:id="119" w:author="Damian Struk" w:date="2024-11-09T13:09:00Z" w16du:dateUtc="2024-11-09T12:09:00Z">
+            <w:del w:id="119" w:author="stella" w:date="2024-11-09T13:09:00Z" w16du:dateUtc="2024-11-09T12:09:00Z">
               <w:r>
                 <w:rPr>
                   <w:rFonts w:ascii="Corbel" w:hAnsi="Corbel"/>
@@ -8610,7 +8610,7 @@
           <w:tblW w:w="9498" w:type="dxa"/>
           <w:tblInd w:w="567" w:type="dxa"/>
           <w:tblLayout w:type="fixed"/>
-          <w:tblPrExChange w:id="120" w:author="Damian Struk" w:date="2024-11-09T13:09:00Z" w16du:dateUtc="2024-11-09T12:09:00Z">
+          <w:tblPrExChange w:id="120" w:author="stella" w:date="2024-11-09T13:09:00Z" w16du:dateUtc="2024-11-09T12:09:00Z">
             <w:tblPrEx>
               <w:tblW w:w="9498" w:type="dxa"/>
               <w:tblInd w:w="567" w:type="dxa"/>
@@ -8621,7 +8621,7 @@
         <w:tc>
           <w:tcPr>
             <w:tcW w:w="709" w:type="dxa"/>
-            <w:tcPrChange w:id="121" w:author="Damian Struk" w:date="2024-11-09T13:09:00Z" w16du:dateUtc="2024-11-09T12:09:00Z">
+            <w:tcPrChange w:id="121" w:author="stella" w:date="2024-11-09T13:09:00Z" w16du:dateUtc="2024-11-09T12:09:00Z">
               <w:tcPr>
                 <w:tcW w:w="709" w:type="dxa"/>
               </w:tcPr>
@@ -8649,7 +8649,7 @@
         <w:tc>
           <w:tcPr>
             <w:tcW w:w="2226" w:type="dxa"/>
-            <w:tcPrChange w:id="122" w:author="Damian Struk" w:date="2024-11-09T13:09:00Z" w16du:dateUtc="2024-11-09T12:09:00Z">
+            <w:tcPrChange w:id="122" w:author="stella" w:date="2024-11-09T13:09:00Z" w16du:dateUtc="2024-11-09T12:09:00Z">
               <w:tcPr>
                 <w:tcW w:w="2226" w:type="dxa"/>
               </w:tcPr>
@@ -8669,7 +8669,7 @@
                 <w:lang w:eastAsia="ja-JP"/>
               </w:rPr>
             </w:pPr>
-            <w:ins w:id="123" w:author="Damian Struk" w:date="2024-11-09T13:09:00Z" w16du:dateUtc="2024-11-09T12:09:00Z">
+            <w:ins w:id="123" w:author="stella" w:date="2024-11-09T13:09:00Z" w16du:dateUtc="2024-11-09T12:09:00Z">
               <w:r>
                 <w:rPr>
                   <w:rFonts w:ascii="Corbel" w:hAnsi="Corbel"/>
@@ -8698,7 +8698,7 @@
                 <w:t>k</w:t>
               </w:r>
             </w:ins>
-            <w:del w:id="124" w:author="Damian Struk" w:date="2024-11-09T13:09:00Z" w16du:dateUtc="2024-11-09T12:09:00Z">
+            <w:del w:id="124" w:author="stella" w:date="2024-11-09T13:09:00Z" w16du:dateUtc="2024-11-09T12:09:00Z">
               <w:r>
                 <w:rPr>
                   <w:rFonts w:ascii="Corbel" w:hAnsi="Corbel"/>
@@ -8714,7 +8714,7 @@
         <w:tc>
           <w:tcPr>
             <w:tcW w:w="6563" w:type="dxa"/>
-            <w:tcPrChange w:id="125" w:author="Damian Struk" w:date="2024-11-09T13:09:00Z" w16du:dateUtc="2024-11-09T12:09:00Z">
+            <w:tcPrChange w:id="125" w:author="stella" w:date="2024-11-09T13:09:00Z" w16du:dateUtc="2024-11-09T12:09:00Z">
               <w:tcPr>
                 <w:tcW w:w="6563" w:type="dxa"/>
               </w:tcPr>
@@ -8736,7 +8736,7 @@
                 <w:lang w:eastAsia="ja-JP"/>
               </w:rPr>
             </w:pPr>
-            <w:ins w:id="126" w:author="Damian Struk" w:date="2024-11-09T13:09:00Z" w16du:dateUtc="2024-11-09T12:09:00Z">
+            <w:ins w:id="126" w:author="stella" w:date="2024-11-09T13:09:00Z" w16du:dateUtc="2024-11-09T12:09:00Z">
               <w:r>
                 <w:rPr>
                   <w:rFonts w:ascii="Corbel" w:hAnsi="Corbel"/>
@@ -8795,7 +8795,7 @@
                 <w:t>, který je ve vlastnictví Prodávajícího 3.</w:t>
               </w:r>
             </w:ins>
-            <w:del w:id="127" w:author="Damian Struk" w:date="2024-11-09T13:09:00Z" w16du:dateUtc="2024-11-09T12:09:00Z">
+            <w:del w:id="127" w:author="stella" w:date="2024-11-09T13:09:00Z" w16du:dateUtc="2024-11-09T12:09:00Z">
               <w:r>
                 <w:rPr>
                   <w:rFonts w:ascii="Corbel" w:hAnsi="Corbel"/>
@@ -8868,7 +8868,7 @@
           <w:tblW w:w="9498" w:type="dxa"/>
           <w:tblInd w:w="567" w:type="dxa"/>
           <w:tblLayout w:type="fixed"/>
-          <w:tblPrExChange w:id="128" w:author="Damian Struk" w:date="2024-11-09T13:09:00Z" w16du:dateUtc="2024-11-09T12:09:00Z">
+          <w:tblPrExChange w:id="128" w:author="stella" w:date="2024-11-09T13:09:00Z" w16du:dateUtc="2024-11-09T12:09:00Z">
             <w:tblPrEx>
               <w:tblW w:w="9498" w:type="dxa"/>
               <w:tblInd w:w="567" w:type="dxa"/>
@@ -8879,7 +8879,7 @@
         <w:tc>
           <w:tcPr>
             <w:tcW w:w="709" w:type="dxa"/>
-            <w:tcPrChange w:id="129" w:author="Damian Struk" w:date="2024-11-09T13:09:00Z" w16du:dateUtc="2024-11-09T12:09:00Z">
+            <w:tcPrChange w:id="129" w:author="stella" w:date="2024-11-09T13:09:00Z" w16du:dateUtc="2024-11-09T12:09:00Z">
               <w:tcPr>
                 <w:tcW w:w="709" w:type="dxa"/>
               </w:tcPr>
@@ -8907,7 +8907,7 @@
         <w:tc>
           <w:tcPr>
             <w:tcW w:w="2226" w:type="dxa"/>
-            <w:tcPrChange w:id="130" w:author="Damian Struk" w:date="2024-11-09T13:09:00Z" w16du:dateUtc="2024-11-09T12:09:00Z">
+            <w:tcPrChange w:id="130" w:author="stella" w:date="2024-11-09T13:09:00Z" w16du:dateUtc="2024-11-09T12:09:00Z">
               <w:tcPr>
                 <w:tcW w:w="2226" w:type="dxa"/>
               </w:tcPr>
@@ -8927,7 +8927,7 @@
                 <w:lang w:eastAsia="ja-JP"/>
               </w:rPr>
             </w:pPr>
-            <w:ins w:id="131" w:author="Damian Struk" w:date="2024-11-09T13:09:00Z" w16du:dateUtc="2024-11-09T12:09:00Z">
+            <w:ins w:id="131" w:author="stella" w:date="2024-11-09T13:09:00Z" w16du:dateUtc="2024-11-09T12:09:00Z">
               <w:r>
                 <w:rPr>
                   <w:rFonts w:ascii="Corbel" w:hAnsi="Corbel"/>
@@ -8938,7 +8938,7 @@
                 <w:t>Práva třetích osob</w:t>
               </w:r>
             </w:ins>
-            <w:del w:id="132" w:author="Damian Struk" w:date="2024-11-09T13:09:00Z" w16du:dateUtc="2024-11-09T12:09:00Z">
+            <w:del w:id="132" w:author="stella" w:date="2024-11-09T13:09:00Z" w16du:dateUtc="2024-11-09T12:09:00Z">
               <w:r>
                 <w:rPr>
                   <w:rFonts w:ascii="Corbel" w:hAnsi="Corbel"/>
@@ -8972,7 +8972,7 @@
         <w:tc>
           <w:tcPr>
             <w:tcW w:w="6563" w:type="dxa"/>
-            <w:tcPrChange w:id="133" w:author="Damian Struk" w:date="2024-11-09T13:09:00Z" w16du:dateUtc="2024-11-09T12:09:00Z">
+            <w:tcPrChange w:id="133" w:author="stella" w:date="2024-11-09T13:09:00Z" w16du:dateUtc="2024-11-09T12:09:00Z">
               <w:tcPr>
                 <w:tcW w:w="6563" w:type="dxa"/>
               </w:tcPr>
@@ -8988,7 +8988,7 @@
                 <w:lang w:eastAsia="ja-JP"/>
               </w:rPr>
             </w:pPr>
-            <w:ins w:id="134" w:author="Damian Struk" w:date="2024-11-09T13:09:00Z" w16du:dateUtc="2024-11-09T12:09:00Z">
+            <w:ins w:id="134" w:author="stella" w:date="2024-11-09T13:09:00Z" w16du:dateUtc="2024-11-09T12:09:00Z">
               <w:r>
                 <w:rPr>
                   <w:rFonts w:ascii="Corbel" w:hAnsi="Corbel"/>
@@ -9094,7 +9094,7 @@
                 <w:t>, a to ve prospěch jakékoli osoby jiné než osoby Kupujícího.</w:t>
               </w:r>
             </w:ins>
-            <w:del w:id="135" w:author="Damian Struk" w:date="2024-11-09T13:09:00Z" w16du:dateUtc="2024-11-09T12:09:00Z">
+            <w:del w:id="135" w:author="stella" w:date="2024-11-09T13:09:00Z" w16du:dateUtc="2024-11-09T12:09:00Z">
               <w:r>
                 <w:rPr>
                   <w:rFonts w:ascii="Corbel" w:hAnsi="Corbel"/>
@@ -9127,7 +9127,7 @@
           <w:tblW w:w="9498" w:type="dxa"/>
           <w:tblInd w:w="567" w:type="dxa"/>
           <w:tblLayout w:type="fixed"/>
-          <w:tblPrExChange w:id="136" w:author="Damian Struk" w:date="2024-11-09T13:09:00Z" w16du:dateUtc="2024-11-09T12:09:00Z">
+          <w:tblPrExChange w:id="136" w:author="stella" w:date="2024-11-09T13:09:00Z" w16du:dateUtc="2024-11-09T12:09:00Z">
             <w:tblPrEx>
               <w:tblW w:w="9498" w:type="dxa"/>
               <w:tblInd w:w="567" w:type="dxa"/>
@@ -9138,7 +9138,7 @@
         <w:tc>
           <w:tcPr>
             <w:tcW w:w="709" w:type="dxa"/>
-            <w:tcPrChange w:id="137" w:author="Damian Struk" w:date="2024-11-09T13:09:00Z" w16du:dateUtc="2024-11-09T12:09:00Z">
+            <w:tcPrChange w:id="137" w:author="stella" w:date="2024-11-09T13:09:00Z" w16du:dateUtc="2024-11-09T12:09:00Z">
               <w:tcPr>
                 <w:tcW w:w="709" w:type="dxa"/>
               </w:tcPr>
@@ -9168,7 +9168,7 @@
         <w:tc>
           <w:tcPr>
             <w:tcW w:w="2226" w:type="dxa"/>
-            <w:tcPrChange w:id="139" w:author="Damian Struk" w:date="2024-11-09T13:09:00Z" w16du:dateUtc="2024-11-09T12:09:00Z">
+            <w:tcPrChange w:id="139" w:author="stella" w:date="2024-11-09T13:09:00Z" w16du:dateUtc="2024-11-09T12:09:00Z">
               <w:tcPr>
                 <w:tcW w:w="2226" w:type="dxa"/>
               </w:tcPr>
@@ -9188,7 +9188,7 @@
                 <w:lang w:eastAsia="ja-JP"/>
               </w:rPr>
             </w:pPr>
-            <w:ins w:id="140" w:author="Damian Struk" w:date="2024-11-09T13:09:00Z" w16du:dateUtc="2024-11-09T12:09:00Z">
+            <w:ins w:id="140" w:author="stella" w:date="2024-11-09T13:09:00Z" w16du:dateUtc="2024-11-09T12:09:00Z">
               <w:r>
                 <w:rPr>
                   <w:rFonts w:ascii="Corbel" w:hAnsi="Corbel"/>
@@ -9199,7 +9199,7 @@
                 <w:t>Prohlášení</w:t>
               </w:r>
             </w:ins>
-            <w:del w:id="141" w:author="Damian Struk" w:date="2024-11-09T13:09:00Z" w16du:dateUtc="2024-11-09T12:09:00Z">
+            <w:del w:id="141" w:author="stella" w:date="2024-11-09T13:09:00Z" w16du:dateUtc="2024-11-09T12:09:00Z">
               <w:r>
                 <w:rPr>
                   <w:rFonts w:ascii="Corbel" w:hAnsi="Corbel"/>
@@ -9215,7 +9215,7 @@
         <w:tc>
           <w:tcPr>
             <w:tcW w:w="6563" w:type="dxa"/>
-            <w:tcPrChange w:id="142" w:author="Damian Struk" w:date="2024-11-09T13:09:00Z" w16du:dateUtc="2024-11-09T12:09:00Z">
+            <w:tcPrChange w:id="142" w:author="stella" w:date="2024-11-09T13:09:00Z" w16du:dateUtc="2024-11-09T12:09:00Z">
               <w:tcPr>
                 <w:tcW w:w="6563" w:type="dxa"/>
               </w:tcPr>
@@ -9234,7 +9234,7 @@
                 <w:lang w:eastAsia="ja-JP"/>
               </w:rPr>
             </w:pPr>
-            <w:ins w:id="143" w:author="Damian Struk" w:date="2024-11-09T13:09:00Z" w16du:dateUtc="2024-11-09T12:09:00Z">
+            <w:ins w:id="143" w:author="stella" w:date="2024-11-09T13:09:00Z" w16du:dateUtc="2024-11-09T12:09:00Z">
               <w:r>
                 <w:rPr>
                   <w:rFonts w:ascii="Corbel" w:hAnsi="Corbel"/>
@@ -9267,7 +9267,7 @@
                 <w:lang w:eastAsia="ja-JP"/>
               </w:rPr>
             </w:r>
-            <w:ins w:id="144" w:author="Damian Struk" w:date="2024-11-09T13:09:00Z" w16du:dateUtc="2024-11-09T12:09:00Z">
+            <w:ins w:id="144" w:author="stella" w:date="2024-11-09T13:09:00Z" w16du:dateUtc="2024-11-09T12:09:00Z">
               <w:r>
                 <w:rPr>
                   <w:rFonts w:ascii="Corbel" w:hAnsi="Corbel"/>
@@ -9301,7 +9301,7 @@
                 <w:t xml:space="preserve">. </w:t>
               </w:r>
             </w:ins>
-            <w:del w:id="145" w:author="Damian Struk" w:date="2024-11-09T13:09:00Z" w16du:dateUtc="2024-11-09T12:09:00Z">
+            <w:del w:id="145" w:author="stella" w:date="2024-11-09T13:09:00Z" w16du:dateUtc="2024-11-09T12:09:00Z">
               <w:r>
                 <w:rPr>
                   <w:rFonts w:ascii="Corbel" w:hAnsi="Corbel"/>
@@ -9415,7 +9415,7 @@
           <w:tblW w:w="9498" w:type="dxa"/>
           <w:tblInd w:w="567" w:type="dxa"/>
           <w:tblLayout w:type="fixed"/>
-          <w:tblPrExChange w:id="146" w:author="Damian Struk" w:date="2024-11-09T13:09:00Z" w16du:dateUtc="2024-11-09T12:09:00Z">
+          <w:tblPrExChange w:id="146" w:author="stella" w:date="2024-11-09T13:09:00Z" w16du:dateUtc="2024-11-09T12:09:00Z">
             <w:tblPrEx>
               <w:tblW w:w="9498" w:type="dxa"/>
               <w:tblInd w:w="567" w:type="dxa"/>
@@ -9426,7 +9426,7 @@
         <w:tc>
           <w:tcPr>
             <w:tcW w:w="709" w:type="dxa"/>
-            <w:tcPrChange w:id="147" w:author="Damian Struk" w:date="2024-11-09T13:09:00Z" w16du:dateUtc="2024-11-09T12:09:00Z">
+            <w:tcPrChange w:id="147" w:author="stella" w:date="2024-11-09T13:09:00Z" w16du:dateUtc="2024-11-09T12:09:00Z">
               <w:tcPr>
                 <w:tcW w:w="709" w:type="dxa"/>
               </w:tcPr>
@@ -9456,7 +9456,7 @@
         <w:tc>
           <w:tcPr>
             <w:tcW w:w="2226" w:type="dxa"/>
-            <w:tcPrChange w:id="149" w:author="Damian Struk" w:date="2024-11-09T13:09:00Z" w16du:dateUtc="2024-11-09T12:09:00Z">
+            <w:tcPrChange w:id="149" w:author="stella" w:date="2024-11-09T13:09:00Z" w16du:dateUtc="2024-11-09T12:09:00Z">
               <w:tcPr>
                 <w:tcW w:w="2226" w:type="dxa"/>
               </w:tcPr>
@@ -9476,7 +9476,7 @@
                 <w:lang w:eastAsia="ja-JP"/>
               </w:rPr>
             </w:pPr>
-            <w:ins w:id="150" w:author="Damian Struk" w:date="2024-11-09T13:09:00Z" w16du:dateUtc="2024-11-09T12:09:00Z">
+            <w:ins w:id="150" w:author="stella" w:date="2024-11-09T13:09:00Z" w16du:dateUtc="2024-11-09T12:09:00Z">
               <w:r>
                 <w:rPr>
                   <w:rFonts w:ascii="Corbel" w:hAnsi="Corbel"/>
@@ -9487,7 +9487,7 @@
                 <w:t>Registr smluv</w:t>
               </w:r>
             </w:ins>
-            <w:del w:id="151" w:author="Damian Struk" w:date="2024-11-09T13:09:00Z" w16du:dateUtc="2024-11-09T12:09:00Z">
+            <w:del w:id="151" w:author="stella" w:date="2024-11-09T13:09:00Z" w16du:dateUtc="2024-11-09T12:09:00Z">
               <w:r>
                 <w:rPr>
                   <w:rFonts w:ascii="Corbel" w:hAnsi="Corbel"/>
@@ -9503,7 +9503,7 @@
         <w:tc>
           <w:tcPr>
             <w:tcW w:w="6563" w:type="dxa"/>
-            <w:tcPrChange w:id="152" w:author="Damian Struk" w:date="2024-11-09T13:09:00Z" w16du:dateUtc="2024-11-09T12:09:00Z">
+            <w:tcPrChange w:id="152" w:author="stella" w:date="2024-11-09T13:09:00Z" w16du:dateUtc="2024-11-09T12:09:00Z">
               <w:tcPr>
                 <w:tcW w:w="6563" w:type="dxa"/>
               </w:tcPr>
@@ -9522,7 +9522,7 @@
                 <w:lang w:eastAsia="ja-JP"/>
               </w:rPr>
             </w:pPr>
-            <w:ins w:id="153" w:author="Damian Struk" w:date="2024-11-09T13:09:00Z" w16du:dateUtc="2024-11-09T12:09:00Z">
+            <w:ins w:id="153" w:author="stella" w:date="2024-11-09T13:09:00Z" w16du:dateUtc="2024-11-09T12:09:00Z">
               <w:r>
                 <w:rPr>
                   <w:rFonts w:ascii="Corbel" w:hAnsi="Corbel"/>
@@ -9532,7 +9532,7 @@
                 <w:t>znamená registr smluv ve smyslu Zákona o registru smluv.</w:t>
               </w:r>
             </w:ins>
-            <w:del w:id="154" w:author="Damian Struk" w:date="2024-11-09T13:09:00Z" w16du:dateUtc="2024-11-09T12:09:00Z">
+            <w:del w:id="154" w:author="stella" w:date="2024-11-09T13:09:00Z" w16du:dateUtc="2024-11-09T12:09:00Z">
               <w:r>
                 <w:rPr>
                   <w:rFonts w:ascii="Corbel" w:hAnsi="Corbel"/>
@@ -9605,7 +9605,7 @@
           <w:tblW w:w="9498" w:type="dxa"/>
           <w:tblInd w:w="567" w:type="dxa"/>
           <w:tblLayout w:type="fixed"/>
-          <w:tblPrExChange w:id="155" w:author="Damian Struk" w:date="2024-11-09T13:09:00Z" w16du:dateUtc="2024-11-09T12:09:00Z">
+          <w:tblPrExChange w:id="155" w:author="stella" w:date="2024-11-09T13:09:00Z" w16du:dateUtc="2024-11-09T12:09:00Z">
             <w:tblPrEx>
               <w:tblW w:w="9498" w:type="dxa"/>
               <w:tblInd w:w="567" w:type="dxa"/>
@@ -9616,7 +9616,7 @@
         <w:tc>
           <w:tcPr>
             <w:tcW w:w="709" w:type="dxa"/>
-            <w:tcPrChange w:id="156" w:author="Damian Struk" w:date="2024-11-09T13:09:00Z" w16du:dateUtc="2024-11-09T12:09:00Z">
+            <w:tcPrChange w:id="156" w:author="stella" w:date="2024-11-09T13:09:00Z" w16du:dateUtc="2024-11-09T12:09:00Z">
               <w:tcPr>
                 <w:tcW w:w="709" w:type="dxa"/>
               </w:tcPr>
@@ -9644,7 +9644,7 @@
         <w:tc>
           <w:tcPr>
             <w:tcW w:w="2226" w:type="dxa"/>
-            <w:tcPrChange w:id="157" w:author="Damian Struk" w:date="2024-11-09T13:09:00Z" w16du:dateUtc="2024-11-09T12:09:00Z">
+            <w:tcPrChange w:id="157" w:author="stella" w:date="2024-11-09T13:09:00Z" w16du:dateUtc="2024-11-09T12:09:00Z">
               <w:tcPr>
                 <w:tcW w:w="2226" w:type="dxa"/>
               </w:tcPr>
@@ -9664,7 +9664,7 @@
                 <w:lang w:eastAsia="ja-JP"/>
               </w:rPr>
             </w:pPr>
-            <w:ins w:id="158" w:author="Damian Struk" w:date="2024-11-09T13:09:00Z" w16du:dateUtc="2024-11-09T12:09:00Z">
+            <w:ins w:id="158" w:author="stella" w:date="2024-11-09T13:09:00Z" w16du:dateUtc="2024-11-09T12:09:00Z">
               <w:r>
                 <w:rPr>
                   <w:rFonts w:ascii="Corbel" w:hAnsi="Corbel"/>
@@ -9675,7 +9675,7 @@
                 <w:t>Sdělení</w:t>
               </w:r>
             </w:ins>
-            <w:del w:id="159" w:author="Damian Struk" w:date="2024-11-09T13:09:00Z" w16du:dateUtc="2024-11-09T12:09:00Z">
+            <w:del w:id="159" w:author="stella" w:date="2024-11-09T13:09:00Z" w16du:dateUtc="2024-11-09T12:09:00Z">
               <w:r>
                 <w:rPr>
                   <w:rFonts w:ascii="Corbel" w:hAnsi="Corbel"/>
@@ -9691,7 +9691,7 @@
         <w:tc>
           <w:tcPr>
             <w:tcW w:w="6563" w:type="dxa"/>
-            <w:tcPrChange w:id="160" w:author="Damian Struk" w:date="2024-11-09T13:09:00Z" w16du:dateUtc="2024-11-09T12:09:00Z">
+            <w:tcPrChange w:id="160" w:author="stella" w:date="2024-11-09T13:09:00Z" w16du:dateUtc="2024-11-09T12:09:00Z">
               <w:tcPr>
                 <w:tcW w:w="6563" w:type="dxa"/>
               </w:tcPr>
@@ -9710,7 +9710,7 @@
                 <w:lang w:eastAsia="ja-JP"/>
               </w:rPr>
             </w:pPr>
-            <w:ins w:id="161" w:author="Damian Struk" w:date="2024-11-09T13:09:00Z" w16du:dateUtc="2024-11-09T12:09:00Z">
+            <w:ins w:id="161" w:author="stella" w:date="2024-11-09T13:09:00Z" w16du:dateUtc="2024-11-09T12:09:00Z">
               <w:r>
                 <w:rPr>
                   <w:rFonts w:ascii="Corbel" w:hAnsi="Corbel"/>
@@ -9743,7 +9743,7 @@
                 <w:lang w:eastAsia="ja-JP"/>
               </w:rPr>
             </w:r>
-            <w:ins w:id="162" w:author="Damian Struk" w:date="2024-11-09T13:09:00Z" w16du:dateUtc="2024-11-09T12:09:00Z">
+            <w:ins w:id="162" w:author="stella" w:date="2024-11-09T13:09:00Z" w16du:dateUtc="2024-11-09T12:09:00Z">
               <w:r>
                 <w:rPr>
                   <w:rFonts w:ascii="Corbel" w:hAnsi="Corbel"/>
@@ -9777,7 +9777,7 @@
                 <w:t>.</w:t>
               </w:r>
             </w:ins>
-            <w:del w:id="163" w:author="Damian Struk" w:date="2024-11-09T13:09:00Z" w16du:dateUtc="2024-11-09T12:09:00Z">
+            <w:del w:id="163" w:author="stella" w:date="2024-11-09T13:09:00Z" w16du:dateUtc="2024-11-09T12:09:00Z">
               <w:r>
                 <w:rPr>
                   <w:rFonts w:ascii="Corbel" w:hAnsi="Corbel"/>
@@ -9795,7 +9795,7 @@
           <w:tblW w:w="9498" w:type="dxa"/>
           <w:tblInd w:w="567" w:type="dxa"/>
           <w:tblLayout w:type="fixed"/>
-          <w:tblPrExChange w:id="164" w:author="Damian Struk" w:date="2024-11-09T13:09:00Z" w16du:dateUtc="2024-11-09T12:09:00Z">
+          <w:tblPrExChange w:id="164" w:author="stella" w:date="2024-11-09T13:09:00Z" w16du:dateUtc="2024-11-09T12:09:00Z">
             <w:tblPrEx>
               <w:tblW w:w="9498" w:type="dxa"/>
               <w:tblInd w:w="567" w:type="dxa"/>
@@ -9806,7 +9806,7 @@
         <w:tc>
           <w:tcPr>
             <w:tcW w:w="709" w:type="dxa"/>
-            <w:tcPrChange w:id="165" w:author="Damian Struk" w:date="2024-11-09T13:09:00Z" w16du:dateUtc="2024-11-09T12:09:00Z">
+            <w:tcPrChange w:id="165" w:author="stella" w:date="2024-11-09T13:09:00Z" w16du:dateUtc="2024-11-09T12:09:00Z">
               <w:tcPr>
                 <w:tcW w:w="709" w:type="dxa"/>
               </w:tcPr>
@@ -9834,7 +9834,7 @@
         <w:tc>
           <w:tcPr>
             <w:tcW w:w="2226" w:type="dxa"/>
-            <w:tcPrChange w:id="166" w:author="Damian Struk" w:date="2024-11-09T13:09:00Z" w16du:dateUtc="2024-11-09T12:09:00Z">
+            <w:tcPrChange w:id="166" w:author="stella" w:date="2024-11-09T13:09:00Z" w16du:dateUtc="2024-11-09T12:09:00Z">
               <w:tcPr>
                 <w:tcW w:w="2226" w:type="dxa"/>
               </w:tcPr>
@@ -9854,7 +9854,7 @@
                 <w:lang w:eastAsia="ja-JP"/>
               </w:rPr>
             </w:pPr>
-            <w:ins w:id="167" w:author="Damian Struk" w:date="2024-11-09T13:09:00Z" w16du:dateUtc="2024-11-09T12:09:00Z">
+            <w:ins w:id="167" w:author="stella" w:date="2024-11-09T13:09:00Z" w16du:dateUtc="2024-11-09T12:09:00Z">
               <w:r>
                 <w:rPr>
                   <w:rFonts w:ascii="Corbel" w:hAnsi="Corbel"/>
@@ -9865,7 +9865,7 @@
                 <w:t>Seznam bankovních účtů</w:t>
               </w:r>
             </w:ins>
-            <w:del w:id="168" w:author="Damian Struk" w:date="2024-11-09T13:09:00Z" w16du:dateUtc="2024-11-09T12:09:00Z">
+            <w:del w:id="168" w:author="stella" w:date="2024-11-09T13:09:00Z" w16du:dateUtc="2024-11-09T12:09:00Z">
               <w:r>
                 <w:rPr>
                   <w:rFonts w:ascii="Corbel" w:hAnsi="Corbel"/>
@@ -9881,7 +9881,7 @@
         <w:tc>
           <w:tcPr>
             <w:tcW w:w="6563" w:type="dxa"/>
-            <w:tcPrChange w:id="169" w:author="Damian Struk" w:date="2024-11-09T13:09:00Z" w16du:dateUtc="2024-11-09T12:09:00Z">
+            <w:tcPrChange w:id="169" w:author="stella" w:date="2024-11-09T13:09:00Z" w16du:dateUtc="2024-11-09T12:09:00Z">
               <w:tcPr>
                 <w:tcW w:w="6563" w:type="dxa"/>
               </w:tcPr>
@@ -9902,7 +9902,7 @@
             </w:pPr>
             <w:bookmarkStart w:id="170" w:name="_Ref417035563"/>
             <w:bookmarkStart w:id="171" w:name="_Ref417035565"/>
-            <w:ins w:id="172" w:author="Damian Struk" w:date="2024-11-09T13:09:00Z" w16du:dateUtc="2024-11-09T12:09:00Z">
+            <w:ins w:id="172" w:author="stella" w:date="2024-11-09T13:09:00Z" w16du:dateUtc="2024-11-09T12:09:00Z">
               <w:r>
                 <w:rPr>
                   <w:rFonts w:ascii="Corbel" w:hAnsi="Corbel"/>
@@ -9998,7 +9998,7 @@
                 <w:color w:val="575757"/>
               </w:rPr>
             </w:r>
-            <w:ins w:id="173" w:author="Damian Struk" w:date="2024-11-09T13:09:00Z" w16du:dateUtc="2024-11-09T12:09:00Z">
+            <w:ins w:id="173" w:author="stella" w:date="2024-11-09T13:09:00Z" w16du:dateUtc="2024-11-09T12:09:00Z">
               <w:r>
                 <w:rPr>
                   <w:rFonts w:ascii="Corbel" w:hAnsi="Corbel"/>
@@ -10030,7 +10030,7 @@
                 <w:t>.</w:t>
               </w:r>
             </w:ins>
-            <w:del w:id="174" w:author="Damian Struk" w:date="2024-11-09T13:09:00Z" w16du:dateUtc="2024-11-09T12:09:00Z">
+            <w:del w:id="174" w:author="stella" w:date="2024-11-09T13:09:00Z" w16du:dateUtc="2024-11-09T12:09:00Z">
               <w:r>
                 <w:rPr>
                   <w:rFonts w:ascii="Corbel" w:hAnsi="Corbel"/>
@@ -10103,7 +10103,7 @@
           <w:tblW w:w="9498" w:type="dxa"/>
           <w:tblInd w:w="567" w:type="dxa"/>
           <w:tblLayout w:type="fixed"/>
-          <w:tblPrExChange w:id="175" w:author="Damian Struk" w:date="2024-11-09T13:09:00Z" w16du:dateUtc="2024-11-09T12:09:00Z">
+          <w:tblPrExChange w:id="175" w:author="stella" w:date="2024-11-09T13:09:00Z" w16du:dateUtc="2024-11-09T12:09:00Z">
             <w:tblPrEx>
               <w:tblW w:w="9498" w:type="dxa"/>
               <w:tblInd w:w="567" w:type="dxa"/>
@@ -10114,7 +10114,7 @@
         <w:tc>
           <w:tcPr>
             <w:tcW w:w="709" w:type="dxa"/>
-            <w:tcPrChange w:id="176" w:author="Damian Struk" w:date="2024-11-09T13:09:00Z" w16du:dateUtc="2024-11-09T12:09:00Z">
+            <w:tcPrChange w:id="176" w:author="stella" w:date="2024-11-09T13:09:00Z" w16du:dateUtc="2024-11-09T12:09:00Z">
               <w:tcPr>
                 <w:tcW w:w="709" w:type="dxa"/>
               </w:tcPr>
@@ -10144,7 +10144,7 @@
         <w:tc>
           <w:tcPr>
             <w:tcW w:w="2226" w:type="dxa"/>
-            <w:tcPrChange w:id="178" w:author="Damian Struk" w:date="2024-11-09T13:09:00Z" w16du:dateUtc="2024-11-09T12:09:00Z">
+            <w:tcPrChange w:id="178" w:author="stella" w:date="2024-11-09T13:09:00Z" w16du:dateUtc="2024-11-09T12:09:00Z">
               <w:tcPr>
                 <w:tcW w:w="2226" w:type="dxa"/>
               </w:tcPr>
@@ -10164,7 +10164,7 @@
                 <w:lang w:eastAsia="ja-JP"/>
               </w:rPr>
             </w:pPr>
-            <w:ins w:id="179" w:author="Damian Struk" w:date="2024-11-09T13:09:00Z" w16du:dateUtc="2024-11-09T12:09:00Z">
+            <w:ins w:id="179" w:author="stella" w:date="2024-11-09T13:09:00Z" w16du:dateUtc="2024-11-09T12:09:00Z">
               <w:r>
                 <w:rPr>
                   <w:rFonts w:ascii="Corbel" w:hAnsi="Corbel"/>
@@ -10175,7 +10175,7 @@
                 <w:t>Seznam majetku</w:t>
               </w:r>
             </w:ins>
-            <w:del w:id="180" w:author="Damian Struk" w:date="2024-11-09T13:09:00Z" w16du:dateUtc="2024-11-09T12:09:00Z">
+            <w:del w:id="180" w:author="stella" w:date="2024-11-09T13:09:00Z" w16du:dateUtc="2024-11-09T12:09:00Z">
               <w:r>
                 <w:rPr>
                   <w:rFonts w:ascii="Corbel" w:hAnsi="Corbel"/>
@@ -10191,7 +10191,7 @@
         <w:tc>
           <w:tcPr>
             <w:tcW w:w="6563" w:type="dxa"/>
-            <w:tcPrChange w:id="181" w:author="Damian Struk" w:date="2024-11-09T13:09:00Z" w16du:dateUtc="2024-11-09T12:09:00Z">
+            <w:tcPrChange w:id="181" w:author="stella" w:date="2024-11-09T13:09:00Z" w16du:dateUtc="2024-11-09T12:09:00Z">
               <w:tcPr>
                 <w:tcW w:w="6563" w:type="dxa"/>
               </w:tcPr>
@@ -10210,7 +10210,7 @@
                 <w:lang w:eastAsia="ja-JP"/>
               </w:rPr>
             </w:pPr>
-            <w:ins w:id="182" w:author="Damian Struk" w:date="2024-11-09T13:09:00Z" w16du:dateUtc="2024-11-09T12:09:00Z">
+            <w:ins w:id="182" w:author="stella" w:date="2024-11-09T13:09:00Z" w16du:dateUtc="2024-11-09T12:09:00Z">
               <w:r>
                 <w:rPr>
                   <w:rFonts w:ascii="Corbel" w:hAnsi="Corbel"/>
@@ -10250,7 +10250,7 @@
                 </w:rPr>
                 <w:t>/2021 ze dne 15. června 2021, vyhotovený Ing. Pavlem Trčkou,</w:t>
               </w:r>
-              <w:del w:id="183" w:author="Jan Kubica" w:date="2024-11-09T20:28:00Z" w16du:dateUtc="2024-11-09T19:28:00Z">
+              <w:del w:id="183" w:author="stella" w:date="2024-11-09T20:28:00Z" w16du:dateUtc="2024-11-09T19:28:00Z">
                 <w:r>
                   <w:rPr>
                     <w:rFonts w:ascii="Corbel" w:hAnsi="Corbel" w:cs="Corbel"/>
@@ -10268,7 +10268,7 @@
                 <w:t>.</w:t>
               </w:r>
             </w:ins>
-            <w:del w:id="184" w:author="Damian Struk" w:date="2024-11-09T13:09:00Z" w16du:dateUtc="2024-11-09T12:09:00Z">
+            <w:del w:id="184" w:author="stella" w:date="2024-11-09T13:09:00Z" w16du:dateUtc="2024-11-09T12:09:00Z">
               <w:r>
                 <w:rPr>
                   <w:rFonts w:ascii="Corbel" w:hAnsi="Corbel"/>
@@ -10392,7 +10392,7 @@
           <w:tblW w:w="9498" w:type="dxa"/>
           <w:tblInd w:w="567" w:type="dxa"/>
           <w:tblLayout w:type="fixed"/>
-          <w:tblPrExChange w:id="185" w:author="Damian Struk" w:date="2024-11-09T13:09:00Z" w16du:dateUtc="2024-11-09T12:09:00Z">
+          <w:tblPrExChange w:id="185" w:author="stella" w:date="2024-11-09T13:09:00Z" w16du:dateUtc="2024-11-09T12:09:00Z">
             <w:tblPrEx>
               <w:tblW w:w="9498" w:type="dxa"/>
               <w:tblInd w:w="567" w:type="dxa"/>
@@ -10403,7 +10403,7 @@
         <w:tc>
           <w:tcPr>
             <w:tcW w:w="709" w:type="dxa"/>
-            <w:tcPrChange w:id="186" w:author="Damian Struk" w:date="2024-11-09T13:09:00Z" w16du:dateUtc="2024-11-09T12:09:00Z">
+            <w:tcPrChange w:id="186" w:author="stella" w:date="2024-11-09T13:09:00Z" w16du:dateUtc="2024-11-09T12:09:00Z">
               <w:tcPr>
                 <w:tcW w:w="709" w:type="dxa"/>
               </w:tcPr>
@@ -10433,7 +10433,7 @@
         <w:tc>
           <w:tcPr>
             <w:tcW w:w="2226" w:type="dxa"/>
-            <w:tcPrChange w:id="188" w:author="Damian Struk" w:date="2024-11-09T13:09:00Z" w16du:dateUtc="2024-11-09T12:09:00Z">
+            <w:tcPrChange w:id="188" w:author="stella" w:date="2024-11-09T13:09:00Z" w16du:dateUtc="2024-11-09T12:09:00Z">
               <w:tcPr>
                 <w:tcW w:w="2226" w:type="dxa"/>
               </w:tcPr>
@@ -10453,7 +10453,7 @@
                 <w:lang w:eastAsia="ja-JP"/>
               </w:rPr>
             </w:pPr>
-            <w:ins w:id="189" w:author="Damian Struk" w:date="2024-11-09T13:09:00Z" w16du:dateUtc="2024-11-09T12:09:00Z">
+            <w:ins w:id="189" w:author="stella" w:date="2024-11-09T13:09:00Z" w16du:dateUtc="2024-11-09T12:09:00Z">
               <w:r>
                 <w:rPr>
                   <w:rFonts w:ascii="Corbel" w:hAnsi="Corbel"/>
@@ -10464,7 +10464,7 @@
                 <w:t>Seznam smluv</w:t>
               </w:r>
             </w:ins>
-            <w:del w:id="190" w:author="Damian Struk" w:date="2024-11-09T13:09:00Z" w16du:dateUtc="2024-11-09T12:09:00Z">
+            <w:del w:id="190" w:author="stella" w:date="2024-11-09T13:09:00Z" w16du:dateUtc="2024-11-09T12:09:00Z">
               <w:r>
                 <w:rPr>
                   <w:rFonts w:ascii="Corbel" w:hAnsi="Corbel"/>
@@ -10480,7 +10480,7 @@
         <w:tc>
           <w:tcPr>
             <w:tcW w:w="6563" w:type="dxa"/>
-            <w:tcPrChange w:id="191" w:author="Damian Struk" w:date="2024-11-09T13:09:00Z" w16du:dateUtc="2024-11-09T12:09:00Z">
+            <w:tcPrChange w:id="191" w:author="stella" w:date="2024-11-09T13:09:00Z" w16du:dateUtc="2024-11-09T12:09:00Z">
               <w:tcPr>
                 <w:tcW w:w="6563" w:type="dxa"/>
               </w:tcPr>
@@ -10498,7 +10498,7 @@
                 <w:lang w:eastAsia="ja-JP"/>
               </w:rPr>
             </w:pPr>
-            <w:ins w:id="192" w:author="Damian Struk" w:date="2024-11-09T13:09:00Z" w16du:dateUtc="2024-11-09T12:09:00Z">
+            <w:ins w:id="192" w:author="stella" w:date="2024-11-09T13:09:00Z" w16du:dateUtc="2024-11-09T12:09:00Z">
               <w:r>
                 <w:rPr>
                   <w:rFonts w:ascii="Corbel" w:hAnsi="Corbel"/>
@@ -10579,7 +10579,7 @@
                 <w:lang w:eastAsia="ja-JP"/>
               </w:rPr>
             </w:r>
-            <w:ins w:id="193" w:author="Damian Struk" w:date="2024-11-09T13:09:00Z" w16du:dateUtc="2024-11-09T12:09:00Z">
+            <w:ins w:id="193" w:author="stella" w:date="2024-11-09T13:09:00Z" w16du:dateUtc="2024-11-09T12:09:00Z">
               <w:r>
                 <w:rPr>
                   <w:rFonts w:ascii="Corbel" w:hAnsi="Corbel"/>
@@ -10613,7 +10613,7 @@
                 <w:t>.</w:t>
               </w:r>
             </w:ins>
-            <w:del w:id="194" w:author="Damian Struk" w:date="2024-11-09T13:09:00Z" w16du:dateUtc="2024-11-09T12:09:00Z">
+            <w:del w:id="194" w:author="stella" w:date="2024-11-09T13:09:00Z" w16du:dateUtc="2024-11-09T12:09:00Z">
               <w:r>
                 <w:rPr>
                   <w:rFonts w:ascii="Corbel" w:hAnsi="Corbel"/>
@@ -10654,7 +10654,7 @@
           <w:tblW w:w="9498" w:type="dxa"/>
           <w:tblInd w:w="567" w:type="dxa"/>
           <w:tblLayout w:type="fixed"/>
-          <w:tblPrExChange w:id="195" w:author="Damian Struk" w:date="2024-11-09T13:09:00Z" w16du:dateUtc="2024-11-09T12:09:00Z">
+          <w:tblPrExChange w:id="195" w:author="stella" w:date="2024-11-09T13:09:00Z" w16du:dateUtc="2024-11-09T12:09:00Z">
             <w:tblPrEx>
               <w:tblW w:w="9498" w:type="dxa"/>
               <w:tblInd w:w="567" w:type="dxa"/>
@@ -10665,7 +10665,7 @@
         <w:tc>
           <w:tcPr>
             <w:tcW w:w="709" w:type="dxa"/>
-            <w:tcPrChange w:id="196" w:author="Damian Struk" w:date="2024-11-09T13:09:00Z" w16du:dateUtc="2024-11-09T12:09:00Z">
+            <w:tcPrChange w:id="196" w:author="stella" w:date="2024-11-09T13:09:00Z" w16du:dateUtc="2024-11-09T12:09:00Z">
               <w:tcPr>
                 <w:tcW w:w="709" w:type="dxa"/>
               </w:tcPr>
@@ -10695,7 +10695,7 @@
         <w:tc>
           <w:tcPr>
             <w:tcW w:w="2226" w:type="dxa"/>
-            <w:tcPrChange w:id="198" w:author="Damian Struk" w:date="2024-11-09T13:09:00Z" w16du:dateUtc="2024-11-09T12:09:00Z">
+            <w:tcPrChange w:id="198" w:author="stella" w:date="2024-11-09T13:09:00Z" w16du:dateUtc="2024-11-09T12:09:00Z">
               <w:tcPr>
                 <w:tcW w:w="2226" w:type="dxa"/>
               </w:tcPr>
@@ -10715,7 +10715,7 @@
                 <w:lang w:eastAsia="ja-JP"/>
               </w:rPr>
             </w:pPr>
-            <w:ins w:id="199" w:author="Damian Struk" w:date="2024-11-09T13:09:00Z" w16du:dateUtc="2024-11-09T12:09:00Z">
+            <w:ins w:id="199" w:author="stella" w:date="2024-11-09T13:09:00Z" w16du:dateUtc="2024-11-09T12:09:00Z">
               <w:r>
                 <w:rPr>
                   <w:rFonts w:ascii="Corbel" w:hAnsi="Corbel"/>
@@ -10726,7 +10726,7 @@
                 <w:t>Sleva</w:t>
               </w:r>
             </w:ins>
-            <w:del w:id="200" w:author="Damian Struk" w:date="2024-11-09T13:09:00Z" w16du:dateUtc="2024-11-09T12:09:00Z">
+            <w:del w:id="200" w:author="stella" w:date="2024-11-09T13:09:00Z" w16du:dateUtc="2024-11-09T12:09:00Z">
               <w:r>
                 <w:rPr>
                   <w:rFonts w:ascii="Corbel" w:hAnsi="Corbel"/>
@@ -10742,7 +10742,7 @@
         <w:tc>
           <w:tcPr>
             <w:tcW w:w="6563" w:type="dxa"/>
-            <w:tcPrChange w:id="201" w:author="Damian Struk" w:date="2024-11-09T13:09:00Z" w16du:dateUtc="2024-11-09T12:09:00Z">
+            <w:tcPrChange w:id="201" w:author="stella" w:date="2024-11-09T13:09:00Z" w16du:dateUtc="2024-11-09T12:09:00Z">
               <w:tcPr>
                 <w:tcW w:w="6563" w:type="dxa"/>
               </w:tcPr>
@@ -10761,7 +10761,7 @@
                 <w:lang w:eastAsia="ja-JP"/>
               </w:rPr>
             </w:pPr>
-            <w:ins w:id="202" w:author="Damian Struk" w:date="2024-11-09T13:09:00Z" w16du:dateUtc="2024-11-09T12:09:00Z">
+            <w:ins w:id="202" w:author="stella" w:date="2024-11-09T13:09:00Z" w16du:dateUtc="2024-11-09T12:09:00Z">
               <w:r>
                 <w:rPr>
                   <w:rFonts w:ascii="Corbel" w:hAnsi="Corbel"/>
@@ -10802,7 +10802,7 @@
                 <w:lang w:eastAsia="ja-JP"/>
               </w:rPr>
             </w:r>
-            <w:ins w:id="203" w:author="Damian Struk" w:date="2024-11-09T13:09:00Z" w16du:dateUtc="2024-11-09T12:09:00Z">
+            <w:ins w:id="203" w:author="stella" w:date="2024-11-09T13:09:00Z" w16du:dateUtc="2024-11-09T12:09:00Z">
               <w:r>
                 <w:rPr>
                   <w:rFonts w:ascii="Corbel" w:hAnsi="Corbel"/>
@@ -10836,7 +10836,7 @@
                 <w:t>.</w:t>
               </w:r>
             </w:ins>
-            <w:del w:id="204" w:author="Damian Struk" w:date="2024-11-09T13:09:00Z" w16du:dateUtc="2024-11-09T12:09:00Z">
+            <w:del w:id="204" w:author="stella" w:date="2024-11-09T13:09:00Z" w16du:dateUtc="2024-11-09T12:09:00Z">
               <w:r>
                 <w:rPr>
                   <w:rFonts w:ascii="Corbel" w:hAnsi="Corbel"/>
@@ -10957,7 +10957,7 @@
           <w:tblW w:w="9498" w:type="dxa"/>
           <w:tblInd w:w="567" w:type="dxa"/>
           <w:tblLayout w:type="fixed"/>
-          <w:tblPrExChange w:id="205" w:author="Damian Struk" w:date="2024-11-09T13:09:00Z" w16du:dateUtc="2024-11-09T12:09:00Z">
+          <w:tblPrExChange w:id="205" w:author="stella" w:date="2024-11-09T13:09:00Z" w16du:dateUtc="2024-11-09T12:09:00Z">
             <w:tblPrEx>
               <w:tblW w:w="9498" w:type="dxa"/>
               <w:tblInd w:w="567" w:type="dxa"/>
@@ -10968,7 +10968,7 @@
         <w:tc>
           <w:tcPr>
             <w:tcW w:w="709" w:type="dxa"/>
-            <w:tcPrChange w:id="206" w:author="Damian Struk" w:date="2024-11-09T13:09:00Z" w16du:dateUtc="2024-11-09T12:09:00Z">
+            <w:tcPrChange w:id="206" w:author="stella" w:date="2024-11-09T13:09:00Z" w16du:dateUtc="2024-11-09T12:09:00Z">
               <w:tcPr>
                 <w:tcW w:w="709" w:type="dxa"/>
               </w:tcPr>
@@ -10996,7 +10996,7 @@
         <w:tc>
           <w:tcPr>
             <w:tcW w:w="2226" w:type="dxa"/>
-            <w:tcPrChange w:id="207" w:author="Damian Struk" w:date="2024-11-09T13:09:00Z" w16du:dateUtc="2024-11-09T12:09:00Z">
+            <w:tcPrChange w:id="207" w:author="stella" w:date="2024-11-09T13:09:00Z" w16du:dateUtc="2024-11-09T12:09:00Z">
               <w:tcPr>
                 <w:tcW w:w="2226" w:type="dxa"/>
               </w:tcPr>
@@ -11016,7 +11016,7 @@
                 <w:lang w:eastAsia="ja-JP"/>
               </w:rPr>
             </w:pPr>
-            <w:ins w:id="208" w:author="Damian Struk" w:date="2024-11-09T13:09:00Z" w16du:dateUtc="2024-11-09T12:09:00Z">
+            <w:ins w:id="208" w:author="stella" w:date="2024-11-09T13:09:00Z" w16du:dateUtc="2024-11-09T12:09:00Z">
               <w:r>
                 <w:rPr>
                   <w:rFonts w:ascii="Corbel" w:hAnsi="Corbel"/>
@@ -11027,7 +11027,7 @@
                 <w:t>Smlouva</w:t>
               </w:r>
             </w:ins>
-            <w:del w:id="209" w:author="Damian Struk" w:date="2024-11-09T13:09:00Z" w16du:dateUtc="2024-11-09T12:09:00Z">
+            <w:del w:id="209" w:author="stella" w:date="2024-11-09T13:09:00Z" w16du:dateUtc="2024-11-09T12:09:00Z">
               <w:r>
                 <w:rPr>
                   <w:rFonts w:ascii="Corbel" w:hAnsi="Corbel"/>
@@ -11043,7 +11043,7 @@
         <w:tc>
           <w:tcPr>
             <w:tcW w:w="6563" w:type="dxa"/>
-            <w:tcPrChange w:id="210" w:author="Damian Struk" w:date="2024-11-09T13:09:00Z" w16du:dateUtc="2024-11-09T12:09:00Z">
+            <w:tcPrChange w:id="210" w:author="stella" w:date="2024-11-09T13:09:00Z" w16du:dateUtc="2024-11-09T12:09:00Z">
               <w:tcPr>
                 <w:tcW w:w="6563" w:type="dxa"/>
               </w:tcPr>
@@ -11062,7 +11062,7 @@
                 <w:lang w:eastAsia="ja-JP"/>
               </w:rPr>
             </w:pPr>
-            <w:ins w:id="211" w:author="Damian Struk" w:date="2024-11-09T13:09:00Z" w16du:dateUtc="2024-11-09T12:09:00Z">
+            <w:ins w:id="211" w:author="stella" w:date="2024-11-09T13:09:00Z" w16du:dateUtc="2024-11-09T12:09:00Z">
               <w:r>
                 <w:rPr>
                   <w:rFonts w:ascii="Corbel" w:hAnsi="Corbel"/>
@@ -11080,7 +11080,7 @@
                 <w:t xml:space="preserve"> včetně veškerých jejích příloh.</w:t>
               </w:r>
             </w:ins>
-            <w:del w:id="212" w:author="Damian Struk" w:date="2024-11-09T13:09:00Z" w16du:dateUtc="2024-11-09T12:09:00Z">
+            <w:del w:id="212" w:author="stella" w:date="2024-11-09T13:09:00Z" w16du:dateUtc="2024-11-09T12:09:00Z">
               <w:r>
                 <w:rPr>
                   <w:rFonts w:ascii="Corbel" w:hAnsi="Corbel"/>
@@ -11161,7 +11161,7 @@
           <w:tblW w:w="9498" w:type="dxa"/>
           <w:tblInd w:w="567" w:type="dxa"/>
           <w:tblLayout w:type="fixed"/>
-          <w:tblPrExChange w:id="213" w:author="Damian Struk" w:date="2024-11-09T13:09:00Z" w16du:dateUtc="2024-11-09T12:09:00Z">
+          <w:tblPrExChange w:id="213" w:author="stella" w:date="2024-11-09T13:09:00Z" w16du:dateUtc="2024-11-09T12:09:00Z">
             <w:tblPrEx>
               <w:tblW w:w="9498" w:type="dxa"/>
               <w:tblInd w:w="567" w:type="dxa"/>
@@ -11172,7 +11172,7 @@
         <w:tc>
           <w:tcPr>
             <w:tcW w:w="709" w:type="dxa"/>
-            <w:tcPrChange w:id="214" w:author="Damian Struk" w:date="2024-11-09T13:09:00Z" w16du:dateUtc="2024-11-09T12:09:00Z">
+            <w:tcPrChange w:id="214" w:author="stella" w:date="2024-11-09T13:09:00Z" w16du:dateUtc="2024-11-09T12:09:00Z">
               <w:tcPr>
                 <w:tcW w:w="709" w:type="dxa"/>
               </w:tcPr>
@@ -11200,7 +11200,7 @@
         <w:tc>
           <w:tcPr>
             <w:tcW w:w="2226" w:type="dxa"/>
-            <w:tcPrChange w:id="215" w:author="Damian Struk" w:date="2024-11-09T13:09:00Z" w16du:dateUtc="2024-11-09T12:09:00Z">
+            <w:tcPrChange w:id="215" w:author="stella" w:date="2024-11-09T13:09:00Z" w16du:dateUtc="2024-11-09T12:09:00Z">
               <w:tcPr>
                 <w:tcW w:w="2226" w:type="dxa"/>
               </w:tcPr>
@@ -11220,7 +11220,7 @@
                 <w:lang w:eastAsia="ja-JP"/>
               </w:rPr>
             </w:pPr>
-            <w:ins w:id="216" w:author="Damian Struk" w:date="2024-11-09T13:09:00Z" w16du:dateUtc="2024-11-09T12:09:00Z">
+            <w:ins w:id="216" w:author="stella" w:date="2024-11-09T13:09:00Z" w16du:dateUtc="2024-11-09T12:09:00Z">
               <w:r>
                 <w:rPr>
                   <w:rFonts w:ascii="Corbel" w:hAnsi="Corbel"/>
@@ -11240,7 +11240,7 @@
                 <w:t xml:space="preserve"> AGROBIOPLYN</w:t>
               </w:r>
             </w:ins>
-            <w:del w:id="217" w:author="Damian Struk" w:date="2024-11-09T13:09:00Z" w16du:dateUtc="2024-11-09T12:09:00Z">
+            <w:del w:id="217" w:author="stella" w:date="2024-11-09T13:09:00Z" w16du:dateUtc="2024-11-09T12:09:00Z">
               <w:r>
                 <w:rPr>
                   <w:rFonts w:ascii="Corbel" w:hAnsi="Corbel"/>
@@ -11256,7 +11256,7 @@
         <w:tc>
           <w:tcPr>
             <w:tcW w:w="6563" w:type="dxa"/>
-            <w:tcPrChange w:id="218" w:author="Damian Struk" w:date="2024-11-09T13:09:00Z" w16du:dateUtc="2024-11-09T12:09:00Z">
+            <w:tcPrChange w:id="218" w:author="stella" w:date="2024-11-09T13:09:00Z" w16du:dateUtc="2024-11-09T12:09:00Z">
               <w:tcPr>
                 <w:tcW w:w="6563" w:type="dxa"/>
               </w:tcPr>
@@ -11275,7 +11275,7 @@
                 <w:lang w:eastAsia="ja-JP"/>
               </w:rPr>
             </w:pPr>
-            <w:ins w:id="219" w:author="Damian Struk" w:date="2024-11-09T13:09:00Z" w16du:dateUtc="2024-11-09T12:09:00Z">
+            <w:ins w:id="219" w:author="stella" w:date="2024-11-09T13:09:00Z" w16du:dateUtc="2024-11-09T12:09:00Z">
               <w:r>
                 <w:rPr>
                   <w:rFonts w:ascii="Corbel" w:hAnsi="Corbel"/>
@@ -11309,7 +11309,7 @@
                 <w:t>i této Smlouvy.</w:t>
               </w:r>
             </w:ins>
-            <w:del w:id="220" w:author="Damian Struk" w:date="2024-11-09T13:09:00Z" w16du:dateUtc="2024-11-09T12:09:00Z">
+            <w:del w:id="220" w:author="stella" w:date="2024-11-09T13:09:00Z" w16du:dateUtc="2024-11-09T12:09:00Z">
               <w:r>
                 <w:rPr>
                   <w:rFonts w:ascii="Corbel" w:hAnsi="Corbel"/>
@@ -11335,7 +11335,7 @@
           <w:tblW w:w="9498" w:type="dxa"/>
           <w:tblInd w:w="567" w:type="dxa"/>
           <w:tblLayout w:type="fixed"/>
-          <w:tblPrExChange w:id="221" w:author="Damian Struk" w:date="2024-11-09T13:09:00Z" w16du:dateUtc="2024-11-09T12:09:00Z">
+          <w:tblPrExChange w:id="221" w:author="stella" w:date="2024-11-09T13:09:00Z" w16du:dateUtc="2024-11-09T12:09:00Z">
             <w:tblPrEx>
               <w:tblW w:w="9498" w:type="dxa"/>
               <w:tblInd w:w="567" w:type="dxa"/>
@@ -11346,7 +11346,7 @@
         <w:tc>
           <w:tcPr>
             <w:tcW w:w="709" w:type="dxa"/>
-            <w:tcPrChange w:id="222" w:author="Damian Struk" w:date="2024-11-09T13:09:00Z" w16du:dateUtc="2024-11-09T12:09:00Z">
+            <w:tcPrChange w:id="222" w:author="stella" w:date="2024-11-09T13:09:00Z" w16du:dateUtc="2024-11-09T12:09:00Z">
               <w:tcPr>
                 <w:tcW w:w="709" w:type="dxa"/>
               </w:tcPr>
@@ -11374,7 +11374,7 @@
         <w:tc>
           <w:tcPr>
             <w:tcW w:w="2226" w:type="dxa"/>
-            <w:tcPrChange w:id="223" w:author="Damian Struk" w:date="2024-11-09T13:09:00Z" w16du:dateUtc="2024-11-09T12:09:00Z">
+            <w:tcPrChange w:id="223" w:author="stella" w:date="2024-11-09T13:09:00Z" w16du:dateUtc="2024-11-09T12:09:00Z">
               <w:tcPr>
                 <w:tcW w:w="2226" w:type="dxa"/>
               </w:tcPr>
@@ -11394,7 +11394,7 @@
                 <w:lang w:eastAsia="ja-JP"/>
               </w:rPr>
             </w:pPr>
-            <w:ins w:id="224" w:author="Damian Struk" w:date="2024-11-09T13:09:00Z" w16du:dateUtc="2024-11-09T12:09:00Z">
+            <w:ins w:id="224" w:author="stella" w:date="2024-11-09T13:09:00Z" w16du:dateUtc="2024-11-09T12:09:00Z">
               <w:r>
                 <w:rPr>
                   <w:rFonts w:ascii="Corbel" w:hAnsi="Corbel"/>
@@ -11414,7 +11414,7 @@
                 <w:t xml:space="preserve"> RELAKA</w:t>
               </w:r>
             </w:ins>
-            <w:del w:id="225" w:author="Damian Struk" w:date="2024-11-09T13:09:00Z" w16du:dateUtc="2024-11-09T12:09:00Z">
+            <w:del w:id="225" w:author="stella" w:date="2024-11-09T13:09:00Z" w16du:dateUtc="2024-11-09T12:09:00Z">
               <w:r>
                 <w:rPr>
                   <w:rFonts w:ascii="Corbel" w:hAnsi="Corbel"/>
@@ -11439,7 +11439,7 @@
         <w:tc>
           <w:tcPr>
             <w:tcW w:w="6563" w:type="dxa"/>
-            <w:tcPrChange w:id="226" w:author="Damian Struk" w:date="2024-11-09T13:09:00Z" w16du:dateUtc="2024-11-09T12:09:00Z">
+            <w:tcPrChange w:id="226" w:author="stella" w:date="2024-11-09T13:09:00Z" w16du:dateUtc="2024-11-09T12:09:00Z">
               <w:tcPr>
                 <w:tcW w:w="6563" w:type="dxa"/>
               </w:tcPr>
@@ -11458,7 +11458,7 @@
                 <w:lang w:eastAsia="ja-JP"/>
               </w:rPr>
             </w:pPr>
-            <w:ins w:id="227" w:author="Damian Struk" w:date="2024-11-09T13:09:00Z" w16du:dateUtc="2024-11-09T12:09:00Z">
+            <w:ins w:id="227" w:author="stella" w:date="2024-11-09T13:09:00Z" w16du:dateUtc="2024-11-09T12:09:00Z">
               <w:r>
                 <w:rPr>
                   <w:rFonts w:ascii="Corbel" w:hAnsi="Corbel"/>
@@ -11492,7 +11492,7 @@
                 <w:t>i této Smlouvy.</w:t>
               </w:r>
             </w:ins>
-            <w:del w:id="228" w:author="Damian Struk" w:date="2024-11-09T13:09:00Z" w16du:dateUtc="2024-11-09T12:09:00Z">
+            <w:del w:id="228" w:author="stella" w:date="2024-11-09T13:09:00Z" w16du:dateUtc="2024-11-09T12:09:00Z">
               <w:r>
                 <w:rPr>
                   <w:rFonts w:ascii="Corbel" w:hAnsi="Corbel"/>
@@ -11534,7 +11534,7 @@
           <w:tblW w:w="9498" w:type="dxa"/>
           <w:tblInd w:w="567" w:type="dxa"/>
           <w:tblLayout w:type="fixed"/>
-          <w:tblPrExChange w:id="229" w:author="Damian Struk" w:date="2024-11-09T13:09:00Z" w16du:dateUtc="2024-11-09T12:09:00Z">
+          <w:tblPrExChange w:id="229" w:author="stella" w:date="2024-11-09T13:09:00Z" w16du:dateUtc="2024-11-09T12:09:00Z">
             <w:tblPrEx>
               <w:tblW w:w="9498" w:type="dxa"/>
               <w:tblInd w:w="567" w:type="dxa"/>
@@ -11545,7 +11545,7 @@
         <w:tc>
           <w:tcPr>
             <w:tcW w:w="709" w:type="dxa"/>
-            <w:tcPrChange w:id="230" w:author="Damian Struk" w:date="2024-11-09T13:09:00Z" w16du:dateUtc="2024-11-09T12:09:00Z">
+            <w:tcPrChange w:id="230" w:author="stella" w:date="2024-11-09T13:09:00Z" w16du:dateUtc="2024-11-09T12:09:00Z">
               <w:tcPr>
                 <w:tcW w:w="709" w:type="dxa"/>
               </w:tcPr>
@@ -11573,7 +11573,7 @@
         <w:tc>
           <w:tcPr>
             <w:tcW w:w="2226" w:type="dxa"/>
-            <w:tcPrChange w:id="231" w:author="Damian Struk" w:date="2024-11-09T13:09:00Z" w16du:dateUtc="2024-11-09T12:09:00Z">
+            <w:tcPrChange w:id="231" w:author="stella" w:date="2024-11-09T13:09:00Z" w16du:dateUtc="2024-11-09T12:09:00Z">
               <w:tcPr>
                 <w:tcW w:w="2226" w:type="dxa"/>
               </w:tcPr>
@@ -11593,7 +11593,7 @@
                 <w:lang w:eastAsia="ja-JP"/>
               </w:rPr>
             </w:pPr>
-            <w:ins w:id="232" w:author="Damian Struk" w:date="2024-11-09T13:09:00Z" w16du:dateUtc="2024-11-09T12:09:00Z">
+            <w:ins w:id="232" w:author="stella" w:date="2024-11-09T13:09:00Z" w16du:dateUtc="2024-11-09T12:09:00Z">
               <w:r>
                 <w:rPr>
                   <w:rFonts w:ascii="Corbel" w:hAnsi="Corbel"/>
@@ -11604,7 +11604,7 @@
                 <w:t>Společnosti</w:t>
               </w:r>
             </w:ins>
-            <w:del w:id="233" w:author="Damian Struk" w:date="2024-11-09T13:09:00Z" w16du:dateUtc="2024-11-09T12:09:00Z">
+            <w:del w:id="233" w:author="stella" w:date="2024-11-09T13:09:00Z" w16du:dateUtc="2024-11-09T12:09:00Z">
               <w:r>
                 <w:rPr>
                   <w:rFonts w:ascii="Corbel" w:hAnsi="Corbel"/>
@@ -11629,7 +11629,7 @@
         <w:tc>
           <w:tcPr>
             <w:tcW w:w="6563" w:type="dxa"/>
-            <w:tcPrChange w:id="234" w:author="Damian Struk" w:date="2024-11-09T13:09:00Z" w16du:dateUtc="2024-11-09T12:09:00Z">
+            <w:tcPrChange w:id="234" w:author="stella" w:date="2024-11-09T13:09:00Z" w16du:dateUtc="2024-11-09T12:09:00Z">
               <w:tcPr>
                 <w:tcW w:w="6563" w:type="dxa"/>
               </w:tcPr>
@@ -11648,7 +11648,7 @@
                 <w:lang w:eastAsia="ja-JP"/>
               </w:rPr>
             </w:pPr>
-            <w:ins w:id="235" w:author="Damian Struk" w:date="2024-11-09T13:09:00Z" w16du:dateUtc="2024-11-09T12:09:00Z">
+            <w:ins w:id="235" w:author="stella" w:date="2024-11-09T13:09:00Z" w16du:dateUtc="2024-11-09T12:09:00Z">
               <w:r>
                 <w:rPr>
                   <w:rFonts w:ascii="Corbel" w:hAnsi="Corbel"/>
@@ -11658,7 +11658,7 @@
                 <w:t>znamená Společnost AGROBIOPLYN a Společnost RELAKA, resp. kteroukoli z nich, pokud tak vyplývá z kontextu.</w:t>
               </w:r>
             </w:ins>
-            <w:del w:id="236" w:author="Damian Struk" w:date="2024-11-09T13:09:00Z" w16du:dateUtc="2024-11-09T12:09:00Z">
+            <w:del w:id="236" w:author="stella" w:date="2024-11-09T13:09:00Z" w16du:dateUtc="2024-11-09T12:09:00Z">
               <w:r>
                 <w:rPr>
                   <w:rFonts w:ascii="Corbel" w:hAnsi="Corbel"/>
@@ -11700,7 +11700,7 @@
           <w:tblW w:w="9498" w:type="dxa"/>
           <w:tblInd w:w="567" w:type="dxa"/>
           <w:tblLayout w:type="fixed"/>
-          <w:tblPrExChange w:id="237" w:author="Damian Struk" w:date="2024-11-09T13:09:00Z" w16du:dateUtc="2024-11-09T12:09:00Z">
+          <w:tblPrExChange w:id="237" w:author="stella" w:date="2024-11-09T13:09:00Z" w16du:dateUtc="2024-11-09T12:09:00Z">
             <w:tblPrEx>
               <w:tblW w:w="9498" w:type="dxa"/>
               <w:tblInd w:w="567" w:type="dxa"/>
@@ -11711,7 +11711,7 @@
         <w:tc>
           <w:tcPr>
             <w:tcW w:w="709" w:type="dxa"/>
-            <w:tcPrChange w:id="238" w:author="Damian Struk" w:date="2024-11-09T13:09:00Z" w16du:dateUtc="2024-11-09T12:09:00Z">
+            <w:tcPrChange w:id="238" w:author="stella" w:date="2024-11-09T13:09:00Z" w16du:dateUtc="2024-11-09T12:09:00Z">
               <w:tcPr>
                 <w:tcW w:w="709" w:type="dxa"/>
               </w:tcPr>
@@ -11739,7 +11739,7 @@
         <w:tc>
           <w:tcPr>
             <w:tcW w:w="2226" w:type="dxa"/>
-            <w:tcPrChange w:id="239" w:author="Damian Struk" w:date="2024-11-09T13:09:00Z" w16du:dateUtc="2024-11-09T12:09:00Z">
+            <w:tcPrChange w:id="239" w:author="stella" w:date="2024-11-09T13:09:00Z" w16du:dateUtc="2024-11-09T12:09:00Z">
               <w:tcPr>
                 <w:tcW w:w="2226" w:type="dxa"/>
               </w:tcPr>
@@ -11759,7 +11759,7 @@
                 <w:lang w:eastAsia="ja-JP"/>
               </w:rPr>
             </w:pPr>
-            <w:ins w:id="240" w:author="Damian Struk" w:date="2024-11-09T13:09:00Z" w16du:dateUtc="2024-11-09T12:09:00Z">
+            <w:ins w:id="240" w:author="stella" w:date="2024-11-09T13:09:00Z" w16du:dateUtc="2024-11-09T12:09:00Z">
               <w:r>
                 <w:rPr>
                   <w:rFonts w:ascii="Corbel" w:hAnsi="Corbel"/>
@@ -11770,7 +11770,7 @@
                 <w:t>Transakce</w:t>
               </w:r>
             </w:ins>
-            <w:del w:id="241" w:author="Damian Struk" w:date="2024-11-09T13:09:00Z" w16du:dateUtc="2024-11-09T12:09:00Z">
+            <w:del w:id="241" w:author="stella" w:date="2024-11-09T13:09:00Z" w16du:dateUtc="2024-11-09T12:09:00Z">
               <w:r>
                 <w:rPr>
                   <w:rFonts w:ascii="Corbel" w:hAnsi="Corbel"/>
@@ -11786,7 +11786,7 @@
         <w:tc>
           <w:tcPr>
             <w:tcW w:w="6563" w:type="dxa"/>
-            <w:tcPrChange w:id="242" w:author="Damian Struk" w:date="2024-11-09T13:09:00Z" w16du:dateUtc="2024-11-09T12:09:00Z">
+            <w:tcPrChange w:id="242" w:author="stella" w:date="2024-11-09T13:09:00Z" w16du:dateUtc="2024-11-09T12:09:00Z">
               <w:tcPr>
                 <w:tcW w:w="6563" w:type="dxa"/>
               </w:tcPr>
@@ -11805,7 +11805,7 @@
                 <w:lang w:eastAsia="ja-JP"/>
               </w:rPr>
             </w:pPr>
-            <w:ins w:id="243" w:author="Damian Struk" w:date="2024-11-09T13:09:00Z" w16du:dateUtc="2024-11-09T12:09:00Z">
+            <w:ins w:id="243" w:author="stella" w:date="2024-11-09T13:09:00Z" w16du:dateUtc="2024-11-09T12:09:00Z">
               <w:r>
                 <w:rPr>
                   <w:rFonts w:ascii="Corbel" w:hAnsi="Corbel"/>
@@ -11815,7 +11815,7 @@
                 <w:t>znamená transakci zamýšlenou touto Smlouvou, tj. nabytí Podílů a 100% majetkové účasti ve Společnostech Kupujícím a veškeré další dílčí transakce zamýšlené touto Smlouvou společně.</w:t>
               </w:r>
             </w:ins>
-            <w:del w:id="244" w:author="Damian Struk" w:date="2024-11-09T13:09:00Z" w16du:dateUtc="2024-11-09T12:09:00Z">
+            <w:del w:id="244" w:author="stella" w:date="2024-11-09T13:09:00Z" w16du:dateUtc="2024-11-09T12:09:00Z">
               <w:r>
                 <w:rPr>
                   <w:rFonts w:ascii="Corbel" w:hAnsi="Corbel"/>
@@ -11833,7 +11833,7 @@
           <w:tblW w:w="9498" w:type="dxa"/>
           <w:tblInd w:w="567" w:type="dxa"/>
           <w:tblLayout w:type="fixed"/>
-          <w:tblPrExChange w:id="245" w:author="Damian Struk" w:date="2024-11-09T13:09:00Z" w16du:dateUtc="2024-11-09T12:09:00Z">
+          <w:tblPrExChange w:id="245" w:author="stella" w:date="2024-11-09T13:09:00Z" w16du:dateUtc="2024-11-09T12:09:00Z">
             <w:tblPrEx>
               <w:tblW w:w="9498" w:type="dxa"/>
               <w:tblInd w:w="567" w:type="dxa"/>
@@ -11844,7 +11844,7 @@
         <w:tc>
           <w:tcPr>
             <w:tcW w:w="709" w:type="dxa"/>
-            <w:tcPrChange w:id="246" w:author="Damian Struk" w:date="2024-11-09T13:09:00Z" w16du:dateUtc="2024-11-09T12:09:00Z">
+            <w:tcPrChange w:id="246" w:author="stella" w:date="2024-11-09T13:09:00Z" w16du:dateUtc="2024-11-09T12:09:00Z">
               <w:tcPr>
                 <w:tcW w:w="709" w:type="dxa"/>
               </w:tcPr>
@@ -11872,7 +11872,7 @@
         <w:tc>
           <w:tcPr>
             <w:tcW w:w="2226" w:type="dxa"/>
-            <w:tcPrChange w:id="247" w:author="Damian Struk" w:date="2024-11-09T13:09:00Z" w16du:dateUtc="2024-11-09T12:09:00Z">
+            <w:tcPrChange w:id="247" w:author="stella" w:date="2024-11-09T13:09:00Z" w16du:dateUtc="2024-11-09T12:09:00Z">
               <w:tcPr>
                 <w:tcW w:w="2226" w:type="dxa"/>
               </w:tcPr>
@@ -11892,7 +11892,7 @@
                 <w:lang w:eastAsia="ja-JP"/>
               </w:rPr>
             </w:pPr>
-            <w:ins w:id="248" w:author="Damian Struk" w:date="2024-11-09T13:09:00Z" w16du:dateUtc="2024-11-09T12:09:00Z">
+            <w:ins w:id="248" w:author="stella" w:date="2024-11-09T13:09:00Z" w16du:dateUtc="2024-11-09T12:09:00Z">
               <w:r>
                 <w:rPr>
                   <w:rFonts w:ascii="Corbel" w:hAnsi="Corbel"/>
@@ -11930,7 +11930,7 @@
                 <w:t xml:space="preserve"> 1</w:t>
               </w:r>
             </w:ins>
-            <w:del w:id="249" w:author="Damian Struk" w:date="2024-11-09T13:09:00Z" w16du:dateUtc="2024-11-09T12:09:00Z">
+            <w:del w:id="249" w:author="stella" w:date="2024-11-09T13:09:00Z" w16du:dateUtc="2024-11-09T12:09:00Z">
               <w:r>
                 <w:rPr>
                   <w:rFonts w:ascii="Corbel" w:hAnsi="Corbel"/>
@@ -11946,7 +11946,7 @@
         <w:tc>
           <w:tcPr>
             <w:tcW w:w="6563" w:type="dxa"/>
-            <w:tcPrChange w:id="250" w:author="Damian Struk" w:date="2024-11-09T13:09:00Z" w16du:dateUtc="2024-11-09T12:09:00Z">
+            <w:tcPrChange w:id="250" w:author="stella" w:date="2024-11-09T13:09:00Z" w16du:dateUtc="2024-11-09T12:09:00Z">
               <w:tcPr>
                 <w:tcW w:w="6563" w:type="dxa"/>
               </w:tcPr>
@@ -11965,7 +11965,7 @@
                 <w:lang w:eastAsia="ja-JP"/>
               </w:rPr>
             </w:pPr>
-            <w:ins w:id="251" w:author="Damian Struk" w:date="2024-11-09T13:09:00Z" w16du:dateUtc="2024-11-09T12:09:00Z">
+            <w:ins w:id="251" w:author="stella" w:date="2024-11-09T13:09:00Z" w16du:dateUtc="2024-11-09T12:09:00Z">
               <w:r>
                 <w:rPr>
                   <w:rFonts w:ascii="Corbel" w:hAnsi="Corbel"/>
@@ -12033,7 +12033,7 @@
                 <w:t xml:space="preserve"> Bank Czech Republic and Slovakia, a.s.</w:t>
               </w:r>
             </w:ins>
-            <w:del w:id="252" w:author="Damian Struk" w:date="2024-11-09T13:09:00Z" w16du:dateUtc="2024-11-09T12:09:00Z">
+            <w:del w:id="252" w:author="stella" w:date="2024-11-09T13:09:00Z" w16du:dateUtc="2024-11-09T12:09:00Z">
               <w:r>
                 <w:rPr>
                   <w:rFonts w:ascii="Corbel" w:hAnsi="Corbel"/>
@@ -12051,7 +12051,7 @@
           <w:tblW w:w="9498" w:type="dxa"/>
           <w:tblInd w:w="567" w:type="dxa"/>
           <w:tblLayout w:type="fixed"/>
-          <w:tblPrExChange w:id="253" w:author="Damian Struk" w:date="2024-11-09T13:09:00Z" w16du:dateUtc="2024-11-09T12:09:00Z">
+          <w:tblPrExChange w:id="253" w:author="stella" w:date="2024-11-09T13:09:00Z" w16du:dateUtc="2024-11-09T12:09:00Z">
             <w:tblPrEx>
               <w:tblW w:w="9498" w:type="dxa"/>
               <w:tblInd w:w="567" w:type="dxa"/>
@@ -12062,7 +12062,7 @@
         <w:tc>
           <w:tcPr>
             <w:tcW w:w="709" w:type="dxa"/>
-            <w:tcPrChange w:id="254" w:author="Damian Struk" w:date="2024-11-09T13:09:00Z" w16du:dateUtc="2024-11-09T12:09:00Z">
+            <w:tcPrChange w:id="254" w:author="stella" w:date="2024-11-09T13:09:00Z" w16du:dateUtc="2024-11-09T12:09:00Z">
               <w:tcPr>
                 <w:tcW w:w="709" w:type="dxa"/>
               </w:tcPr>
@@ -12090,7 +12090,7 @@
         <w:tc>
           <w:tcPr>
             <w:tcW w:w="2226" w:type="dxa"/>
-            <w:tcPrChange w:id="255" w:author="Damian Struk" w:date="2024-11-09T13:09:00Z" w16du:dateUtc="2024-11-09T12:09:00Z">
+            <w:tcPrChange w:id="255" w:author="stella" w:date="2024-11-09T13:09:00Z" w16du:dateUtc="2024-11-09T12:09:00Z">
               <w:tcPr>
                 <w:tcW w:w="2226" w:type="dxa"/>
               </w:tcPr>
@@ -12110,7 +12110,7 @@
                 <w:lang w:eastAsia="en-US"/>
               </w:rPr>
             </w:pPr>
-            <w:ins w:id="256" w:author="Damian Struk" w:date="2024-11-09T13:09:00Z" w16du:dateUtc="2024-11-09T12:09:00Z">
+            <w:ins w:id="256" w:author="stella" w:date="2024-11-09T13:09:00Z" w16du:dateUtc="2024-11-09T12:09:00Z">
               <w:r>
                 <w:rPr>
                   <w:rFonts w:ascii="Corbel" w:hAnsi="Corbel"/>
@@ -12148,7 +12148,7 @@
                 <w:t xml:space="preserve"> 2</w:t>
               </w:r>
             </w:ins>
-            <w:del w:id="257" w:author="Damian Struk" w:date="2024-11-09T13:09:00Z" w16du:dateUtc="2024-11-09T12:09:00Z">
+            <w:del w:id="257" w:author="stella" w:date="2024-11-09T13:09:00Z" w16du:dateUtc="2024-11-09T12:09:00Z">
               <w:r>
                 <w:rPr>
                   <w:rFonts w:ascii="Corbel" w:hAnsi="Corbel"/>
@@ -12191,7 +12191,7 @@
         <w:tc>
           <w:tcPr>
             <w:tcW w:w="6563" w:type="dxa"/>
-            <w:tcPrChange w:id="258" w:author="Damian Struk" w:date="2024-11-09T13:09:00Z" w16du:dateUtc="2024-11-09T12:09:00Z">
+            <w:tcPrChange w:id="258" w:author="stella" w:date="2024-11-09T13:09:00Z" w16du:dateUtc="2024-11-09T12:09:00Z">
               <w:tcPr>
                 <w:tcW w:w="6563" w:type="dxa"/>
               </w:tcPr>
@@ -12210,7 +12210,7 @@
                 <w:lang w:eastAsia="en-US"/>
               </w:rPr>
             </w:pPr>
-            <w:ins w:id="259" w:author="Damian Struk" w:date="2024-11-09T13:09:00Z" w16du:dateUtc="2024-11-09T12:09:00Z">
+            <w:ins w:id="259" w:author="stella" w:date="2024-11-09T13:09:00Z" w16du:dateUtc="2024-11-09T12:09:00Z">
               <w:r>
                 <w:rPr>
                   <w:rFonts w:ascii="Corbel" w:hAnsi="Corbel"/>
@@ -12235,7 +12235,7 @@
                 <w:t>1506790083/0800, vedený u společnosti Česká spořitelna a.s.</w:t>
               </w:r>
             </w:ins>
-            <w:del w:id="260" w:author="Damian Struk" w:date="2024-11-09T13:09:00Z" w16du:dateUtc="2024-11-09T12:09:00Z">
+            <w:del w:id="260" w:author="stella" w:date="2024-11-09T13:09:00Z" w16du:dateUtc="2024-11-09T12:09:00Z">
               <w:r>
                 <w:rPr>
                   <w:rFonts w:ascii="Corbel" w:hAnsi="Corbel"/>
@@ -12301,7 +12301,7 @@
           <w:tblW w:w="9498" w:type="dxa"/>
           <w:tblInd w:w="567" w:type="dxa"/>
           <w:tblLayout w:type="fixed"/>
-          <w:tblPrExChange w:id="261" w:author="Damian Struk" w:date="2024-11-09T13:09:00Z" w16du:dateUtc="2024-11-09T12:09:00Z">
+          <w:tblPrExChange w:id="261" w:author="stella" w:date="2024-11-09T13:09:00Z" w16du:dateUtc="2024-11-09T12:09:00Z">
             <w:tblPrEx>
               <w:tblW w:w="9498" w:type="dxa"/>
               <w:tblInd w:w="567" w:type="dxa"/>
@@ -12312,7 +12312,7 @@
         <w:tc>
           <w:tcPr>
             <w:tcW w:w="709" w:type="dxa"/>
-            <w:tcPrChange w:id="262" w:author="Damian Struk" w:date="2024-11-09T13:09:00Z" w16du:dateUtc="2024-11-09T12:09:00Z">
+            <w:tcPrChange w:id="262" w:author="stella" w:date="2024-11-09T13:09:00Z" w16du:dateUtc="2024-11-09T12:09:00Z">
               <w:tcPr>
                 <w:tcW w:w="709" w:type="dxa"/>
               </w:tcPr>
@@ -12340,7 +12340,7 @@
         <w:tc>
           <w:tcPr>
             <w:tcW w:w="2226" w:type="dxa"/>
-            <w:tcPrChange w:id="263" w:author="Damian Struk" w:date="2024-11-09T13:09:00Z" w16du:dateUtc="2024-11-09T12:09:00Z">
+            <w:tcPrChange w:id="263" w:author="stella" w:date="2024-11-09T13:09:00Z" w16du:dateUtc="2024-11-09T12:09:00Z">
               <w:tcPr>
                 <w:tcW w:w="2226" w:type="dxa"/>
               </w:tcPr>
@@ -12360,7 +12360,7 @@
                 <w:lang w:eastAsia="en-US"/>
               </w:rPr>
             </w:pPr>
-            <w:ins w:id="264" w:author="Damian Struk" w:date="2024-11-09T13:09:00Z" w16du:dateUtc="2024-11-09T12:09:00Z">
+            <w:ins w:id="264" w:author="stella" w:date="2024-11-09T13:09:00Z" w16du:dateUtc="2024-11-09T12:09:00Z">
               <w:r>
                 <w:rPr>
                   <w:rFonts w:ascii="Corbel" w:hAnsi="Corbel"/>
@@ -12398,7 +12398,7 @@
                 <w:t xml:space="preserve"> 3</w:t>
               </w:r>
             </w:ins>
-            <w:del w:id="265" w:author="Damian Struk" w:date="2024-11-09T13:09:00Z" w16du:dateUtc="2024-11-09T12:09:00Z">
+            <w:del w:id="265" w:author="stella" w:date="2024-11-09T13:09:00Z" w16du:dateUtc="2024-11-09T12:09:00Z">
               <w:r>
                 <w:rPr>
                   <w:rFonts w:ascii="Corbel" w:hAnsi="Corbel"/>
@@ -12441,7 +12441,7 @@
         <w:tc>
           <w:tcPr>
             <w:tcW w:w="6563" w:type="dxa"/>
-            <w:tcPrChange w:id="266" w:author="Damian Struk" w:date="2024-11-09T13:09:00Z" w16du:dateUtc="2024-11-09T12:09:00Z">
+            <w:tcPrChange w:id="266" w:author="stella" w:date="2024-11-09T13:09:00Z" w16du:dateUtc="2024-11-09T12:09:00Z">
               <w:tcPr>
                 <w:tcW w:w="6563" w:type="dxa"/>
               </w:tcPr>
@@ -12460,7 +12460,7 @@
                 <w:lang w:eastAsia="en-US"/>
               </w:rPr>
             </w:pPr>
-            <w:ins w:id="267" w:author="Damian Struk" w:date="2024-11-09T13:09:00Z" w16du:dateUtc="2024-11-09T12:09:00Z">
+            <w:ins w:id="267" w:author="stella" w:date="2024-11-09T13:09:00Z" w16du:dateUtc="2024-11-09T12:09:00Z">
               <w:r>
                 <w:rPr>
                   <w:rFonts w:ascii="Corbel" w:hAnsi="Corbel"/>
@@ -12488,7 +12488,7 @@
                 <w:t xml:space="preserve"> Bank Czech Republic and Slovakia a.s. (úschovní účet).</w:t>
               </w:r>
             </w:ins>
-            <w:del w:id="268" w:author="Damian Struk" w:date="2024-11-09T13:09:00Z" w16du:dateUtc="2024-11-09T12:09:00Z">
+            <w:del w:id="268" w:author="stella" w:date="2024-11-09T13:09:00Z" w16du:dateUtc="2024-11-09T12:09:00Z">
               <w:r>
                 <w:rPr>
                   <w:rFonts w:ascii="Corbel" w:hAnsi="Corbel"/>
@@ -12521,7 +12521,7 @@
           <w:tblW w:w="9498" w:type="dxa"/>
           <w:tblInd w:w="567" w:type="dxa"/>
           <w:tblLayout w:type="fixed"/>
-          <w:tblPrExChange w:id="269" w:author="Damian Struk" w:date="2024-11-09T13:09:00Z" w16du:dateUtc="2024-11-09T12:09:00Z">
+          <w:tblPrExChange w:id="269" w:author="stella" w:date="2024-11-09T13:09:00Z" w16du:dateUtc="2024-11-09T12:09:00Z">
             <w:tblPrEx>
               <w:tblW w:w="9498" w:type="dxa"/>
               <w:tblInd w:w="567" w:type="dxa"/>
@@ -12532,7 +12532,7 @@
         <w:tc>
           <w:tcPr>
             <w:tcW w:w="709" w:type="dxa"/>
-            <w:tcPrChange w:id="270" w:author="Damian Struk" w:date="2024-11-09T13:09:00Z" w16du:dateUtc="2024-11-09T12:09:00Z">
+            <w:tcPrChange w:id="270" w:author="stella" w:date="2024-11-09T13:09:00Z" w16du:dateUtc="2024-11-09T12:09:00Z">
               <w:tcPr>
                 <w:tcW w:w="709" w:type="dxa"/>
               </w:tcPr>
@@ -12560,7 +12560,7 @@
         <w:tc>
           <w:tcPr>
             <w:tcW w:w="2226" w:type="dxa"/>
-            <w:tcPrChange w:id="271" w:author="Damian Struk" w:date="2024-11-09T13:09:00Z" w16du:dateUtc="2024-11-09T12:09:00Z">
+            <w:tcPrChange w:id="271" w:author="stella" w:date="2024-11-09T13:09:00Z" w16du:dateUtc="2024-11-09T12:09:00Z">
               <w:tcPr>
                 <w:tcW w:w="2226" w:type="dxa"/>
               </w:tcPr>
@@ -12580,7 +12580,7 @@
                 <w:lang w:eastAsia="en-US"/>
               </w:rPr>
             </w:pPr>
-            <w:ins w:id="272" w:author="Damian Struk" w:date="2024-11-09T13:09:00Z" w16du:dateUtc="2024-11-09T12:09:00Z">
+            <w:ins w:id="272" w:author="stella" w:date="2024-11-09T13:09:00Z" w16du:dateUtc="2024-11-09T12:09:00Z">
               <w:r>
                 <w:rPr>
                   <w:rFonts w:ascii="Corbel" w:hAnsi="Corbel"/>
@@ -12591,7 +12591,7 @@
                 <w:t>Zákon o obchodních korporacích</w:t>
               </w:r>
             </w:ins>
-            <w:del w:id="273" w:author="Damian Struk" w:date="2024-11-09T13:09:00Z" w16du:dateUtc="2024-11-09T12:09:00Z">
+            <w:del w:id="273" w:author="stella" w:date="2024-11-09T13:09:00Z" w16du:dateUtc="2024-11-09T12:09:00Z">
               <w:r>
                 <w:rPr>
                   <w:rFonts w:ascii="Corbel" w:hAnsi="Corbel"/>
@@ -12634,7 +12634,7 @@
         <w:tc>
           <w:tcPr>
             <w:tcW w:w="6563" w:type="dxa"/>
-            <w:tcPrChange w:id="274" w:author="Damian Struk" w:date="2024-11-09T13:09:00Z" w16du:dateUtc="2024-11-09T12:09:00Z">
+            <w:tcPrChange w:id="274" w:author="stella" w:date="2024-11-09T13:09:00Z" w16du:dateUtc="2024-11-09T12:09:00Z">
               <w:tcPr>
                 <w:tcW w:w="6563" w:type="dxa"/>
               </w:tcPr>
@@ -12653,7 +12653,7 @@
                 <w:lang w:eastAsia="en-US"/>
               </w:rPr>
             </w:pPr>
-            <w:ins w:id="275" w:author="Damian Struk" w:date="2024-11-09T13:09:00Z" w16du:dateUtc="2024-11-09T12:09:00Z">
+            <w:ins w:id="275" w:author="stella" w:date="2024-11-09T13:09:00Z" w16du:dateUtc="2024-11-09T12:09:00Z">
               <w:r>
                 <w:rPr>
                   <w:rFonts w:ascii="Corbel" w:hAnsi="Corbel"/>
@@ -12684,7 +12684,7 @@
                 <w:t>družstvech (zákon o obchodních korporacích), ve znění pozdějších předpisů.</w:t>
               </w:r>
             </w:ins>
-            <w:del w:id="276" w:author="Damian Struk" w:date="2024-11-09T13:09:00Z" w16du:dateUtc="2024-11-09T12:09:00Z">
+            <w:del w:id="276" w:author="stella" w:date="2024-11-09T13:09:00Z" w16du:dateUtc="2024-11-09T12:09:00Z">
               <w:r>
                 <w:rPr>
                   <w:rFonts w:ascii="Corbel" w:hAnsi="Corbel"/>
@@ -12702,7 +12702,7 @@
           <w:tblW w:w="9498" w:type="dxa"/>
           <w:tblInd w:w="567" w:type="dxa"/>
           <w:tblLayout w:type="fixed"/>
-          <w:tblPrExChange w:id="277" w:author="Damian Struk" w:date="2024-11-09T13:09:00Z" w16du:dateUtc="2024-11-09T12:09:00Z">
+          <w:tblPrExChange w:id="277" w:author="stella" w:date="2024-11-09T13:09:00Z" w16du:dateUtc="2024-11-09T12:09:00Z">
             <w:tblPrEx>
               <w:tblW w:w="9498" w:type="dxa"/>
               <w:tblInd w:w="567" w:type="dxa"/>
@@ -12713,7 +12713,7 @@
         <w:tc>
           <w:tcPr>
             <w:tcW w:w="709" w:type="dxa"/>
-            <w:tcPrChange w:id="278" w:author="Damian Struk" w:date="2024-11-09T13:09:00Z" w16du:dateUtc="2024-11-09T12:09:00Z">
+            <w:tcPrChange w:id="278" w:author="stella" w:date="2024-11-09T13:09:00Z" w16du:dateUtc="2024-11-09T12:09:00Z">
               <w:tcPr>
                 <w:tcW w:w="709" w:type="dxa"/>
               </w:tcPr>
@@ -12741,7 +12741,7 @@
         <w:tc>
           <w:tcPr>
             <w:tcW w:w="2226" w:type="dxa"/>
-            <w:tcPrChange w:id="279" w:author="Damian Struk" w:date="2024-11-09T13:09:00Z" w16du:dateUtc="2024-11-09T12:09:00Z">
+            <w:tcPrChange w:id="279" w:author="stella" w:date="2024-11-09T13:09:00Z" w16du:dateUtc="2024-11-09T12:09:00Z">
               <w:tcPr>
                 <w:tcW w:w="2226" w:type="dxa"/>
               </w:tcPr>
@@ -12761,7 +12761,7 @@
                 <w:lang w:eastAsia="ja-JP"/>
               </w:rPr>
             </w:pPr>
-            <w:ins w:id="280" w:author="Damian Struk" w:date="2024-11-09T13:09:00Z" w16du:dateUtc="2024-11-09T12:09:00Z">
+            <w:ins w:id="280" w:author="stella" w:date="2024-11-09T13:09:00Z" w16du:dateUtc="2024-11-09T12:09:00Z">
               <w:r>
                 <w:rPr>
                   <w:rFonts w:ascii="Corbel" w:hAnsi="Corbel"/>
@@ -12772,7 +12772,7 @@
                 <w:t>Zákon o registru smluv</w:t>
               </w:r>
             </w:ins>
-            <w:del w:id="281" w:author="Damian Struk" w:date="2024-11-09T13:09:00Z" w16du:dateUtc="2024-11-09T12:09:00Z">
+            <w:del w:id="281" w:author="stella" w:date="2024-11-09T13:09:00Z" w16du:dateUtc="2024-11-09T12:09:00Z">
               <w:r>
                 <w:rPr>
                   <w:rFonts w:ascii="Corbel" w:hAnsi="Corbel"/>
@@ -12788,7 +12788,7 @@
         <w:tc>
           <w:tcPr>
             <w:tcW w:w="6563" w:type="dxa"/>
-            <w:tcPrChange w:id="282" w:author="Damian Struk" w:date="2024-11-09T13:09:00Z" w16du:dateUtc="2024-11-09T12:09:00Z">
+            <w:tcPrChange w:id="282" w:author="stella" w:date="2024-11-09T13:09:00Z" w16du:dateUtc="2024-11-09T12:09:00Z">
               <w:tcPr>
                 <w:tcW w:w="6563" w:type="dxa"/>
               </w:tcPr>
@@ -12807,7 +12807,7 @@
                 <w:lang w:eastAsia="ja-JP"/>
               </w:rPr>
             </w:pPr>
-            <w:ins w:id="283" w:author="Damian Struk" w:date="2024-11-09T13:09:00Z" w16du:dateUtc="2024-11-09T12:09:00Z">
+            <w:ins w:id="283" w:author="stella" w:date="2024-11-09T13:09:00Z" w16du:dateUtc="2024-11-09T12:09:00Z">
               <w:r>
                 <w:rPr>
                   <w:rFonts w:ascii="Corbel" w:hAnsi="Corbel"/>
@@ -12833,7 +12833,7 @@
                 <w:t>.</w:t>
               </w:r>
             </w:ins>
-            <w:del w:id="284" w:author="Damian Struk" w:date="2024-11-09T13:09:00Z" w16du:dateUtc="2024-11-09T12:09:00Z">
+            <w:del w:id="284" w:author="stella" w:date="2024-11-09T13:09:00Z" w16du:dateUtc="2024-11-09T12:09:00Z">
               <w:r>
                 <w:rPr>
                   <w:rFonts w:ascii="Corbel" w:hAnsi="Corbel"/>
@@ -12872,7 +12872,7 @@
           <w:tblW w:w="9498" w:type="dxa"/>
           <w:tblInd w:w="567" w:type="dxa"/>
           <w:tblLayout w:type="fixed"/>
-          <w:tblPrExChange w:id="285" w:author="Damian Struk" w:date="2024-11-09T13:09:00Z" w16du:dateUtc="2024-11-09T12:09:00Z">
+          <w:tblPrExChange w:id="285" w:author="stella" w:date="2024-11-09T13:09:00Z" w16du:dateUtc="2024-11-09T12:09:00Z">
             <w:tblPrEx>
               <w:tblW w:w="9498" w:type="dxa"/>
               <w:tblInd w:w="567" w:type="dxa"/>
@@ -12883,7 +12883,7 @@
         <w:tc>
           <w:tcPr>
             <w:tcW w:w="709" w:type="dxa"/>
-            <w:tcPrChange w:id="286" w:author="Damian Struk" w:date="2024-11-09T13:09:00Z" w16du:dateUtc="2024-11-09T12:09:00Z">
+            <w:tcPrChange w:id="286" w:author="stella" w:date="2024-11-09T13:09:00Z" w16du:dateUtc="2024-11-09T12:09:00Z">
               <w:tcPr>
                 <w:tcW w:w="709" w:type="dxa"/>
               </w:tcPr>
@@ -12911,7 +12911,7 @@
         <w:tc>
           <w:tcPr>
             <w:tcW w:w="2226" w:type="dxa"/>
-            <w:tcPrChange w:id="287" w:author="Damian Struk" w:date="2024-11-09T13:09:00Z" w16du:dateUtc="2024-11-09T12:09:00Z">
+            <w:tcPrChange w:id="287" w:author="stella" w:date="2024-11-09T13:09:00Z" w16du:dateUtc="2024-11-09T12:09:00Z">
               <w:tcPr>
                 <w:tcW w:w="2226" w:type="dxa"/>
               </w:tcPr>
@@ -12931,7 +12931,7 @@
                 <w:lang w:eastAsia="ja-JP"/>
               </w:rPr>
             </w:pPr>
-            <w:ins w:id="288" w:author="Damian Struk" w:date="2024-11-09T13:09:00Z" w16du:dateUtc="2024-11-09T12:09:00Z">
+            <w:ins w:id="288" w:author="stella" w:date="2024-11-09T13:09:00Z" w16du:dateUtc="2024-11-09T12:09:00Z">
               <w:r>
                 <w:rPr>
                   <w:rFonts w:ascii="Corbel" w:hAnsi="Corbel"/>
@@ -12942,7 +12942,7 @@
                 <w:t>Zákon o veřejných rejstřících</w:t>
               </w:r>
             </w:ins>
-            <w:del w:id="289" w:author="Damian Struk" w:date="2024-11-09T13:09:00Z" w16du:dateUtc="2024-11-09T12:09:00Z">
+            <w:del w:id="289" w:author="stella" w:date="2024-11-09T13:09:00Z" w16du:dateUtc="2024-11-09T12:09:00Z">
               <w:r>
                 <w:rPr>
                   <w:rFonts w:ascii="Corbel" w:hAnsi="Corbel"/>
@@ -12958,7 +12958,7 @@
         <w:tc>
           <w:tcPr>
             <w:tcW w:w="6563" w:type="dxa"/>
-            <w:tcPrChange w:id="290" w:author="Damian Struk" w:date="2024-11-09T13:09:00Z" w16du:dateUtc="2024-11-09T12:09:00Z">
+            <w:tcPrChange w:id="290" w:author="stella" w:date="2024-11-09T13:09:00Z" w16du:dateUtc="2024-11-09T12:09:00Z">
               <w:tcPr>
                 <w:tcW w:w="6563" w:type="dxa"/>
               </w:tcPr>
@@ -12977,7 +12977,7 @@
                 <w:lang w:eastAsia="ja-JP"/>
               </w:rPr>
             </w:pPr>
-            <w:ins w:id="291" w:author="Damian Struk" w:date="2024-11-09T13:09:00Z" w16du:dateUtc="2024-11-09T12:09:00Z">
+            <w:ins w:id="291" w:author="stella" w:date="2024-11-09T13:09:00Z" w16du:dateUtc="2024-11-09T12:09:00Z">
               <w:r>
                 <w:rPr>
                   <w:rFonts w:ascii="Corbel" w:hAnsi="Corbel"/>
@@ -13019,7 +13019,7 @@
                 <w:t>, ve znění pozdějších předpisů.</w:t>
               </w:r>
             </w:ins>
-            <w:del w:id="292" w:author="Damian Struk" w:date="2024-11-09T13:09:00Z" w16du:dateUtc="2024-11-09T12:09:00Z">
+            <w:del w:id="292" w:author="stella" w:date="2024-11-09T13:09:00Z" w16du:dateUtc="2024-11-09T12:09:00Z">
               <w:r>
                 <w:rPr>
                   <w:rFonts w:ascii="Corbel" w:hAnsi="Corbel"/>
@@ -13053,7 +13053,7 @@
           <w:tblW w:w="9498" w:type="dxa"/>
           <w:tblInd w:w="567" w:type="dxa"/>
           <w:tblLayout w:type="fixed"/>
-          <w:tblPrExChange w:id="293" w:author="Damian Struk" w:date="2024-11-09T13:09:00Z" w16du:dateUtc="2024-11-09T12:09:00Z">
+          <w:tblPrExChange w:id="293" w:author="stella" w:date="2024-11-09T13:09:00Z" w16du:dateUtc="2024-11-09T12:09:00Z">
             <w:tblPrEx>
               <w:tblW w:w="9498" w:type="dxa"/>
               <w:tblInd w:w="567" w:type="dxa"/>
@@ -13064,7 +13064,7 @@
         <w:tc>
           <w:tcPr>
             <w:tcW w:w="709" w:type="dxa"/>
-            <w:tcPrChange w:id="294" w:author="Damian Struk" w:date="2024-11-09T13:09:00Z" w16du:dateUtc="2024-11-09T12:09:00Z">
+            <w:tcPrChange w:id="294" w:author="stella" w:date="2024-11-09T13:09:00Z" w16du:dateUtc="2024-11-09T12:09:00Z">
               <w:tcPr>
                 <w:tcW w:w="709" w:type="dxa"/>
               </w:tcPr>
@@ -13092,7 +13092,7 @@
         <w:tc>
           <w:tcPr>
             <w:tcW w:w="2226" w:type="dxa"/>
-            <w:tcPrChange w:id="295" w:author="Damian Struk" w:date="2024-11-09T13:09:00Z" w16du:dateUtc="2024-11-09T12:09:00Z">
+            <w:tcPrChange w:id="295" w:author="stella" w:date="2024-11-09T13:09:00Z" w16du:dateUtc="2024-11-09T12:09:00Z">
               <w:tcPr>
                 <w:tcW w:w="2226" w:type="dxa"/>
               </w:tcPr>
@@ -13112,7 +13112,7 @@
                 <w:lang w:eastAsia="ja-JP"/>
               </w:rPr>
             </w:pPr>
-            <w:ins w:id="296" w:author="Damian Struk" w:date="2024-11-09T13:09:00Z" w16du:dateUtc="2024-11-09T12:09:00Z">
+            <w:ins w:id="296" w:author="stella" w:date="2024-11-09T13:09:00Z" w16du:dateUtc="2024-11-09T12:09:00Z">
               <w:r>
                 <w:rPr>
                   <w:rFonts w:ascii="Corbel" w:hAnsi="Corbel"/>
@@ -13123,7 +13123,7 @@
                 <w:t>Záruky</w:t>
               </w:r>
             </w:ins>
-            <w:del w:id="297" w:author="Damian Struk" w:date="2024-11-09T13:09:00Z" w16du:dateUtc="2024-11-09T12:09:00Z">
+            <w:del w:id="297" w:author="stella" w:date="2024-11-09T13:09:00Z" w16du:dateUtc="2024-11-09T12:09:00Z">
               <w:r>
                 <w:rPr>
                   <w:rFonts w:ascii="Corbel" w:hAnsi="Corbel"/>
@@ -13139,7 +13139,7 @@
         <w:tc>
           <w:tcPr>
             <w:tcW w:w="6563" w:type="dxa"/>
-            <w:tcPrChange w:id="298" w:author="Damian Struk" w:date="2024-11-09T13:09:00Z" w16du:dateUtc="2024-11-09T12:09:00Z">
+            <w:tcPrChange w:id="298" w:author="stella" w:date="2024-11-09T13:09:00Z" w16du:dateUtc="2024-11-09T12:09:00Z">
               <w:tcPr>
                 <w:tcW w:w="6563" w:type="dxa"/>
               </w:tcPr>
@@ -13158,7 +13158,7 @@
                 <w:lang w:eastAsia="ja-JP"/>
               </w:rPr>
             </w:pPr>
-            <w:ins w:id="299" w:author="Damian Struk" w:date="2024-11-09T13:09:00Z" w16du:dateUtc="2024-11-09T12:09:00Z">
+            <w:ins w:id="299" w:author="stella" w:date="2024-11-09T13:09:00Z" w16du:dateUtc="2024-11-09T12:09:00Z">
               <w:r>
                 <w:rPr>
                   <w:rFonts w:ascii="Corbel" w:hAnsi="Corbel"/>
@@ -13199,7 +13199,7 @@
                 <w:lang w:eastAsia="ja-JP"/>
               </w:rPr>
             </w:r>
-            <w:ins w:id="300" w:author="Damian Struk" w:date="2024-11-09T13:09:00Z" w16du:dateUtc="2024-11-09T12:09:00Z">
+            <w:ins w:id="300" w:author="stella" w:date="2024-11-09T13:09:00Z" w16du:dateUtc="2024-11-09T12:09:00Z">
               <w:r>
                 <w:rPr>
                   <w:rFonts w:ascii="Corbel" w:hAnsi="Corbel"/>
@@ -13233,7 +13233,7 @@
                 <w:t xml:space="preserve">. </w:t>
               </w:r>
             </w:ins>
-            <w:del w:id="301" w:author="Damian Struk" w:date="2024-11-09T13:09:00Z" w16du:dateUtc="2024-11-09T12:09:00Z">
+            <w:del w:id="301" w:author="stella" w:date="2024-11-09T13:09:00Z" w16du:dateUtc="2024-11-09T12:09:00Z">
               <w:r>
                 <w:rPr>
                   <w:rFonts w:ascii="Corbel" w:hAnsi="Corbel"/>
@@ -13283,7 +13283,7 @@
           <w:tblW w:w="9498" w:type="dxa"/>
           <w:tblInd w:w="567" w:type="dxa"/>
           <w:tblLayout w:type="fixed"/>
-          <w:tblPrExChange w:id="302" w:author="Damian Struk" w:date="2024-11-09T13:09:00Z" w16du:dateUtc="2024-11-09T12:09:00Z">
+          <w:tblPrExChange w:id="302" w:author="stella" w:date="2024-11-09T13:09:00Z" w16du:dateUtc="2024-11-09T12:09:00Z">
             <w:tblPrEx>
               <w:tblW w:w="9498" w:type="dxa"/>
               <w:tblInd w:w="567" w:type="dxa"/>
@@ -13294,7 +13294,7 @@
         <w:tc>
           <w:tcPr>
             <w:tcW w:w="709" w:type="dxa"/>
-            <w:tcPrChange w:id="303" w:author="Damian Struk" w:date="2024-11-09T13:09:00Z" w16du:dateUtc="2024-11-09T12:09:00Z">
+            <w:tcPrChange w:id="303" w:author="stella" w:date="2024-11-09T13:09:00Z" w16du:dateUtc="2024-11-09T12:09:00Z">
               <w:tcPr>
                 <w:tcW w:w="709" w:type="dxa"/>
               </w:tcPr>
@@ -13322,7 +13322,7 @@
         <w:tc>
           <w:tcPr>
             <w:tcW w:w="2226" w:type="dxa"/>
-            <w:tcPrChange w:id="304" w:author="Damian Struk" w:date="2024-11-09T13:09:00Z" w16du:dateUtc="2024-11-09T12:09:00Z">
+            <w:tcPrChange w:id="304" w:author="stella" w:date="2024-11-09T13:09:00Z" w16du:dateUtc="2024-11-09T12:09:00Z">
               <w:tcPr>
                 <w:tcW w:w="2226" w:type="dxa"/>
               </w:tcPr>
@@ -13342,7 +13342,7 @@
                 <w:lang w:eastAsia="ja-JP"/>
               </w:rPr>
             </w:pPr>
-            <w:del w:id="305" w:author="Damian Struk" w:date="2024-11-09T13:09:00Z" w16du:dateUtc="2024-11-09T12:09:00Z">
+            <w:del w:id="305" w:author="stella" w:date="2024-11-09T13:09:00Z" w16du:dateUtc="2024-11-09T12:09:00Z">
               <w:r>
                 <w:rPr>
                   <w:rFonts w:ascii="Corbel" w:hAnsi="Corbel"/>
@@ -13358,7 +13358,7 @@
         <w:tc>
           <w:tcPr>
             <w:tcW w:w="6563" w:type="dxa"/>
-            <w:tcPrChange w:id="306" w:author="Damian Struk" w:date="2024-11-09T13:09:00Z" w16du:dateUtc="2024-11-09T12:09:00Z">
+            <w:tcPrChange w:id="306" w:author="stella" w:date="2024-11-09T13:09:00Z" w16du:dateUtc="2024-11-09T12:09:00Z">
               <w:tcPr>
                 <w:tcW w:w="6563" w:type="dxa"/>
               </w:tcPr>
@@ -13377,7 +13377,7 @@
                 <w:lang w:eastAsia="ja-JP"/>
               </w:rPr>
             </w:pPr>
-            <w:del w:id="307" w:author="Damian Struk" w:date="2024-11-09T13:09:00Z" w16du:dateUtc="2024-11-09T12:09:00Z">
+            <w:del w:id="307" w:author="stella" w:date="2024-11-09T13:09:00Z" w16du:dateUtc="2024-11-09T12:09:00Z">
               <w:r>
                 <w:rPr>
                   <w:rFonts w:ascii="Corbel" w:hAnsi="Corbel"/>
@@ -21761,10 +21761,10 @@
           <w:numId w:val="7"/>
         </w:numPr>
         <w:rPr>
-          <w:del w:id="359" w:author="Damian Struk" w:date="2024-11-09T13:09:00Z" w16du:dateUtc="2024-11-09T12:09:00Z"/>
-        </w:rPr>
-      </w:pPr>
-      <w:del w:id="360" w:author="Damian Struk" w:date="2024-11-09T13:09:00Z" w16du:dateUtc="2024-11-09T12:09:00Z">
+          <w:del w:id="359" w:author="stella" w:date="2024-11-09T13:09:00Z" w16du:dateUtc="2024-11-09T12:09:00Z"/>
+        </w:rPr>
+      </w:pPr>
+      <w:del w:id="360" w:author="stella" w:date="2024-11-09T13:09:00Z" w16du:dateUtc="2024-11-09T12:09:00Z">
         <w:r>
           <w:delText>částk</w:delText>
         </w:r>
@@ -21790,14 +21790,14 @@
         <w:pStyle w:val="Heading3"/>
         <w:widowControl w:val="0"/>
         <w:rPr>
-          <w:del w:id="361" w:author="Damian Struk" w:date="2024-11-09T13:09:00Z" w16du:dateUtc="2024-11-09T12:09:00Z"/>
-          <w:rFonts w:ascii="Corbel" w:hAnsi="Corbel"/>
-          <w:color w:val="575757"/>
-          <w:sz w:val="22"/>
-          <w:szCs w:val="22"/>
-        </w:rPr>
-      </w:pPr>
-      <w:del w:id="362" w:author="Damian Struk" w:date="2024-11-09T13:09:00Z" w16du:dateUtc="2024-11-09T12:09:00Z">
+          <w:del w:id="361" w:author="stella" w:date="2024-11-09T13:09:00Z" w16du:dateUtc="2024-11-09T12:09:00Z"/>
+          <w:rFonts w:ascii="Corbel" w:hAnsi="Corbel"/>
+          <w:color w:val="575757"/>
+          <w:sz w:val="22"/>
+          <w:szCs w:val="22"/>
+        </w:rPr>
+      </w:pPr>
+      <w:del w:id="362" w:author="stella" w:date="2024-11-09T13:09:00Z" w16du:dateUtc="2024-11-09T12:09:00Z">
         <w:r>
           <w:rPr>
             <w:rFonts w:ascii="Corbel" w:hAnsi="Corbel"/>
@@ -29560,14 +29560,14 @@
         <w:pStyle w:val="Heading3"/>
         <w:widowControl w:val="0"/>
         <w:rPr>
-          <w:del w:id="416" w:author="Damian Struk" w:date="2024-11-09T13:09:00Z" w16du:dateUtc="2024-11-09T12:09:00Z"/>
-          <w:rFonts w:ascii="Corbel" w:hAnsi="Corbel"/>
-          <w:color w:val="575757"/>
-          <w:sz w:val="22"/>
-          <w:szCs w:val="22"/>
-        </w:rPr>
-      </w:pPr>
-      <w:del w:id="417" w:author="Damian Struk" w:date="2024-11-09T13:09:00Z" w16du:dateUtc="2024-11-09T12:09:00Z">
+          <w:del w:id="416" w:author="stella" w:date="2024-11-09T13:09:00Z" w16du:dateUtc="2024-11-09T12:09:00Z"/>
+          <w:rFonts w:ascii="Corbel" w:hAnsi="Corbel"/>
+          <w:color w:val="575757"/>
+          <w:sz w:val="22"/>
+          <w:szCs w:val="22"/>
+        </w:rPr>
+      </w:pPr>
+      <w:del w:id="417" w:author="stella" w:date="2024-11-09T13:09:00Z" w16du:dateUtc="2024-11-09T12:09:00Z">
         <w:r>
           <w:rPr>
             <w:rFonts w:ascii="Corbel" w:hAnsi="Corbel"/>
@@ -34555,7 +34555,7 @@
         </w:rPr>
         <w:t xml:space="preserve">Rámcová smlouva o poskytování platebních služeb s Fio banka a.s. </w:t>
       </w:r>
-      <w:del w:id="418" w:author="Jan Kubica" w:date="2024-11-09T20:28:00Z" w16du:dateUtc="2024-11-09T19:28:00Z">
+      <w:del w:id="418" w:author="stella" w:date="2024-11-09T20:28:00Z" w16du:dateUtc="2024-11-09T19:28:00Z">
         <w:r>
           <w:rPr>
             <w:rFonts w:ascii="Corbel" w:hAnsi="Corbel"/>
@@ -47657,11 +47657,11 @@
 
 <file path=word/people.xml><?xml version="1.0" encoding="utf-8"?>
 <w15:people xmlns:wpc="http://schemas.microsoft.com/office/word/2010/wordprocessingCanvas" xmlns:cx="http://schemas.microsoft.com/office/drawing/2014/chartex" xmlns:cx1="http://schemas.microsoft.com/office/drawing/2015/9/8/chartex" xmlns:cx2="http://schemas.microsoft.com/office/drawing/2015/10/21/chartex" xmlns:cx3="http://schemas.microsoft.com/office/drawing/2016/5/9/chartex" xmlns:cx4="http://schemas.microsoft.com/office/drawing/2016/5/10/chartex" xmlns:cx5="http://schemas.microsoft.com/office/drawing/2016/5/11/chartex" xmlns:cx6="http://schemas.microsoft.com/office/drawing/2016/5/12/chartex" xmlns:cx7="http://schemas.microsoft.com/office/drawing/2016/5/13/chartex" xmlns:cx8="http://schemas.microsoft.com/office/drawing/2016/5/14/chartex" xmlns:mc="http://schemas.openxmlformats.org/markup-compatibility/2006" xmlns:aink="http://schemas.microsoft.com/office/drawing/2016/ink" xmlns:am3d="http://schemas.microsoft.com/office/drawing/2017/model3d" xmlns:o="urn:schemas-microsoft-com:office:office" xmlns:oel="http://schemas.microsoft.com/office/2019/extlst" xmlns:r="http://schemas.openxmlformats.org/officeDocument/2006/relationships" xmlns:m="http://schemas.openxmlformats.org/officeDocument/2006/math" xmlns:v="urn:schemas-microsoft-com:vml" xmlns:wp14="http://schemas.microsoft.com/office/word/2010/wordprocessingDrawing" xmlns:wp="http://schemas.openxmlformats.org/drawingml/2006/wordprocessingDrawing" xmlns:w10="urn:schemas-microsoft-com:office:word" xmlns:w="http://schemas.openxmlformats.org/wordprocessingml/2006/main" xmlns:w14="http://schemas.microsoft.com/office/word/2010/wordml" xmlns:w15="http://schemas.microsoft.com/office/word/2012/wordml" xmlns:w16cex="http://schemas.microsoft.com/office/word/2018/wordml/cex" xmlns:w16cid="http://schemas.microsoft.com/office/word/2016/wordml/cid" xmlns:w16="http://schemas.microsoft.com/office/word/2018/wordml" xmlns:w16du="http://schemas.microsoft.com/office/word/2023/wordml/word16du" xmlns:w16sdtdh="http://schemas.microsoft.com/office/word/2020/wordml/sdtdatahash" xmlns:w16sdtfl="http://schemas.microsoft.com/office/word/2024/wordml/sdtformatlock" xmlns:w16se="http://schemas.microsoft.com/office/word/2015/wordml/symex" xmlns:wpg="http://schemas.microsoft.com/office/word/2010/wordprocessingGroup" xmlns:wpi="http://schemas.microsoft.com/office/word/2010/wordprocessingInk" xmlns:wne="http://schemas.microsoft.com/office/word/2006/wordml" xmlns:wps="http://schemas.microsoft.com/office/word/2010/wordprocessingShape" mc:Ignorable="w14 w15 w16se w16cid w16 w16cex w16sdtdh w16sdtfl w16du wp14">
-  <w15:person w15:author="Damian Struk">
-    <w15:presenceInfo w15:providerId="AD" w15:userId="S::damian.struk@singledraft.onmicrosoft.com::3ab11056-ad66-4607-81dd-b32869b9ccbf"/>
+  <w15:person w15:author="stella">
+    <w15:presenceInfo w15:providerId="stella" w15:userId="stella"/>
   </w15:person>
-  <w15:person w15:author="Jan Kubica">
-    <w15:presenceInfo w15:providerId="None" w15:userId="Jan Kubica"/>
+  <w15:person w15:author="stella">
+    <w15:presenceInfo w15:providerId="stella" w15:userId="stella"/>
   </w15:person>
 </w15:people>
 </file>

</xml_diff>

<commit_message>
test: normalize office fixture metadata (#4619)
Normalize document properties in committed office fixtures.
Add a check that keeps fixture metadata to an allowlist.
</commit_message>
<xml_diff>
--- a/apps/api/src/lib/docx/fixtures/spa-template-with-placeholders.docx
+++ b/apps/api/src/lib/docx/fixtures/spa-template-with-placeholders.docx
@@ -3198,7 +3198,7 @@
         <w:ind w:left="567" w:hanging="567"/>
         <w:contextualSpacing w:val="0"/>
         <w:rPr>
-          <w:del w:id="8" w:author="Damian Struk" w:date="2024-11-09T13:09:00Z" w16du:dateUtc="2024-11-09T12:09:00Z"/>
+          <w:del w:id="8" w:author="stella" w:date="2024-11-09T13:09:00Z" w16du:dateUtc="2024-11-09T12:09:00Z"/>
           <w:rFonts w:ascii="Corbel" w:hAnsi="Corbel"/>
           <w:bCs/>
           <w:color w:val="575757"/>
@@ -3206,7 +3206,7 @@
         </w:rPr>
       </w:pPr>
       <w:bookmarkStart w:id="9" w:name="_Hlk98163135"/>
-      <w:del w:id="10" w:author="Damian Struk" w:date="2024-11-09T13:09:00Z" w16du:dateUtc="2024-11-09T12:09:00Z">
+      <w:del w:id="10" w:author="stella" w:date="2024-11-09T13:09:00Z" w16du:dateUtc="2024-11-09T12:09:00Z">
         <w:r>
           <w:rPr>
             <w:rFonts w:ascii="Corbel" w:hAnsi="Corbel"/>
@@ -3233,14 +3233,14 @@
         <w:widowControl w:val="0"/>
         <w:spacing w:before="120" w:after="120" w:line="300" w:lineRule="exact"/>
         <w:rPr>
-          <w:del w:id="11" w:author="Damian Struk" w:date="2024-11-09T13:09:00Z" w16du:dateUtc="2024-11-09T12:09:00Z"/>
+          <w:del w:id="11" w:author="stella" w:date="2024-11-09T13:09:00Z" w16du:dateUtc="2024-11-09T12:09:00Z"/>
           <w:rFonts w:ascii="Corbel" w:hAnsi="Corbel"/>
           <w:bCs/>
           <w:color w:val="575757"/>
           <w:lang w:eastAsia="en-US"/>
         </w:rPr>
       </w:pPr>
-      <w:del w:id="12" w:author="Damian Struk" w:date="2024-11-09T13:09:00Z" w16du:dateUtc="2024-11-09T12:09:00Z">
+      <w:del w:id="12" w:author="stella" w:date="2024-11-09T13:09:00Z" w16du:dateUtc="2024-11-09T12:09:00Z">
         <w:r>
           <w:rPr>
             <w:rFonts w:ascii="Corbel" w:hAnsi="Corbel"/>
@@ -5573,7 +5573,7 @@
           <w:tblW w:w="9498" w:type="dxa"/>
           <w:tblInd w:w="567" w:type="dxa"/>
           <w:tblLayout w:type="fixed"/>
-          <w:tblPrExChange w:id="15" w:author="Damian Struk" w:date="2024-11-09T13:09:00Z" w16du:dateUtc="2024-11-09T12:09:00Z">
+          <w:tblPrExChange w:id="15" w:author="stella" w:date="2024-11-09T13:09:00Z" w16du:dateUtc="2024-11-09T12:09:00Z">
             <w:tblPrEx>
               <w:tblW w:w="9498" w:type="dxa"/>
               <w:tblInd w:w="567" w:type="dxa"/>
@@ -5584,7 +5584,7 @@
         <w:tc>
           <w:tcPr>
             <w:tcW w:w="709" w:type="dxa"/>
-            <w:tcPrChange w:id="16" w:author="Damian Struk" w:date="2024-11-09T13:09:00Z" w16du:dateUtc="2024-11-09T12:09:00Z">
+            <w:tcPrChange w:id="16" w:author="stella" w:date="2024-11-09T13:09:00Z" w16du:dateUtc="2024-11-09T12:09:00Z">
               <w:tcPr>
                 <w:tcW w:w="709" w:type="dxa"/>
               </w:tcPr>
@@ -5612,7 +5612,7 @@
         <w:tc>
           <w:tcPr>
             <w:tcW w:w="2226" w:type="dxa"/>
-            <w:tcPrChange w:id="17" w:author="Damian Struk" w:date="2024-11-09T13:09:00Z" w16du:dateUtc="2024-11-09T12:09:00Z">
+            <w:tcPrChange w:id="17" w:author="stella" w:date="2024-11-09T13:09:00Z" w16du:dateUtc="2024-11-09T12:09:00Z">
               <w:tcPr>
                 <w:tcW w:w="2226" w:type="dxa"/>
               </w:tcPr>
@@ -5632,7 +5632,7 @@
                 <w:lang w:eastAsia="ja-JP"/>
               </w:rPr>
             </w:pPr>
-            <w:ins w:id="18" w:author="Damian Struk" w:date="2024-11-09T13:09:00Z" w16du:dateUtc="2024-11-09T12:09:00Z">
+            <w:ins w:id="18" w:author="stella" w:date="2024-11-09T13:09:00Z" w16du:dateUtc="2024-11-09T12:09:00Z">
               <w:r>
                 <w:rPr>
                   <w:rFonts w:ascii="Corbel" w:hAnsi="Corbel"/>
@@ -5643,7 +5643,7 @@
                 <w:t>Podíl</w:t>
               </w:r>
             </w:ins>
-            <w:del w:id="19" w:author="Damian Struk" w:date="2024-11-09T13:09:00Z" w16du:dateUtc="2024-11-09T12:09:00Z">
+            <w:del w:id="19" w:author="stella" w:date="2024-11-09T13:09:00Z" w16du:dateUtc="2024-11-09T12:09:00Z">
               <w:r>
                 <w:rPr>
                   <w:rFonts w:ascii="Corbel" w:hAnsi="Corbel"/>
@@ -5659,7 +5659,7 @@
         <w:tc>
           <w:tcPr>
             <w:tcW w:w="6563" w:type="dxa"/>
-            <w:tcPrChange w:id="20" w:author="Damian Struk" w:date="2024-11-09T13:09:00Z" w16du:dateUtc="2024-11-09T12:09:00Z">
+            <w:tcPrChange w:id="20" w:author="stella" w:date="2024-11-09T13:09:00Z" w16du:dateUtc="2024-11-09T12:09:00Z">
               <w:tcPr>
                 <w:tcW w:w="6563" w:type="dxa"/>
               </w:tcPr>
@@ -5678,7 +5678,7 @@
                 <w:lang w:eastAsia="ja-JP"/>
               </w:rPr>
             </w:pPr>
-            <w:ins w:id="21" w:author="Damian Struk" w:date="2024-11-09T13:09:00Z" w16du:dateUtc="2024-11-09T12:09:00Z">
+            <w:ins w:id="21" w:author="stella" w:date="2024-11-09T13:09:00Z" w16du:dateUtc="2024-11-09T12:09:00Z">
               <w:r>
                 <w:rPr>
                   <w:rFonts w:ascii="Corbel" w:hAnsi="Corbel"/>
@@ -5688,7 +5688,7 @@
                 <w:t>znamená kterýkoli z Podílů, nebo dle kontextu jen některý z Podílů.</w:t>
               </w:r>
             </w:ins>
-            <w:del w:id="22" w:author="Damian Struk" w:date="2024-11-09T13:09:00Z" w16du:dateUtc="2024-11-09T12:09:00Z">
+            <w:del w:id="22" w:author="stella" w:date="2024-11-09T13:09:00Z" w16du:dateUtc="2024-11-09T12:09:00Z">
               <w:r>
                 <w:rPr>
                   <w:rFonts w:ascii="Corbel" w:hAnsi="Corbel"/>
@@ -5761,7 +5761,7 @@
           <w:tblW w:w="9498" w:type="dxa"/>
           <w:tblInd w:w="567" w:type="dxa"/>
           <w:tblLayout w:type="fixed"/>
-          <w:tblPrExChange w:id="23" w:author="Damian Struk" w:date="2024-11-09T13:09:00Z" w16du:dateUtc="2024-11-09T12:09:00Z">
+          <w:tblPrExChange w:id="23" w:author="stella" w:date="2024-11-09T13:09:00Z" w16du:dateUtc="2024-11-09T12:09:00Z">
             <w:tblPrEx>
               <w:tblW w:w="9498" w:type="dxa"/>
               <w:tblInd w:w="567" w:type="dxa"/>
@@ -5771,7 +5771,7 @@
         </w:tblPrEx>
         <w:trPr>
           <w:trHeight w:val="265"/>
-          <w:trPrChange w:id="24" w:author="Damian Struk" w:date="2024-11-09T13:09:00Z" w16du:dateUtc="2024-11-09T12:09:00Z">
+          <w:trPrChange w:id="24" w:author="stella" w:date="2024-11-09T13:09:00Z" w16du:dateUtc="2024-11-09T12:09:00Z">
             <w:trPr>
               <w:trHeight w:val="265"/>
             </w:trPr>
@@ -5780,7 +5780,7 @@
         <w:tc>
           <w:tcPr>
             <w:tcW w:w="709" w:type="dxa"/>
-            <w:tcPrChange w:id="25" w:author="Damian Struk" w:date="2024-11-09T13:09:00Z" w16du:dateUtc="2024-11-09T12:09:00Z">
+            <w:tcPrChange w:id="25" w:author="stella" w:date="2024-11-09T13:09:00Z" w16du:dateUtc="2024-11-09T12:09:00Z">
               <w:tcPr>
                 <w:tcW w:w="709" w:type="dxa"/>
               </w:tcPr>
@@ -5808,7 +5808,7 @@
         <w:tc>
           <w:tcPr>
             <w:tcW w:w="2226" w:type="dxa"/>
-            <w:tcPrChange w:id="26" w:author="Damian Struk" w:date="2024-11-09T13:09:00Z" w16du:dateUtc="2024-11-09T12:09:00Z">
+            <w:tcPrChange w:id="26" w:author="stella" w:date="2024-11-09T13:09:00Z" w16du:dateUtc="2024-11-09T12:09:00Z">
               <w:tcPr>
                 <w:tcW w:w="2226" w:type="dxa"/>
               </w:tcPr>
@@ -5828,7 +5828,7 @@
                 <w:lang w:eastAsia="ja-JP"/>
               </w:rPr>
             </w:pPr>
-            <w:ins w:id="27" w:author="Damian Struk" w:date="2024-11-09T13:09:00Z" w16du:dateUtc="2024-11-09T12:09:00Z">
+            <w:ins w:id="27" w:author="stella" w:date="2024-11-09T13:09:00Z" w16du:dateUtc="2024-11-09T12:09:00Z">
               <w:r>
                 <w:rPr>
                   <w:rFonts w:ascii="Corbel" w:hAnsi="Corbel"/>
@@ -5848,7 +5848,7 @@
                 <w:t>1</w:t>
               </w:r>
             </w:ins>
-            <w:del w:id="28" w:author="Damian Struk" w:date="2024-11-09T13:09:00Z" w16du:dateUtc="2024-11-09T12:09:00Z">
+            <w:del w:id="28" w:author="stella" w:date="2024-11-09T13:09:00Z" w16du:dateUtc="2024-11-09T12:09:00Z">
               <w:r>
                 <w:rPr>
                   <w:rFonts w:ascii="Corbel" w:hAnsi="Corbel"/>
@@ -5864,7 +5864,7 @@
         <w:tc>
           <w:tcPr>
             <w:tcW w:w="6563" w:type="dxa"/>
-            <w:tcPrChange w:id="29" w:author="Damian Struk" w:date="2024-11-09T13:09:00Z" w16du:dateUtc="2024-11-09T12:09:00Z">
+            <w:tcPrChange w:id="29" w:author="stella" w:date="2024-11-09T13:09:00Z" w16du:dateUtc="2024-11-09T12:09:00Z">
               <w:tcPr>
                 <w:tcW w:w="6563" w:type="dxa"/>
               </w:tcPr>
@@ -5883,7 +5883,7 @@
                 <w:lang w:eastAsia="ja-JP"/>
               </w:rPr>
             </w:pPr>
-            <w:ins w:id="30" w:author="Damian Struk" w:date="2024-11-09T13:09:00Z" w16du:dateUtc="2024-11-09T12:09:00Z">
+            <w:ins w:id="30" w:author="stella" w:date="2024-11-09T13:09:00Z" w16du:dateUtc="2024-11-09T12:09:00Z">
               <w:r>
                 <w:rPr>
                   <w:rFonts w:ascii="Corbel" w:hAnsi="Corbel"/>
@@ -5973,7 +5973,7 @@
                 <w:t>.</w:t>
               </w:r>
             </w:ins>
-            <w:del w:id="31" w:author="Damian Struk" w:date="2024-11-09T13:09:00Z" w16du:dateUtc="2024-11-09T12:09:00Z">
+            <w:del w:id="31" w:author="stella" w:date="2024-11-09T13:09:00Z" w16du:dateUtc="2024-11-09T12:09:00Z">
               <w:r>
                 <w:rPr>
                   <w:rFonts w:ascii="Corbel" w:hAnsi="Corbel"/>
@@ -5991,7 +5991,7 @@
           <w:tblW w:w="9498" w:type="dxa"/>
           <w:tblInd w:w="567" w:type="dxa"/>
           <w:tblLayout w:type="fixed"/>
-          <w:tblPrExChange w:id="32" w:author="Damian Struk" w:date="2024-11-09T13:09:00Z" w16du:dateUtc="2024-11-09T12:09:00Z">
+          <w:tblPrExChange w:id="32" w:author="stella" w:date="2024-11-09T13:09:00Z" w16du:dateUtc="2024-11-09T12:09:00Z">
             <w:tblPrEx>
               <w:tblW w:w="9498" w:type="dxa"/>
               <w:tblInd w:w="567" w:type="dxa"/>
@@ -6001,7 +6001,7 @@
         </w:tblPrEx>
         <w:trPr>
           <w:trHeight w:val="265"/>
-          <w:trPrChange w:id="33" w:author="Damian Struk" w:date="2024-11-09T13:09:00Z" w16du:dateUtc="2024-11-09T12:09:00Z">
+          <w:trPrChange w:id="33" w:author="stella" w:date="2024-11-09T13:09:00Z" w16du:dateUtc="2024-11-09T12:09:00Z">
             <w:trPr>
               <w:trHeight w:val="265"/>
             </w:trPr>
@@ -6010,7 +6010,7 @@
         <w:tc>
           <w:tcPr>
             <w:tcW w:w="709" w:type="dxa"/>
-            <w:tcPrChange w:id="34" w:author="Damian Struk" w:date="2024-11-09T13:09:00Z" w16du:dateUtc="2024-11-09T12:09:00Z">
+            <w:tcPrChange w:id="34" w:author="stella" w:date="2024-11-09T13:09:00Z" w16du:dateUtc="2024-11-09T12:09:00Z">
               <w:tcPr>
                 <w:tcW w:w="709" w:type="dxa"/>
               </w:tcPr>
@@ -6038,7 +6038,7 @@
         <w:tc>
           <w:tcPr>
             <w:tcW w:w="2226" w:type="dxa"/>
-            <w:tcPrChange w:id="35" w:author="Damian Struk" w:date="2024-11-09T13:09:00Z" w16du:dateUtc="2024-11-09T12:09:00Z">
+            <w:tcPrChange w:id="35" w:author="stella" w:date="2024-11-09T13:09:00Z" w16du:dateUtc="2024-11-09T12:09:00Z">
               <w:tcPr>
                 <w:tcW w:w="2226" w:type="dxa"/>
               </w:tcPr>
@@ -6058,7 +6058,7 @@
                 <w:lang w:eastAsia="ja-JP"/>
               </w:rPr>
             </w:pPr>
-            <w:ins w:id="36" w:author="Damian Struk" w:date="2024-11-09T13:09:00Z" w16du:dateUtc="2024-11-09T12:09:00Z">
+            <w:ins w:id="36" w:author="stella" w:date="2024-11-09T13:09:00Z" w16du:dateUtc="2024-11-09T12:09:00Z">
               <w:r>
                 <w:rPr>
                   <w:rFonts w:ascii="Corbel" w:hAnsi="Corbel"/>
@@ -6078,7 +6078,7 @@
                 <w:t>2</w:t>
               </w:r>
             </w:ins>
-            <w:del w:id="37" w:author="Damian Struk" w:date="2024-11-09T13:09:00Z" w16du:dateUtc="2024-11-09T12:09:00Z">
+            <w:del w:id="37" w:author="stella" w:date="2024-11-09T13:09:00Z" w16du:dateUtc="2024-11-09T12:09:00Z">
               <w:r>
                 <w:rPr>
                   <w:rFonts w:ascii="Corbel" w:hAnsi="Corbel"/>
@@ -6103,7 +6103,7 @@
         <w:tc>
           <w:tcPr>
             <w:tcW w:w="6563" w:type="dxa"/>
-            <w:tcPrChange w:id="38" w:author="Damian Struk" w:date="2024-11-09T13:09:00Z" w16du:dateUtc="2024-11-09T12:09:00Z">
+            <w:tcPrChange w:id="38" w:author="stella" w:date="2024-11-09T13:09:00Z" w16du:dateUtc="2024-11-09T12:09:00Z">
               <w:tcPr>
                 <w:tcW w:w="6563" w:type="dxa"/>
               </w:tcPr>
@@ -6122,7 +6122,7 @@
                 <w:lang w:eastAsia="ja-JP"/>
               </w:rPr>
             </w:pPr>
-            <w:ins w:id="39" w:author="Damian Struk" w:date="2024-11-09T13:09:00Z" w16du:dateUtc="2024-11-09T12:09:00Z">
+            <w:ins w:id="39" w:author="stella" w:date="2024-11-09T13:09:00Z" w16du:dateUtc="2024-11-09T12:09:00Z">
               <w:r>
                 <w:rPr>
                   <w:rFonts w:ascii="Corbel" w:hAnsi="Corbel"/>
@@ -6196,7 +6196,7 @@
                 <w:t>.</w:t>
               </w:r>
             </w:ins>
-            <w:del w:id="40" w:author="Damian Struk" w:date="2024-11-09T13:09:00Z" w16du:dateUtc="2024-11-09T12:09:00Z">
+            <w:del w:id="40" w:author="stella" w:date="2024-11-09T13:09:00Z" w16du:dateUtc="2024-11-09T12:09:00Z">
               <w:r>
                 <w:rPr>
                   <w:rFonts w:ascii="Corbel" w:hAnsi="Corbel"/>
@@ -6294,7 +6294,7 @@
           <w:tblW w:w="9498" w:type="dxa"/>
           <w:tblInd w:w="567" w:type="dxa"/>
           <w:tblLayout w:type="fixed"/>
-          <w:tblPrExChange w:id="41" w:author="Damian Struk" w:date="2024-11-09T13:09:00Z" w16du:dateUtc="2024-11-09T12:09:00Z">
+          <w:tblPrExChange w:id="41" w:author="stella" w:date="2024-11-09T13:09:00Z" w16du:dateUtc="2024-11-09T12:09:00Z">
             <w:tblPrEx>
               <w:tblW w:w="9498" w:type="dxa"/>
               <w:tblInd w:w="567" w:type="dxa"/>
@@ -6304,7 +6304,7 @@
         </w:tblPrEx>
         <w:trPr>
           <w:trHeight w:val="265"/>
-          <w:trPrChange w:id="42" w:author="Damian Struk" w:date="2024-11-09T13:09:00Z" w16du:dateUtc="2024-11-09T12:09:00Z">
+          <w:trPrChange w:id="42" w:author="stella" w:date="2024-11-09T13:09:00Z" w16du:dateUtc="2024-11-09T12:09:00Z">
             <w:trPr>
               <w:trHeight w:val="265"/>
             </w:trPr>
@@ -6313,7 +6313,7 @@
         <w:tc>
           <w:tcPr>
             <w:tcW w:w="709" w:type="dxa"/>
-            <w:tcPrChange w:id="43" w:author="Damian Struk" w:date="2024-11-09T13:09:00Z" w16du:dateUtc="2024-11-09T12:09:00Z">
+            <w:tcPrChange w:id="43" w:author="stella" w:date="2024-11-09T13:09:00Z" w16du:dateUtc="2024-11-09T12:09:00Z">
               <w:tcPr>
                 <w:tcW w:w="709" w:type="dxa"/>
               </w:tcPr>
@@ -6341,7 +6341,7 @@
         <w:tc>
           <w:tcPr>
             <w:tcW w:w="2226" w:type="dxa"/>
-            <w:tcPrChange w:id="44" w:author="Damian Struk" w:date="2024-11-09T13:09:00Z" w16du:dateUtc="2024-11-09T12:09:00Z">
+            <w:tcPrChange w:id="44" w:author="stella" w:date="2024-11-09T13:09:00Z" w16du:dateUtc="2024-11-09T12:09:00Z">
               <w:tcPr>
                 <w:tcW w:w="2226" w:type="dxa"/>
               </w:tcPr>
@@ -6361,7 +6361,7 @@
                 <w:lang w:eastAsia="ja-JP"/>
               </w:rPr>
             </w:pPr>
-            <w:ins w:id="45" w:author="Damian Struk" w:date="2024-11-09T13:09:00Z" w16du:dateUtc="2024-11-09T12:09:00Z">
+            <w:ins w:id="45" w:author="stella" w:date="2024-11-09T13:09:00Z" w16du:dateUtc="2024-11-09T12:09:00Z">
               <w:r>
                 <w:rPr>
                   <w:rFonts w:ascii="Corbel" w:hAnsi="Corbel"/>
@@ -6381,7 +6381,7 @@
                 <w:t>3</w:t>
               </w:r>
             </w:ins>
-            <w:del w:id="46" w:author="Damian Struk" w:date="2024-11-09T13:09:00Z" w16du:dateUtc="2024-11-09T12:09:00Z">
+            <w:del w:id="46" w:author="stella" w:date="2024-11-09T13:09:00Z" w16du:dateUtc="2024-11-09T12:09:00Z">
               <w:r>
                 <w:rPr>
                   <w:rFonts w:ascii="Corbel" w:hAnsi="Corbel"/>
@@ -6406,7 +6406,7 @@
         <w:tc>
           <w:tcPr>
             <w:tcW w:w="6563" w:type="dxa"/>
-            <w:tcPrChange w:id="47" w:author="Damian Struk" w:date="2024-11-09T13:09:00Z" w16du:dateUtc="2024-11-09T12:09:00Z">
+            <w:tcPrChange w:id="47" w:author="stella" w:date="2024-11-09T13:09:00Z" w16du:dateUtc="2024-11-09T12:09:00Z">
               <w:tcPr>
                 <w:tcW w:w="6563" w:type="dxa"/>
               </w:tcPr>
@@ -6425,7 +6425,7 @@
                 <w:lang w:eastAsia="ja-JP"/>
               </w:rPr>
             </w:pPr>
-            <w:ins w:id="48" w:author="Damian Struk" w:date="2024-11-09T13:09:00Z" w16du:dateUtc="2024-11-09T12:09:00Z">
+            <w:ins w:id="48" w:author="stella" w:date="2024-11-09T13:09:00Z" w16du:dateUtc="2024-11-09T12:09:00Z">
               <w:r>
                 <w:rPr>
                   <w:rFonts w:ascii="Corbel" w:hAnsi="Corbel"/>
@@ -6499,7 +6499,7 @@
                 <w:t>.</w:t>
               </w:r>
             </w:ins>
-            <w:del w:id="49" w:author="Damian Struk" w:date="2024-11-09T13:09:00Z" w16du:dateUtc="2024-11-09T12:09:00Z">
+            <w:del w:id="49" w:author="stella" w:date="2024-11-09T13:09:00Z" w16du:dateUtc="2024-11-09T12:09:00Z">
               <w:r>
                 <w:rPr>
                   <w:rFonts w:ascii="Corbel" w:hAnsi="Corbel"/>
@@ -6581,7 +6581,7 @@
           <w:tblW w:w="9498" w:type="dxa"/>
           <w:tblInd w:w="567" w:type="dxa"/>
           <w:tblLayout w:type="fixed"/>
-          <w:tblPrExChange w:id="50" w:author="Damian Struk" w:date="2024-11-09T13:09:00Z" w16du:dateUtc="2024-11-09T12:09:00Z">
+          <w:tblPrExChange w:id="50" w:author="stella" w:date="2024-11-09T13:09:00Z" w16du:dateUtc="2024-11-09T12:09:00Z">
             <w:tblPrEx>
               <w:tblW w:w="9498" w:type="dxa"/>
               <w:tblInd w:w="567" w:type="dxa"/>
@@ -6591,7 +6591,7 @@
         </w:tblPrEx>
         <w:trPr>
           <w:trHeight w:val="265"/>
-          <w:trPrChange w:id="51" w:author="Damian Struk" w:date="2024-11-09T13:09:00Z" w16du:dateUtc="2024-11-09T12:09:00Z">
+          <w:trPrChange w:id="51" w:author="stella" w:date="2024-11-09T13:09:00Z" w16du:dateUtc="2024-11-09T12:09:00Z">
             <w:trPr>
               <w:trHeight w:val="265"/>
             </w:trPr>
@@ -6600,7 +6600,7 @@
         <w:tc>
           <w:tcPr>
             <w:tcW w:w="709" w:type="dxa"/>
-            <w:tcPrChange w:id="52" w:author="Damian Struk" w:date="2024-11-09T13:09:00Z" w16du:dateUtc="2024-11-09T12:09:00Z">
+            <w:tcPrChange w:id="52" w:author="stella" w:date="2024-11-09T13:09:00Z" w16du:dateUtc="2024-11-09T12:09:00Z">
               <w:tcPr>
                 <w:tcW w:w="709" w:type="dxa"/>
               </w:tcPr>
@@ -6628,7 +6628,7 @@
         <w:tc>
           <w:tcPr>
             <w:tcW w:w="2226" w:type="dxa"/>
-            <w:tcPrChange w:id="53" w:author="Damian Struk" w:date="2024-11-09T13:09:00Z" w16du:dateUtc="2024-11-09T12:09:00Z">
+            <w:tcPrChange w:id="53" w:author="stella" w:date="2024-11-09T13:09:00Z" w16du:dateUtc="2024-11-09T12:09:00Z">
               <w:tcPr>
                 <w:tcW w:w="2226" w:type="dxa"/>
               </w:tcPr>
@@ -6648,7 +6648,7 @@
                 <w:lang w:eastAsia="ja-JP"/>
               </w:rPr>
             </w:pPr>
-            <w:ins w:id="54" w:author="Damian Struk" w:date="2024-11-09T13:09:00Z" w16du:dateUtc="2024-11-09T12:09:00Z">
+            <w:ins w:id="54" w:author="stella" w:date="2024-11-09T13:09:00Z" w16du:dateUtc="2024-11-09T12:09:00Z">
               <w:r>
                 <w:rPr>
                   <w:rFonts w:ascii="Corbel" w:hAnsi="Corbel"/>
@@ -6668,7 +6668,7 @@
                 <w:t>4</w:t>
               </w:r>
             </w:ins>
-            <w:del w:id="55" w:author="Damian Struk" w:date="2024-11-09T13:09:00Z" w16du:dateUtc="2024-11-09T12:09:00Z">
+            <w:del w:id="55" w:author="stella" w:date="2024-11-09T13:09:00Z" w16du:dateUtc="2024-11-09T12:09:00Z">
               <w:r>
                 <w:rPr>
                   <w:rFonts w:ascii="Corbel" w:hAnsi="Corbel"/>
@@ -6693,7 +6693,7 @@
         <w:tc>
           <w:tcPr>
             <w:tcW w:w="6563" w:type="dxa"/>
-            <w:tcPrChange w:id="56" w:author="Damian Struk" w:date="2024-11-09T13:09:00Z" w16du:dateUtc="2024-11-09T12:09:00Z">
+            <w:tcPrChange w:id="56" w:author="stella" w:date="2024-11-09T13:09:00Z" w16du:dateUtc="2024-11-09T12:09:00Z">
               <w:tcPr>
                 <w:tcW w:w="6563" w:type="dxa"/>
               </w:tcPr>
@@ -6712,7 +6712,7 @@
                 <w:lang w:eastAsia="ja-JP"/>
               </w:rPr>
             </w:pPr>
-            <w:ins w:id="57" w:author="Damian Struk" w:date="2024-11-09T13:09:00Z" w16du:dateUtc="2024-11-09T12:09:00Z">
+            <w:ins w:id="57" w:author="stella" w:date="2024-11-09T13:09:00Z" w16du:dateUtc="2024-11-09T12:09:00Z">
               <w:r>
                 <w:rPr>
                   <w:rFonts w:ascii="Corbel" w:hAnsi="Corbel"/>
@@ -6786,7 +6786,7 @@
                 <w:t>.</w:t>
               </w:r>
             </w:ins>
-            <w:del w:id="58" w:author="Damian Struk" w:date="2024-11-09T13:09:00Z" w16du:dateUtc="2024-11-09T12:09:00Z">
+            <w:del w:id="58" w:author="stella" w:date="2024-11-09T13:09:00Z" w16du:dateUtc="2024-11-09T12:09:00Z">
               <w:r>
                 <w:rPr>
                   <w:rFonts w:ascii="Corbel" w:hAnsi="Corbel"/>
@@ -6868,7 +6868,7 @@
           <w:tblW w:w="9498" w:type="dxa"/>
           <w:tblInd w:w="567" w:type="dxa"/>
           <w:tblLayout w:type="fixed"/>
-          <w:tblPrExChange w:id="59" w:author="Damian Struk" w:date="2024-11-09T13:09:00Z" w16du:dateUtc="2024-11-09T12:09:00Z">
+          <w:tblPrExChange w:id="59" w:author="stella" w:date="2024-11-09T13:09:00Z" w16du:dateUtc="2024-11-09T12:09:00Z">
             <w:tblPrEx>
               <w:tblW w:w="9498" w:type="dxa"/>
               <w:tblInd w:w="567" w:type="dxa"/>
@@ -6878,7 +6878,7 @@
         </w:tblPrEx>
         <w:trPr>
           <w:trHeight w:val="265"/>
-          <w:trPrChange w:id="60" w:author="Damian Struk" w:date="2024-11-09T13:09:00Z" w16du:dateUtc="2024-11-09T12:09:00Z">
+          <w:trPrChange w:id="60" w:author="stella" w:date="2024-11-09T13:09:00Z" w16du:dateUtc="2024-11-09T12:09:00Z">
             <w:trPr>
               <w:trHeight w:val="265"/>
             </w:trPr>
@@ -6887,7 +6887,7 @@
         <w:tc>
           <w:tcPr>
             <w:tcW w:w="709" w:type="dxa"/>
-            <w:tcPrChange w:id="61" w:author="Damian Struk" w:date="2024-11-09T13:09:00Z" w16du:dateUtc="2024-11-09T12:09:00Z">
+            <w:tcPrChange w:id="61" w:author="stella" w:date="2024-11-09T13:09:00Z" w16du:dateUtc="2024-11-09T12:09:00Z">
               <w:tcPr>
                 <w:tcW w:w="709" w:type="dxa"/>
               </w:tcPr>
@@ -6915,7 +6915,7 @@
         <w:tc>
           <w:tcPr>
             <w:tcW w:w="2226" w:type="dxa"/>
-            <w:tcPrChange w:id="62" w:author="Damian Struk" w:date="2024-11-09T13:09:00Z" w16du:dateUtc="2024-11-09T12:09:00Z">
+            <w:tcPrChange w:id="62" w:author="stella" w:date="2024-11-09T13:09:00Z" w16du:dateUtc="2024-11-09T12:09:00Z">
               <w:tcPr>
                 <w:tcW w:w="2226" w:type="dxa"/>
               </w:tcPr>
@@ -6935,7 +6935,7 @@
                 <w:lang w:eastAsia="ja-JP"/>
               </w:rPr>
             </w:pPr>
-            <w:ins w:id="63" w:author="Damian Struk" w:date="2024-11-09T13:09:00Z" w16du:dateUtc="2024-11-09T12:09:00Z">
+            <w:ins w:id="63" w:author="stella" w:date="2024-11-09T13:09:00Z" w16du:dateUtc="2024-11-09T12:09:00Z">
               <w:r>
                 <w:rPr>
                   <w:rFonts w:ascii="Corbel" w:hAnsi="Corbel"/>
@@ -6955,7 +6955,7 @@
                 <w:t>5</w:t>
               </w:r>
             </w:ins>
-            <w:del w:id="64" w:author="Damian Struk" w:date="2024-11-09T13:09:00Z" w16du:dateUtc="2024-11-09T12:09:00Z">
+            <w:del w:id="64" w:author="stella" w:date="2024-11-09T13:09:00Z" w16du:dateUtc="2024-11-09T12:09:00Z">
               <w:r>
                 <w:rPr>
                   <w:rFonts w:ascii="Corbel" w:hAnsi="Corbel"/>
@@ -6980,7 +6980,7 @@
         <w:tc>
           <w:tcPr>
             <w:tcW w:w="6563" w:type="dxa"/>
-            <w:tcPrChange w:id="65" w:author="Damian Struk" w:date="2024-11-09T13:09:00Z" w16du:dateUtc="2024-11-09T12:09:00Z">
+            <w:tcPrChange w:id="65" w:author="stella" w:date="2024-11-09T13:09:00Z" w16du:dateUtc="2024-11-09T12:09:00Z">
               <w:tcPr>
                 <w:tcW w:w="6563" w:type="dxa"/>
               </w:tcPr>
@@ -6999,7 +6999,7 @@
                 <w:lang w:eastAsia="ja-JP"/>
               </w:rPr>
             </w:pPr>
-            <w:ins w:id="66" w:author="Damian Struk" w:date="2024-11-09T13:09:00Z" w16du:dateUtc="2024-11-09T12:09:00Z">
+            <w:ins w:id="66" w:author="stella" w:date="2024-11-09T13:09:00Z" w16du:dateUtc="2024-11-09T12:09:00Z">
               <w:r>
                 <w:rPr>
                   <w:rFonts w:ascii="Corbel" w:hAnsi="Corbel"/>
@@ -7073,7 +7073,7 @@
                 <w:t>.</w:t>
               </w:r>
             </w:ins>
-            <w:del w:id="67" w:author="Damian Struk" w:date="2024-11-09T13:09:00Z" w16du:dateUtc="2024-11-09T12:09:00Z">
+            <w:del w:id="67" w:author="stella" w:date="2024-11-09T13:09:00Z" w16du:dateUtc="2024-11-09T12:09:00Z">
               <w:r>
                 <w:rPr>
                   <w:rFonts w:ascii="Corbel" w:hAnsi="Corbel"/>
@@ -7155,7 +7155,7 @@
           <w:tblW w:w="9498" w:type="dxa"/>
           <w:tblInd w:w="567" w:type="dxa"/>
           <w:tblLayout w:type="fixed"/>
-          <w:tblPrExChange w:id="68" w:author="Damian Struk" w:date="2024-11-09T13:09:00Z" w16du:dateUtc="2024-11-09T12:09:00Z">
+          <w:tblPrExChange w:id="68" w:author="stella" w:date="2024-11-09T13:09:00Z" w16du:dateUtc="2024-11-09T12:09:00Z">
             <w:tblPrEx>
               <w:tblW w:w="9498" w:type="dxa"/>
               <w:tblInd w:w="567" w:type="dxa"/>
@@ -7165,7 +7165,7 @@
         </w:tblPrEx>
         <w:trPr>
           <w:trHeight w:val="265"/>
-          <w:trPrChange w:id="69" w:author="Damian Struk" w:date="2024-11-09T13:09:00Z" w16du:dateUtc="2024-11-09T12:09:00Z">
+          <w:trPrChange w:id="69" w:author="stella" w:date="2024-11-09T13:09:00Z" w16du:dateUtc="2024-11-09T12:09:00Z">
             <w:trPr>
               <w:trHeight w:val="265"/>
             </w:trPr>
@@ -7174,7 +7174,7 @@
         <w:tc>
           <w:tcPr>
             <w:tcW w:w="709" w:type="dxa"/>
-            <w:tcPrChange w:id="70" w:author="Damian Struk" w:date="2024-11-09T13:09:00Z" w16du:dateUtc="2024-11-09T12:09:00Z">
+            <w:tcPrChange w:id="70" w:author="stella" w:date="2024-11-09T13:09:00Z" w16du:dateUtc="2024-11-09T12:09:00Z">
               <w:tcPr>
                 <w:tcW w:w="709" w:type="dxa"/>
               </w:tcPr>
@@ -7202,7 +7202,7 @@
         <w:tc>
           <w:tcPr>
             <w:tcW w:w="2226" w:type="dxa"/>
-            <w:tcPrChange w:id="71" w:author="Damian Struk" w:date="2024-11-09T13:09:00Z" w16du:dateUtc="2024-11-09T12:09:00Z">
+            <w:tcPrChange w:id="71" w:author="stella" w:date="2024-11-09T13:09:00Z" w16du:dateUtc="2024-11-09T12:09:00Z">
               <w:tcPr>
                 <w:tcW w:w="2226" w:type="dxa"/>
               </w:tcPr>
@@ -7222,7 +7222,7 @@
                 <w:lang w:eastAsia="ja-JP"/>
               </w:rPr>
             </w:pPr>
-            <w:ins w:id="72" w:author="Damian Struk" w:date="2024-11-09T13:09:00Z" w16du:dateUtc="2024-11-09T12:09:00Z">
+            <w:ins w:id="72" w:author="stella" w:date="2024-11-09T13:09:00Z" w16du:dateUtc="2024-11-09T12:09:00Z">
               <w:r>
                 <w:rPr>
                   <w:rFonts w:ascii="Corbel" w:hAnsi="Corbel"/>
@@ -7233,7 +7233,7 @@
                 <w:t>Podíly</w:t>
               </w:r>
             </w:ins>
-            <w:del w:id="73" w:author="Damian Struk" w:date="2024-11-09T13:09:00Z" w16du:dateUtc="2024-11-09T12:09:00Z">
+            <w:del w:id="73" w:author="stella" w:date="2024-11-09T13:09:00Z" w16du:dateUtc="2024-11-09T12:09:00Z">
               <w:r>
                 <w:rPr>
                   <w:rFonts w:ascii="Corbel" w:hAnsi="Corbel"/>
@@ -7258,7 +7258,7 @@
         <w:tc>
           <w:tcPr>
             <w:tcW w:w="6563" w:type="dxa"/>
-            <w:tcPrChange w:id="74" w:author="Damian Struk" w:date="2024-11-09T13:09:00Z" w16du:dateUtc="2024-11-09T12:09:00Z">
+            <w:tcPrChange w:id="74" w:author="stella" w:date="2024-11-09T13:09:00Z" w16du:dateUtc="2024-11-09T12:09:00Z">
               <w:tcPr>
                 <w:tcW w:w="6563" w:type="dxa"/>
               </w:tcPr>
@@ -7277,7 +7277,7 @@
                 <w:lang w:eastAsia="ja-JP"/>
               </w:rPr>
             </w:pPr>
-            <w:ins w:id="75" w:author="Damian Struk" w:date="2024-11-09T13:09:00Z" w16du:dateUtc="2024-11-09T12:09:00Z">
+            <w:ins w:id="75" w:author="stella" w:date="2024-11-09T13:09:00Z" w16du:dateUtc="2024-11-09T12:09:00Z">
               <w:r>
                 <w:rPr>
                   <w:rFonts w:ascii="Corbel" w:hAnsi="Corbel"/>
@@ -7287,7 +7287,7 @@
                 <w:t>znamená společně Podíl 1, Podíl 2, Podíl 3, Podíl 4 a Podíl 5.</w:t>
               </w:r>
             </w:ins>
-            <w:del w:id="76" w:author="Damian Struk" w:date="2024-11-09T13:09:00Z" w16du:dateUtc="2024-11-09T12:09:00Z">
+            <w:del w:id="76" w:author="stella" w:date="2024-11-09T13:09:00Z" w16du:dateUtc="2024-11-09T12:09:00Z">
               <w:r>
                 <w:rPr>
                   <w:rFonts w:ascii="Corbel" w:hAnsi="Corbel"/>
@@ -7369,7 +7369,7 @@
           <w:tblW w:w="9498" w:type="dxa"/>
           <w:tblInd w:w="567" w:type="dxa"/>
           <w:tblLayout w:type="fixed"/>
-          <w:tblPrExChange w:id="77" w:author="Damian Struk" w:date="2024-11-09T13:09:00Z" w16du:dateUtc="2024-11-09T12:09:00Z">
+          <w:tblPrExChange w:id="77" w:author="stella" w:date="2024-11-09T13:09:00Z" w16du:dateUtc="2024-11-09T12:09:00Z">
             <w:tblPrEx>
               <w:tblW w:w="9498" w:type="dxa"/>
               <w:tblInd w:w="567" w:type="dxa"/>
@@ -7379,7 +7379,7 @@
         </w:tblPrEx>
         <w:trPr>
           <w:trHeight w:val="265"/>
-          <w:trPrChange w:id="78" w:author="Damian Struk" w:date="2024-11-09T13:09:00Z" w16du:dateUtc="2024-11-09T12:09:00Z">
+          <w:trPrChange w:id="78" w:author="stella" w:date="2024-11-09T13:09:00Z" w16du:dateUtc="2024-11-09T12:09:00Z">
             <w:trPr>
               <w:trHeight w:val="265"/>
             </w:trPr>
@@ -7388,7 +7388,7 @@
         <w:tc>
           <w:tcPr>
             <w:tcW w:w="709" w:type="dxa"/>
-            <w:tcPrChange w:id="79" w:author="Damian Struk" w:date="2024-11-09T13:09:00Z" w16du:dateUtc="2024-11-09T12:09:00Z">
+            <w:tcPrChange w:id="79" w:author="stella" w:date="2024-11-09T13:09:00Z" w16du:dateUtc="2024-11-09T12:09:00Z">
               <w:tcPr>
                 <w:tcW w:w="709" w:type="dxa"/>
               </w:tcPr>
@@ -7416,7 +7416,7 @@
         <w:tc>
           <w:tcPr>
             <w:tcW w:w="2226" w:type="dxa"/>
-            <w:tcPrChange w:id="80" w:author="Damian Struk" w:date="2024-11-09T13:09:00Z" w16du:dateUtc="2024-11-09T12:09:00Z">
+            <w:tcPrChange w:id="80" w:author="stella" w:date="2024-11-09T13:09:00Z" w16du:dateUtc="2024-11-09T12:09:00Z">
               <w:tcPr>
                 <w:tcW w:w="2226" w:type="dxa"/>
               </w:tcPr>
@@ -7430,14 +7430,14 @@
               <w:ind w:left="-108"/>
               <w:contextualSpacing w:val="0"/>
               <w:rPr>
-                <w:ins w:id="81" w:author="Damian Struk" w:date="2024-11-09T13:09:00Z" w16du:dateUtc="2024-11-09T12:09:00Z"/>
+                <w:ins w:id="81" w:author="stella" w:date="2024-11-09T13:09:00Z" w16du:dateUtc="2024-11-09T12:09:00Z"/>
                 <w:rFonts w:ascii="Corbel" w:hAnsi="Corbel"/>
                 <w:b/>
                 <w:color w:val="575757"/>
                 <w:lang w:eastAsia="ja-JP"/>
               </w:rPr>
             </w:pPr>
-            <w:ins w:id="82" w:author="Damian Struk" w:date="2024-11-09T13:09:00Z" w16du:dateUtc="2024-11-09T12:09:00Z">
+            <w:ins w:id="82" w:author="stella" w:date="2024-11-09T13:09:00Z" w16du:dateUtc="2024-11-09T12:09:00Z">
               <w:r>
                 <w:rPr>
                   <w:rFonts w:ascii="Corbel" w:hAnsi="Corbel"/>
@@ -7472,7 +7472,7 @@
                 <w:lang w:eastAsia="ja-JP"/>
               </w:rPr>
             </w:pPr>
-            <w:del w:id="83" w:author="Damian Struk" w:date="2024-11-09T13:09:00Z" w16du:dateUtc="2024-11-09T12:09:00Z">
+            <w:del w:id="83" w:author="stella" w:date="2024-11-09T13:09:00Z" w16du:dateUtc="2024-11-09T12:09:00Z">
               <w:r>
                 <w:rPr>
                   <w:rFonts w:ascii="Corbel" w:hAnsi="Corbel"/>
@@ -7488,7 +7488,7 @@
         <w:tc>
           <w:tcPr>
             <w:tcW w:w="6563" w:type="dxa"/>
-            <w:tcPrChange w:id="84" w:author="Damian Struk" w:date="2024-11-09T13:09:00Z" w16du:dateUtc="2024-11-09T12:09:00Z">
+            <w:tcPrChange w:id="84" w:author="stella" w:date="2024-11-09T13:09:00Z" w16du:dateUtc="2024-11-09T12:09:00Z">
               <w:tcPr>
                 <w:tcW w:w="6563" w:type="dxa"/>
               </w:tcPr>
@@ -7502,13 +7502,13 @@
               <w:ind w:left="0"/>
               <w:contextualSpacing w:val="0"/>
               <w:rPr>
-                <w:ins w:id="85" w:author="Damian Struk" w:date="2024-11-09T13:09:00Z" w16du:dateUtc="2024-11-09T12:09:00Z"/>
+                <w:ins w:id="85" w:author="stella" w:date="2024-11-09T13:09:00Z" w16du:dateUtc="2024-11-09T12:09:00Z"/>
                 <w:rFonts w:ascii="Corbel" w:hAnsi="Corbel"/>
                 <w:color w:val="575757"/>
                 <w:lang w:eastAsia="ja-JP"/>
               </w:rPr>
             </w:pPr>
-            <w:ins w:id="86" w:author="Damian Struk" w:date="2024-11-09T13:09:00Z" w16du:dateUtc="2024-11-09T12:09:00Z">
+            <w:ins w:id="86" w:author="stella" w:date="2024-11-09T13:09:00Z" w16du:dateUtc="2024-11-09T12:09:00Z">
               <w:r>
                 <w:rPr>
                   <w:rFonts w:ascii="Corbel" w:hAnsi="Corbel"/>
@@ -7642,13 +7642,13 @@
               <w:spacing w:before="120" w:after="120" w:line="300" w:lineRule="exact"/>
               <w:contextualSpacing w:val="0"/>
               <w:rPr>
-                <w:ins w:id="87" w:author="Damian Struk" w:date="2024-11-09T13:09:00Z" w16du:dateUtc="2024-11-09T12:09:00Z"/>
+                <w:ins w:id="87" w:author="stella" w:date="2024-11-09T13:09:00Z" w16du:dateUtc="2024-11-09T12:09:00Z"/>
                 <w:rFonts w:ascii="Corbel" w:hAnsi="Corbel"/>
                 <w:color w:val="575757"/>
                 <w:lang w:eastAsia="ja-JP"/>
               </w:rPr>
             </w:pPr>
-            <w:ins w:id="88" w:author="Damian Struk" w:date="2024-11-09T13:09:00Z" w16du:dateUtc="2024-11-09T12:09:00Z">
+            <w:ins w:id="88" w:author="stella" w:date="2024-11-09T13:09:00Z" w16du:dateUtc="2024-11-09T12:09:00Z">
               <w:r>
                 <w:rPr>
                   <w:rFonts w:ascii="Corbel" w:hAnsi="Corbel"/>
@@ -7686,13 +7686,13 @@
               <w:spacing w:before="120" w:after="120" w:line="300" w:lineRule="exact"/>
               <w:contextualSpacing w:val="0"/>
               <w:rPr>
-                <w:ins w:id="89" w:author="Damian Struk" w:date="2024-11-09T13:09:00Z" w16du:dateUtc="2024-11-09T12:09:00Z"/>
+                <w:ins w:id="89" w:author="stella" w:date="2024-11-09T13:09:00Z" w16du:dateUtc="2024-11-09T12:09:00Z"/>
                 <w:rFonts w:ascii="Corbel" w:hAnsi="Corbel"/>
                 <w:color w:val="575757"/>
                 <w:lang w:eastAsia="ja-JP"/>
               </w:rPr>
             </w:pPr>
-            <w:ins w:id="90" w:author="Damian Struk" w:date="2024-11-09T13:09:00Z" w16du:dateUtc="2024-11-09T12:09:00Z">
+            <w:ins w:id="90" w:author="stella" w:date="2024-11-09T13:09:00Z" w16du:dateUtc="2024-11-09T12:09:00Z">
               <w:r>
                 <w:rPr>
                   <w:rFonts w:ascii="Corbel" w:hAnsi="Corbel"/>
@@ -7772,7 +7772,7 @@
                 <w:lang w:eastAsia="ja-JP"/>
               </w:rPr>
             </w:pPr>
-            <w:ins w:id="91" w:author="Damian Struk" w:date="2024-11-09T13:09:00Z" w16du:dateUtc="2024-11-09T12:09:00Z">
+            <w:ins w:id="91" w:author="stella" w:date="2024-11-09T13:09:00Z" w16du:dateUtc="2024-11-09T12:09:00Z">
               <w:r>
                 <w:rPr>
                   <w:rFonts w:ascii="Corbel" w:hAnsi="Corbel"/>
@@ -7815,7 +7815,7 @@
                 <w:t>upujícího.</w:t>
               </w:r>
             </w:ins>
-            <w:del w:id="92" w:author="Damian Struk" w:date="2024-11-09T13:09:00Z" w16du:dateUtc="2024-11-09T12:09:00Z">
+            <w:del w:id="92" w:author="stella" w:date="2024-11-09T13:09:00Z" w16du:dateUtc="2024-11-09T12:09:00Z">
               <w:r>
                 <w:rPr>
                   <w:rFonts w:ascii="Corbel" w:hAnsi="Corbel"/>
@@ -7833,7 +7833,7 @@
           <w:tblW w:w="9498" w:type="dxa"/>
           <w:tblInd w:w="567" w:type="dxa"/>
           <w:tblLayout w:type="fixed"/>
-          <w:tblPrExChange w:id="93" w:author="Damian Struk" w:date="2024-11-09T13:09:00Z" w16du:dateUtc="2024-11-09T12:09:00Z">
+          <w:tblPrExChange w:id="93" w:author="stella" w:date="2024-11-09T13:09:00Z" w16du:dateUtc="2024-11-09T12:09:00Z">
             <w:tblPrEx>
               <w:tblW w:w="9498" w:type="dxa"/>
               <w:tblInd w:w="567" w:type="dxa"/>
@@ -7843,7 +7843,7 @@
         </w:tblPrEx>
         <w:trPr>
           <w:trHeight w:val="265"/>
-          <w:trPrChange w:id="94" w:author="Damian Struk" w:date="2024-11-09T13:09:00Z" w16du:dateUtc="2024-11-09T12:09:00Z">
+          <w:trPrChange w:id="94" w:author="stella" w:date="2024-11-09T13:09:00Z" w16du:dateUtc="2024-11-09T12:09:00Z">
             <w:trPr>
               <w:trHeight w:val="265"/>
             </w:trPr>
@@ -7852,7 +7852,7 @@
         <w:tc>
           <w:tcPr>
             <w:tcW w:w="709" w:type="dxa"/>
-            <w:tcPrChange w:id="95" w:author="Damian Struk" w:date="2024-11-09T13:09:00Z" w16du:dateUtc="2024-11-09T12:09:00Z">
+            <w:tcPrChange w:id="95" w:author="stella" w:date="2024-11-09T13:09:00Z" w16du:dateUtc="2024-11-09T12:09:00Z">
               <w:tcPr>
                 <w:tcW w:w="709" w:type="dxa"/>
               </w:tcPr>
@@ -7880,7 +7880,7 @@
         <w:tc>
           <w:tcPr>
             <w:tcW w:w="2226" w:type="dxa"/>
-            <w:tcPrChange w:id="96" w:author="Damian Struk" w:date="2024-11-09T13:09:00Z" w16du:dateUtc="2024-11-09T12:09:00Z">
+            <w:tcPrChange w:id="96" w:author="stella" w:date="2024-11-09T13:09:00Z" w16du:dateUtc="2024-11-09T12:09:00Z">
               <w:tcPr>
                 <w:tcW w:w="2226" w:type="dxa"/>
               </w:tcPr>
@@ -7894,14 +7894,14 @@
               <w:ind w:left="-108"/>
               <w:contextualSpacing w:val="0"/>
               <w:rPr>
-                <w:del w:id="97" w:author="Damian Struk" w:date="2024-11-09T13:09:00Z" w16du:dateUtc="2024-11-09T12:09:00Z"/>
+                <w:del w:id="97" w:author="stella" w:date="2024-11-09T13:09:00Z" w16du:dateUtc="2024-11-09T12:09:00Z"/>
                 <w:rFonts w:ascii="Corbel" w:hAnsi="Corbel"/>
                 <w:b/>
                 <w:color w:val="575757"/>
                 <w:lang w:eastAsia="ja-JP"/>
               </w:rPr>
             </w:pPr>
-            <w:ins w:id="98" w:author="Damian Struk" w:date="2024-11-09T13:09:00Z" w16du:dateUtc="2024-11-09T12:09:00Z">
+            <w:ins w:id="98" w:author="stella" w:date="2024-11-09T13:09:00Z" w16du:dateUtc="2024-11-09T12:09:00Z">
               <w:r>
                 <w:rPr>
                   <w:rFonts w:ascii="Corbel" w:hAnsi="Corbel"/>
@@ -7912,7 +7912,7 @@
                 <w:t>Podstatné snížení hodnoty</w:t>
               </w:r>
             </w:ins>
-            <w:del w:id="99" w:author="Damian Struk" w:date="2024-11-09T13:09:00Z" w16du:dateUtc="2024-11-09T12:09:00Z">
+            <w:del w:id="99" w:author="stella" w:date="2024-11-09T13:09:00Z" w16du:dateUtc="2024-11-09T12:09:00Z">
               <w:r>
                 <w:rPr>
                   <w:rFonts w:ascii="Corbel" w:hAnsi="Corbel"/>
@@ -7953,7 +7953,7 @@
         <w:tc>
           <w:tcPr>
             <w:tcW w:w="6563" w:type="dxa"/>
-            <w:tcPrChange w:id="100" w:author="Damian Struk" w:date="2024-11-09T13:09:00Z" w16du:dateUtc="2024-11-09T12:09:00Z">
+            <w:tcPrChange w:id="100" w:author="stella" w:date="2024-11-09T13:09:00Z" w16du:dateUtc="2024-11-09T12:09:00Z">
               <w:tcPr>
                 <w:tcW w:w="6563" w:type="dxa"/>
               </w:tcPr>
@@ -7967,13 +7967,13 @@
               <w:ind w:left="0"/>
               <w:contextualSpacing w:val="0"/>
               <w:rPr>
-                <w:del w:id="101" w:author="Damian Struk" w:date="2024-11-09T13:09:00Z" w16du:dateUtc="2024-11-09T12:09:00Z"/>
+                <w:del w:id="101" w:author="stella" w:date="2024-11-09T13:09:00Z" w16du:dateUtc="2024-11-09T12:09:00Z"/>
                 <w:rFonts w:ascii="Corbel" w:hAnsi="Corbel"/>
                 <w:color w:val="575757"/>
                 <w:lang w:eastAsia="ja-JP"/>
               </w:rPr>
             </w:pPr>
-            <w:ins w:id="102" w:author="Damian Struk" w:date="2024-11-09T13:09:00Z" w16du:dateUtc="2024-11-09T12:09:00Z">
+            <w:ins w:id="102" w:author="stella" w:date="2024-11-09T13:09:00Z" w16du:dateUtc="2024-11-09T12:09:00Z">
               <w:r>
                 <w:rPr>
                   <w:rFonts w:ascii="Corbel" w:hAnsi="Corbel"/>
@@ -8006,7 +8006,7 @@
                 <w:lang w:eastAsia="ja-JP"/>
               </w:rPr>
             </w:r>
-            <w:ins w:id="103" w:author="Damian Struk" w:date="2024-11-09T13:09:00Z" w16du:dateUtc="2024-11-09T12:09:00Z">
+            <w:ins w:id="103" w:author="stella" w:date="2024-11-09T13:09:00Z" w16du:dateUtc="2024-11-09T12:09:00Z">
               <w:r>
                 <w:rPr>
                   <w:rFonts w:ascii="Corbel" w:hAnsi="Corbel"/>
@@ -8040,7 +8040,7 @@
                 <w:t>.</w:t>
               </w:r>
             </w:ins>
-            <w:del w:id="104" w:author="Damian Struk" w:date="2024-11-09T13:09:00Z" w16du:dateUtc="2024-11-09T12:09:00Z">
+            <w:del w:id="104" w:author="stella" w:date="2024-11-09T13:09:00Z" w16du:dateUtc="2024-11-09T12:09:00Z">
               <w:r>
                 <w:rPr>
                   <w:rFonts w:ascii="Corbel" w:hAnsi="Corbel"/>
@@ -8174,13 +8174,13 @@
               <w:spacing w:before="120" w:after="120" w:line="300" w:lineRule="exact"/>
               <w:contextualSpacing w:val="0"/>
               <w:rPr>
-                <w:del w:id="105" w:author="Damian Struk" w:date="2024-11-09T13:09:00Z" w16du:dateUtc="2024-11-09T12:09:00Z"/>
+                <w:del w:id="105" w:author="stella" w:date="2024-11-09T13:09:00Z" w16du:dateUtc="2024-11-09T12:09:00Z"/>
                 <w:rFonts w:ascii="Corbel" w:hAnsi="Corbel"/>
                 <w:color w:val="575757"/>
                 <w:lang w:eastAsia="ja-JP"/>
               </w:rPr>
             </w:pPr>
-            <w:del w:id="106" w:author="Damian Struk" w:date="2024-11-09T13:09:00Z" w16du:dateUtc="2024-11-09T12:09:00Z">
+            <w:del w:id="106" w:author="stella" w:date="2024-11-09T13:09:00Z" w16du:dateUtc="2024-11-09T12:09:00Z">
               <w:r>
                 <w:rPr>
                   <w:rFonts w:ascii="Corbel" w:hAnsi="Corbel"/>
@@ -8218,13 +8218,13 @@
               <w:spacing w:before="120" w:after="120" w:line="300" w:lineRule="exact"/>
               <w:contextualSpacing w:val="0"/>
               <w:rPr>
-                <w:del w:id="107" w:author="Damian Struk" w:date="2024-11-09T13:09:00Z" w16du:dateUtc="2024-11-09T12:09:00Z"/>
+                <w:del w:id="107" w:author="stella" w:date="2024-11-09T13:09:00Z" w16du:dateUtc="2024-11-09T12:09:00Z"/>
                 <w:rFonts w:ascii="Corbel" w:hAnsi="Corbel"/>
                 <w:color w:val="575757"/>
                 <w:lang w:eastAsia="ja-JP"/>
               </w:rPr>
             </w:pPr>
-            <w:del w:id="108" w:author="Damian Struk" w:date="2024-11-09T13:09:00Z" w16du:dateUtc="2024-11-09T12:09:00Z">
+            <w:del w:id="108" w:author="stella" w:date="2024-11-09T13:09:00Z" w16du:dateUtc="2024-11-09T12:09:00Z">
               <w:r>
                 <w:rPr>
                   <w:rFonts w:ascii="Corbel" w:hAnsi="Corbel"/>
@@ -8307,7 +8307,7 @@
                 <w:lang w:eastAsia="ja-JP"/>
               </w:rPr>
             </w:pPr>
-            <w:del w:id="109" w:author="Damian Struk" w:date="2024-11-09T13:09:00Z" w16du:dateUtc="2024-11-09T12:09:00Z">
+            <w:del w:id="109" w:author="stella" w:date="2024-11-09T13:09:00Z" w16du:dateUtc="2024-11-09T12:09:00Z">
               <w:r>
                 <w:rPr>
                   <w:rFonts w:ascii="Corbel" w:hAnsi="Corbel"/>
@@ -8357,7 +8357,7 @@
           <w:tblW w:w="9498" w:type="dxa"/>
           <w:tblInd w:w="567" w:type="dxa"/>
           <w:tblLayout w:type="fixed"/>
-          <w:tblPrExChange w:id="110" w:author="Damian Struk" w:date="2024-11-09T13:09:00Z" w16du:dateUtc="2024-11-09T12:09:00Z">
+          <w:tblPrExChange w:id="110" w:author="stella" w:date="2024-11-09T13:09:00Z" w16du:dateUtc="2024-11-09T12:09:00Z">
             <w:tblPrEx>
               <w:tblW w:w="9498" w:type="dxa"/>
               <w:tblInd w:w="567" w:type="dxa"/>
@@ -8367,7 +8367,7 @@
         </w:tblPrEx>
         <w:trPr>
           <w:trHeight w:val="265"/>
-          <w:trPrChange w:id="111" w:author="Damian Struk" w:date="2024-11-09T13:09:00Z" w16du:dateUtc="2024-11-09T12:09:00Z">
+          <w:trPrChange w:id="111" w:author="stella" w:date="2024-11-09T13:09:00Z" w16du:dateUtc="2024-11-09T12:09:00Z">
             <w:trPr>
               <w:trHeight w:val="265"/>
             </w:trPr>
@@ -8376,7 +8376,7 @@
         <w:tc>
           <w:tcPr>
             <w:tcW w:w="709" w:type="dxa"/>
-            <w:tcPrChange w:id="112" w:author="Damian Struk" w:date="2024-11-09T13:09:00Z" w16du:dateUtc="2024-11-09T12:09:00Z">
+            <w:tcPrChange w:id="112" w:author="stella" w:date="2024-11-09T13:09:00Z" w16du:dateUtc="2024-11-09T12:09:00Z">
               <w:tcPr>
                 <w:tcW w:w="709" w:type="dxa"/>
               </w:tcPr>
@@ -8404,7 +8404,7 @@
         <w:tc>
           <w:tcPr>
             <w:tcW w:w="2226" w:type="dxa"/>
-            <w:tcPrChange w:id="113" w:author="Damian Struk" w:date="2024-11-09T13:09:00Z" w16du:dateUtc="2024-11-09T12:09:00Z">
+            <w:tcPrChange w:id="113" w:author="stella" w:date="2024-11-09T13:09:00Z" w16du:dateUtc="2024-11-09T12:09:00Z">
               <w:tcPr>
                 <w:tcW w:w="2226" w:type="dxa"/>
               </w:tcPr>
@@ -8424,7 +8424,7 @@
                 <w:lang w:eastAsia="ja-JP"/>
               </w:rPr>
             </w:pPr>
-            <w:ins w:id="114" w:author="Damian Struk" w:date="2024-11-09T13:09:00Z" w16du:dateUtc="2024-11-09T12:09:00Z">
+            <w:ins w:id="114" w:author="stella" w:date="2024-11-09T13:09:00Z" w16du:dateUtc="2024-11-09T12:09:00Z">
               <w:r>
                 <w:rPr>
                   <w:rFonts w:ascii="Corbel" w:hAnsi="Corbel"/>
@@ -8435,7 +8435,7 @@
                 <w:t>Porušení záruky</w:t>
               </w:r>
             </w:ins>
-            <w:del w:id="115" w:author="Damian Struk" w:date="2024-11-09T13:09:00Z" w16du:dateUtc="2024-11-09T12:09:00Z">
+            <w:del w:id="115" w:author="stella" w:date="2024-11-09T13:09:00Z" w16du:dateUtc="2024-11-09T12:09:00Z">
               <w:r>
                 <w:rPr>
                   <w:rFonts w:ascii="Corbel" w:hAnsi="Corbel"/>
@@ -8451,7 +8451,7 @@
         <w:tc>
           <w:tcPr>
             <w:tcW w:w="6563" w:type="dxa"/>
-            <w:tcPrChange w:id="116" w:author="Damian Struk" w:date="2024-11-09T13:09:00Z" w16du:dateUtc="2024-11-09T12:09:00Z">
+            <w:tcPrChange w:id="116" w:author="stella" w:date="2024-11-09T13:09:00Z" w16du:dateUtc="2024-11-09T12:09:00Z">
               <w:tcPr>
                 <w:tcW w:w="6563" w:type="dxa"/>
               </w:tcPr>
@@ -8470,7 +8470,7 @@
                 <w:lang w:eastAsia="ja-JP"/>
               </w:rPr>
             </w:pPr>
-            <w:ins w:id="117" w:author="Damian Struk" w:date="2024-11-09T13:09:00Z" w16du:dateUtc="2024-11-09T12:09:00Z">
+            <w:ins w:id="117" w:author="stella" w:date="2024-11-09T13:09:00Z" w16du:dateUtc="2024-11-09T12:09:00Z">
               <w:r>
                 <w:rPr>
                   <w:rFonts w:ascii="Corbel" w:hAnsi="Corbel"/>
@@ -8503,7 +8503,7 @@
                 <w:lang w:eastAsia="ja-JP"/>
               </w:rPr>
             </w:r>
-            <w:ins w:id="118" w:author="Damian Struk" w:date="2024-11-09T13:09:00Z" w16du:dateUtc="2024-11-09T12:09:00Z">
+            <w:ins w:id="118" w:author="stella" w:date="2024-11-09T13:09:00Z" w16du:dateUtc="2024-11-09T12:09:00Z">
               <w:r>
                 <w:rPr>
                   <w:rFonts w:ascii="Corbel" w:hAnsi="Corbel"/>
@@ -8537,7 +8537,7 @@
                 <w:t>.</w:t>
               </w:r>
             </w:ins>
-            <w:del w:id="119" w:author="Damian Struk" w:date="2024-11-09T13:09:00Z" w16du:dateUtc="2024-11-09T12:09:00Z">
+            <w:del w:id="119" w:author="stella" w:date="2024-11-09T13:09:00Z" w16du:dateUtc="2024-11-09T12:09:00Z">
               <w:r>
                 <w:rPr>
                   <w:rFonts w:ascii="Corbel" w:hAnsi="Corbel"/>
@@ -8610,7 +8610,7 @@
           <w:tblW w:w="9498" w:type="dxa"/>
           <w:tblInd w:w="567" w:type="dxa"/>
           <w:tblLayout w:type="fixed"/>
-          <w:tblPrExChange w:id="120" w:author="Damian Struk" w:date="2024-11-09T13:09:00Z" w16du:dateUtc="2024-11-09T12:09:00Z">
+          <w:tblPrExChange w:id="120" w:author="stella" w:date="2024-11-09T13:09:00Z" w16du:dateUtc="2024-11-09T12:09:00Z">
             <w:tblPrEx>
               <w:tblW w:w="9498" w:type="dxa"/>
               <w:tblInd w:w="567" w:type="dxa"/>
@@ -8621,7 +8621,7 @@
         <w:tc>
           <w:tcPr>
             <w:tcW w:w="709" w:type="dxa"/>
-            <w:tcPrChange w:id="121" w:author="Damian Struk" w:date="2024-11-09T13:09:00Z" w16du:dateUtc="2024-11-09T12:09:00Z">
+            <w:tcPrChange w:id="121" w:author="stella" w:date="2024-11-09T13:09:00Z" w16du:dateUtc="2024-11-09T12:09:00Z">
               <w:tcPr>
                 <w:tcW w:w="709" w:type="dxa"/>
               </w:tcPr>
@@ -8649,7 +8649,7 @@
         <w:tc>
           <w:tcPr>
             <w:tcW w:w="2226" w:type="dxa"/>
-            <w:tcPrChange w:id="122" w:author="Damian Struk" w:date="2024-11-09T13:09:00Z" w16du:dateUtc="2024-11-09T12:09:00Z">
+            <w:tcPrChange w:id="122" w:author="stella" w:date="2024-11-09T13:09:00Z" w16du:dateUtc="2024-11-09T12:09:00Z">
               <w:tcPr>
                 <w:tcW w:w="2226" w:type="dxa"/>
               </w:tcPr>
@@ -8669,7 +8669,7 @@
                 <w:lang w:eastAsia="ja-JP"/>
               </w:rPr>
             </w:pPr>
-            <w:ins w:id="123" w:author="Damian Struk" w:date="2024-11-09T13:09:00Z" w16du:dateUtc="2024-11-09T12:09:00Z">
+            <w:ins w:id="123" w:author="stella" w:date="2024-11-09T13:09:00Z" w16du:dateUtc="2024-11-09T12:09:00Z">
               <w:r>
                 <w:rPr>
                   <w:rFonts w:ascii="Corbel" w:hAnsi="Corbel"/>
@@ -8698,7 +8698,7 @@
                 <w:t>k</w:t>
               </w:r>
             </w:ins>
-            <w:del w:id="124" w:author="Damian Struk" w:date="2024-11-09T13:09:00Z" w16du:dateUtc="2024-11-09T12:09:00Z">
+            <w:del w:id="124" w:author="stella" w:date="2024-11-09T13:09:00Z" w16du:dateUtc="2024-11-09T12:09:00Z">
               <w:r>
                 <w:rPr>
                   <w:rFonts w:ascii="Corbel" w:hAnsi="Corbel"/>
@@ -8714,7 +8714,7 @@
         <w:tc>
           <w:tcPr>
             <w:tcW w:w="6563" w:type="dxa"/>
-            <w:tcPrChange w:id="125" w:author="Damian Struk" w:date="2024-11-09T13:09:00Z" w16du:dateUtc="2024-11-09T12:09:00Z">
+            <w:tcPrChange w:id="125" w:author="stella" w:date="2024-11-09T13:09:00Z" w16du:dateUtc="2024-11-09T12:09:00Z">
               <w:tcPr>
                 <w:tcW w:w="6563" w:type="dxa"/>
               </w:tcPr>
@@ -8736,7 +8736,7 @@
                 <w:lang w:eastAsia="ja-JP"/>
               </w:rPr>
             </w:pPr>
-            <w:ins w:id="126" w:author="Damian Struk" w:date="2024-11-09T13:09:00Z" w16du:dateUtc="2024-11-09T12:09:00Z">
+            <w:ins w:id="126" w:author="stella" w:date="2024-11-09T13:09:00Z" w16du:dateUtc="2024-11-09T12:09:00Z">
               <w:r>
                 <w:rPr>
                   <w:rFonts w:ascii="Corbel" w:hAnsi="Corbel"/>
@@ -8795,7 +8795,7 @@
                 <w:t>, který je ve vlastnictví Prodávajícího 3.</w:t>
               </w:r>
             </w:ins>
-            <w:del w:id="127" w:author="Damian Struk" w:date="2024-11-09T13:09:00Z" w16du:dateUtc="2024-11-09T12:09:00Z">
+            <w:del w:id="127" w:author="stella" w:date="2024-11-09T13:09:00Z" w16du:dateUtc="2024-11-09T12:09:00Z">
               <w:r>
                 <w:rPr>
                   <w:rFonts w:ascii="Corbel" w:hAnsi="Corbel"/>
@@ -8868,7 +8868,7 @@
           <w:tblW w:w="9498" w:type="dxa"/>
           <w:tblInd w:w="567" w:type="dxa"/>
           <w:tblLayout w:type="fixed"/>
-          <w:tblPrExChange w:id="128" w:author="Damian Struk" w:date="2024-11-09T13:09:00Z" w16du:dateUtc="2024-11-09T12:09:00Z">
+          <w:tblPrExChange w:id="128" w:author="stella" w:date="2024-11-09T13:09:00Z" w16du:dateUtc="2024-11-09T12:09:00Z">
             <w:tblPrEx>
               <w:tblW w:w="9498" w:type="dxa"/>
               <w:tblInd w:w="567" w:type="dxa"/>
@@ -8879,7 +8879,7 @@
         <w:tc>
           <w:tcPr>
             <w:tcW w:w="709" w:type="dxa"/>
-            <w:tcPrChange w:id="129" w:author="Damian Struk" w:date="2024-11-09T13:09:00Z" w16du:dateUtc="2024-11-09T12:09:00Z">
+            <w:tcPrChange w:id="129" w:author="stella" w:date="2024-11-09T13:09:00Z" w16du:dateUtc="2024-11-09T12:09:00Z">
               <w:tcPr>
                 <w:tcW w:w="709" w:type="dxa"/>
               </w:tcPr>
@@ -8907,7 +8907,7 @@
         <w:tc>
           <w:tcPr>
             <w:tcW w:w="2226" w:type="dxa"/>
-            <w:tcPrChange w:id="130" w:author="Damian Struk" w:date="2024-11-09T13:09:00Z" w16du:dateUtc="2024-11-09T12:09:00Z">
+            <w:tcPrChange w:id="130" w:author="stella" w:date="2024-11-09T13:09:00Z" w16du:dateUtc="2024-11-09T12:09:00Z">
               <w:tcPr>
                 <w:tcW w:w="2226" w:type="dxa"/>
               </w:tcPr>
@@ -8927,7 +8927,7 @@
                 <w:lang w:eastAsia="ja-JP"/>
               </w:rPr>
             </w:pPr>
-            <w:ins w:id="131" w:author="Damian Struk" w:date="2024-11-09T13:09:00Z" w16du:dateUtc="2024-11-09T12:09:00Z">
+            <w:ins w:id="131" w:author="stella" w:date="2024-11-09T13:09:00Z" w16du:dateUtc="2024-11-09T12:09:00Z">
               <w:r>
                 <w:rPr>
                   <w:rFonts w:ascii="Corbel" w:hAnsi="Corbel"/>
@@ -8938,7 +8938,7 @@
                 <w:t>Práva třetích osob</w:t>
               </w:r>
             </w:ins>
-            <w:del w:id="132" w:author="Damian Struk" w:date="2024-11-09T13:09:00Z" w16du:dateUtc="2024-11-09T12:09:00Z">
+            <w:del w:id="132" w:author="stella" w:date="2024-11-09T13:09:00Z" w16du:dateUtc="2024-11-09T12:09:00Z">
               <w:r>
                 <w:rPr>
                   <w:rFonts w:ascii="Corbel" w:hAnsi="Corbel"/>
@@ -8972,7 +8972,7 @@
         <w:tc>
           <w:tcPr>
             <w:tcW w:w="6563" w:type="dxa"/>
-            <w:tcPrChange w:id="133" w:author="Damian Struk" w:date="2024-11-09T13:09:00Z" w16du:dateUtc="2024-11-09T12:09:00Z">
+            <w:tcPrChange w:id="133" w:author="stella" w:date="2024-11-09T13:09:00Z" w16du:dateUtc="2024-11-09T12:09:00Z">
               <w:tcPr>
                 <w:tcW w:w="6563" w:type="dxa"/>
               </w:tcPr>
@@ -8988,7 +8988,7 @@
                 <w:lang w:eastAsia="ja-JP"/>
               </w:rPr>
             </w:pPr>
-            <w:ins w:id="134" w:author="Damian Struk" w:date="2024-11-09T13:09:00Z" w16du:dateUtc="2024-11-09T12:09:00Z">
+            <w:ins w:id="134" w:author="stella" w:date="2024-11-09T13:09:00Z" w16du:dateUtc="2024-11-09T12:09:00Z">
               <w:r>
                 <w:rPr>
                   <w:rFonts w:ascii="Corbel" w:hAnsi="Corbel"/>
@@ -9094,7 +9094,7 @@
                 <w:t>, a to ve prospěch jakékoli osoby jiné než osoby Kupujícího.</w:t>
               </w:r>
             </w:ins>
-            <w:del w:id="135" w:author="Damian Struk" w:date="2024-11-09T13:09:00Z" w16du:dateUtc="2024-11-09T12:09:00Z">
+            <w:del w:id="135" w:author="stella" w:date="2024-11-09T13:09:00Z" w16du:dateUtc="2024-11-09T12:09:00Z">
               <w:r>
                 <w:rPr>
                   <w:rFonts w:ascii="Corbel" w:hAnsi="Corbel"/>
@@ -9127,7 +9127,7 @@
           <w:tblW w:w="9498" w:type="dxa"/>
           <w:tblInd w:w="567" w:type="dxa"/>
           <w:tblLayout w:type="fixed"/>
-          <w:tblPrExChange w:id="136" w:author="Damian Struk" w:date="2024-11-09T13:09:00Z" w16du:dateUtc="2024-11-09T12:09:00Z">
+          <w:tblPrExChange w:id="136" w:author="stella" w:date="2024-11-09T13:09:00Z" w16du:dateUtc="2024-11-09T12:09:00Z">
             <w:tblPrEx>
               <w:tblW w:w="9498" w:type="dxa"/>
               <w:tblInd w:w="567" w:type="dxa"/>
@@ -9138,7 +9138,7 @@
         <w:tc>
           <w:tcPr>
             <w:tcW w:w="709" w:type="dxa"/>
-            <w:tcPrChange w:id="137" w:author="Damian Struk" w:date="2024-11-09T13:09:00Z" w16du:dateUtc="2024-11-09T12:09:00Z">
+            <w:tcPrChange w:id="137" w:author="stella" w:date="2024-11-09T13:09:00Z" w16du:dateUtc="2024-11-09T12:09:00Z">
               <w:tcPr>
                 <w:tcW w:w="709" w:type="dxa"/>
               </w:tcPr>
@@ -9168,7 +9168,7 @@
         <w:tc>
           <w:tcPr>
             <w:tcW w:w="2226" w:type="dxa"/>
-            <w:tcPrChange w:id="139" w:author="Damian Struk" w:date="2024-11-09T13:09:00Z" w16du:dateUtc="2024-11-09T12:09:00Z">
+            <w:tcPrChange w:id="139" w:author="stella" w:date="2024-11-09T13:09:00Z" w16du:dateUtc="2024-11-09T12:09:00Z">
               <w:tcPr>
                 <w:tcW w:w="2226" w:type="dxa"/>
               </w:tcPr>
@@ -9188,7 +9188,7 @@
                 <w:lang w:eastAsia="ja-JP"/>
               </w:rPr>
             </w:pPr>
-            <w:ins w:id="140" w:author="Damian Struk" w:date="2024-11-09T13:09:00Z" w16du:dateUtc="2024-11-09T12:09:00Z">
+            <w:ins w:id="140" w:author="stella" w:date="2024-11-09T13:09:00Z" w16du:dateUtc="2024-11-09T12:09:00Z">
               <w:r>
                 <w:rPr>
                   <w:rFonts w:ascii="Corbel" w:hAnsi="Corbel"/>
@@ -9199,7 +9199,7 @@
                 <w:t>Prohlášení</w:t>
               </w:r>
             </w:ins>
-            <w:del w:id="141" w:author="Damian Struk" w:date="2024-11-09T13:09:00Z" w16du:dateUtc="2024-11-09T12:09:00Z">
+            <w:del w:id="141" w:author="stella" w:date="2024-11-09T13:09:00Z" w16du:dateUtc="2024-11-09T12:09:00Z">
               <w:r>
                 <w:rPr>
                   <w:rFonts w:ascii="Corbel" w:hAnsi="Corbel"/>
@@ -9215,7 +9215,7 @@
         <w:tc>
           <w:tcPr>
             <w:tcW w:w="6563" w:type="dxa"/>
-            <w:tcPrChange w:id="142" w:author="Damian Struk" w:date="2024-11-09T13:09:00Z" w16du:dateUtc="2024-11-09T12:09:00Z">
+            <w:tcPrChange w:id="142" w:author="stella" w:date="2024-11-09T13:09:00Z" w16du:dateUtc="2024-11-09T12:09:00Z">
               <w:tcPr>
                 <w:tcW w:w="6563" w:type="dxa"/>
               </w:tcPr>
@@ -9234,7 +9234,7 @@
                 <w:lang w:eastAsia="ja-JP"/>
               </w:rPr>
             </w:pPr>
-            <w:ins w:id="143" w:author="Damian Struk" w:date="2024-11-09T13:09:00Z" w16du:dateUtc="2024-11-09T12:09:00Z">
+            <w:ins w:id="143" w:author="stella" w:date="2024-11-09T13:09:00Z" w16du:dateUtc="2024-11-09T12:09:00Z">
               <w:r>
                 <w:rPr>
                   <w:rFonts w:ascii="Corbel" w:hAnsi="Corbel"/>
@@ -9267,7 +9267,7 @@
                 <w:lang w:eastAsia="ja-JP"/>
               </w:rPr>
             </w:r>
-            <w:ins w:id="144" w:author="Damian Struk" w:date="2024-11-09T13:09:00Z" w16du:dateUtc="2024-11-09T12:09:00Z">
+            <w:ins w:id="144" w:author="stella" w:date="2024-11-09T13:09:00Z" w16du:dateUtc="2024-11-09T12:09:00Z">
               <w:r>
                 <w:rPr>
                   <w:rFonts w:ascii="Corbel" w:hAnsi="Corbel"/>
@@ -9301,7 +9301,7 @@
                 <w:t xml:space="preserve">. </w:t>
               </w:r>
             </w:ins>
-            <w:del w:id="145" w:author="Damian Struk" w:date="2024-11-09T13:09:00Z" w16du:dateUtc="2024-11-09T12:09:00Z">
+            <w:del w:id="145" w:author="stella" w:date="2024-11-09T13:09:00Z" w16du:dateUtc="2024-11-09T12:09:00Z">
               <w:r>
                 <w:rPr>
                   <w:rFonts w:ascii="Corbel" w:hAnsi="Corbel"/>
@@ -9415,7 +9415,7 @@
           <w:tblW w:w="9498" w:type="dxa"/>
           <w:tblInd w:w="567" w:type="dxa"/>
           <w:tblLayout w:type="fixed"/>
-          <w:tblPrExChange w:id="146" w:author="Damian Struk" w:date="2024-11-09T13:09:00Z" w16du:dateUtc="2024-11-09T12:09:00Z">
+          <w:tblPrExChange w:id="146" w:author="stella" w:date="2024-11-09T13:09:00Z" w16du:dateUtc="2024-11-09T12:09:00Z">
             <w:tblPrEx>
               <w:tblW w:w="9498" w:type="dxa"/>
               <w:tblInd w:w="567" w:type="dxa"/>
@@ -9426,7 +9426,7 @@
         <w:tc>
           <w:tcPr>
             <w:tcW w:w="709" w:type="dxa"/>
-            <w:tcPrChange w:id="147" w:author="Damian Struk" w:date="2024-11-09T13:09:00Z" w16du:dateUtc="2024-11-09T12:09:00Z">
+            <w:tcPrChange w:id="147" w:author="stella" w:date="2024-11-09T13:09:00Z" w16du:dateUtc="2024-11-09T12:09:00Z">
               <w:tcPr>
                 <w:tcW w:w="709" w:type="dxa"/>
               </w:tcPr>
@@ -9456,7 +9456,7 @@
         <w:tc>
           <w:tcPr>
             <w:tcW w:w="2226" w:type="dxa"/>
-            <w:tcPrChange w:id="149" w:author="Damian Struk" w:date="2024-11-09T13:09:00Z" w16du:dateUtc="2024-11-09T12:09:00Z">
+            <w:tcPrChange w:id="149" w:author="stella" w:date="2024-11-09T13:09:00Z" w16du:dateUtc="2024-11-09T12:09:00Z">
               <w:tcPr>
                 <w:tcW w:w="2226" w:type="dxa"/>
               </w:tcPr>
@@ -9476,7 +9476,7 @@
                 <w:lang w:eastAsia="ja-JP"/>
               </w:rPr>
             </w:pPr>
-            <w:ins w:id="150" w:author="Damian Struk" w:date="2024-11-09T13:09:00Z" w16du:dateUtc="2024-11-09T12:09:00Z">
+            <w:ins w:id="150" w:author="stella" w:date="2024-11-09T13:09:00Z" w16du:dateUtc="2024-11-09T12:09:00Z">
               <w:r>
                 <w:rPr>
                   <w:rFonts w:ascii="Corbel" w:hAnsi="Corbel"/>
@@ -9487,7 +9487,7 @@
                 <w:t>Registr smluv</w:t>
               </w:r>
             </w:ins>
-            <w:del w:id="151" w:author="Damian Struk" w:date="2024-11-09T13:09:00Z" w16du:dateUtc="2024-11-09T12:09:00Z">
+            <w:del w:id="151" w:author="stella" w:date="2024-11-09T13:09:00Z" w16du:dateUtc="2024-11-09T12:09:00Z">
               <w:r>
                 <w:rPr>
                   <w:rFonts w:ascii="Corbel" w:hAnsi="Corbel"/>
@@ -9503,7 +9503,7 @@
         <w:tc>
           <w:tcPr>
             <w:tcW w:w="6563" w:type="dxa"/>
-            <w:tcPrChange w:id="152" w:author="Damian Struk" w:date="2024-11-09T13:09:00Z" w16du:dateUtc="2024-11-09T12:09:00Z">
+            <w:tcPrChange w:id="152" w:author="stella" w:date="2024-11-09T13:09:00Z" w16du:dateUtc="2024-11-09T12:09:00Z">
               <w:tcPr>
                 <w:tcW w:w="6563" w:type="dxa"/>
               </w:tcPr>
@@ -9522,7 +9522,7 @@
                 <w:lang w:eastAsia="ja-JP"/>
               </w:rPr>
             </w:pPr>
-            <w:ins w:id="153" w:author="Damian Struk" w:date="2024-11-09T13:09:00Z" w16du:dateUtc="2024-11-09T12:09:00Z">
+            <w:ins w:id="153" w:author="stella" w:date="2024-11-09T13:09:00Z" w16du:dateUtc="2024-11-09T12:09:00Z">
               <w:r>
                 <w:rPr>
                   <w:rFonts w:ascii="Corbel" w:hAnsi="Corbel"/>
@@ -9532,7 +9532,7 @@
                 <w:t>znamená registr smluv ve smyslu Zákona o registru smluv.</w:t>
               </w:r>
             </w:ins>
-            <w:del w:id="154" w:author="Damian Struk" w:date="2024-11-09T13:09:00Z" w16du:dateUtc="2024-11-09T12:09:00Z">
+            <w:del w:id="154" w:author="stella" w:date="2024-11-09T13:09:00Z" w16du:dateUtc="2024-11-09T12:09:00Z">
               <w:r>
                 <w:rPr>
                   <w:rFonts w:ascii="Corbel" w:hAnsi="Corbel"/>
@@ -9605,7 +9605,7 @@
           <w:tblW w:w="9498" w:type="dxa"/>
           <w:tblInd w:w="567" w:type="dxa"/>
           <w:tblLayout w:type="fixed"/>
-          <w:tblPrExChange w:id="155" w:author="Damian Struk" w:date="2024-11-09T13:09:00Z" w16du:dateUtc="2024-11-09T12:09:00Z">
+          <w:tblPrExChange w:id="155" w:author="stella" w:date="2024-11-09T13:09:00Z" w16du:dateUtc="2024-11-09T12:09:00Z">
             <w:tblPrEx>
               <w:tblW w:w="9498" w:type="dxa"/>
               <w:tblInd w:w="567" w:type="dxa"/>
@@ -9616,7 +9616,7 @@
         <w:tc>
           <w:tcPr>
             <w:tcW w:w="709" w:type="dxa"/>
-            <w:tcPrChange w:id="156" w:author="Damian Struk" w:date="2024-11-09T13:09:00Z" w16du:dateUtc="2024-11-09T12:09:00Z">
+            <w:tcPrChange w:id="156" w:author="stella" w:date="2024-11-09T13:09:00Z" w16du:dateUtc="2024-11-09T12:09:00Z">
               <w:tcPr>
                 <w:tcW w:w="709" w:type="dxa"/>
               </w:tcPr>
@@ -9644,7 +9644,7 @@
         <w:tc>
           <w:tcPr>
             <w:tcW w:w="2226" w:type="dxa"/>
-            <w:tcPrChange w:id="157" w:author="Damian Struk" w:date="2024-11-09T13:09:00Z" w16du:dateUtc="2024-11-09T12:09:00Z">
+            <w:tcPrChange w:id="157" w:author="stella" w:date="2024-11-09T13:09:00Z" w16du:dateUtc="2024-11-09T12:09:00Z">
               <w:tcPr>
                 <w:tcW w:w="2226" w:type="dxa"/>
               </w:tcPr>
@@ -9664,7 +9664,7 @@
                 <w:lang w:eastAsia="ja-JP"/>
               </w:rPr>
             </w:pPr>
-            <w:ins w:id="158" w:author="Damian Struk" w:date="2024-11-09T13:09:00Z" w16du:dateUtc="2024-11-09T12:09:00Z">
+            <w:ins w:id="158" w:author="stella" w:date="2024-11-09T13:09:00Z" w16du:dateUtc="2024-11-09T12:09:00Z">
               <w:r>
                 <w:rPr>
                   <w:rFonts w:ascii="Corbel" w:hAnsi="Corbel"/>
@@ -9675,7 +9675,7 @@
                 <w:t>Sdělení</w:t>
               </w:r>
             </w:ins>
-            <w:del w:id="159" w:author="Damian Struk" w:date="2024-11-09T13:09:00Z" w16du:dateUtc="2024-11-09T12:09:00Z">
+            <w:del w:id="159" w:author="stella" w:date="2024-11-09T13:09:00Z" w16du:dateUtc="2024-11-09T12:09:00Z">
               <w:r>
                 <w:rPr>
                   <w:rFonts w:ascii="Corbel" w:hAnsi="Corbel"/>
@@ -9691,7 +9691,7 @@
         <w:tc>
           <w:tcPr>
             <w:tcW w:w="6563" w:type="dxa"/>
-            <w:tcPrChange w:id="160" w:author="Damian Struk" w:date="2024-11-09T13:09:00Z" w16du:dateUtc="2024-11-09T12:09:00Z">
+            <w:tcPrChange w:id="160" w:author="stella" w:date="2024-11-09T13:09:00Z" w16du:dateUtc="2024-11-09T12:09:00Z">
               <w:tcPr>
                 <w:tcW w:w="6563" w:type="dxa"/>
               </w:tcPr>
@@ -9710,7 +9710,7 @@
                 <w:lang w:eastAsia="ja-JP"/>
               </w:rPr>
             </w:pPr>
-            <w:ins w:id="161" w:author="Damian Struk" w:date="2024-11-09T13:09:00Z" w16du:dateUtc="2024-11-09T12:09:00Z">
+            <w:ins w:id="161" w:author="stella" w:date="2024-11-09T13:09:00Z" w16du:dateUtc="2024-11-09T12:09:00Z">
               <w:r>
                 <w:rPr>
                   <w:rFonts w:ascii="Corbel" w:hAnsi="Corbel"/>
@@ -9743,7 +9743,7 @@
                 <w:lang w:eastAsia="ja-JP"/>
               </w:rPr>
             </w:r>
-            <w:ins w:id="162" w:author="Damian Struk" w:date="2024-11-09T13:09:00Z" w16du:dateUtc="2024-11-09T12:09:00Z">
+            <w:ins w:id="162" w:author="stella" w:date="2024-11-09T13:09:00Z" w16du:dateUtc="2024-11-09T12:09:00Z">
               <w:r>
                 <w:rPr>
                   <w:rFonts w:ascii="Corbel" w:hAnsi="Corbel"/>
@@ -9777,7 +9777,7 @@
                 <w:t>.</w:t>
               </w:r>
             </w:ins>
-            <w:del w:id="163" w:author="Damian Struk" w:date="2024-11-09T13:09:00Z" w16du:dateUtc="2024-11-09T12:09:00Z">
+            <w:del w:id="163" w:author="stella" w:date="2024-11-09T13:09:00Z" w16du:dateUtc="2024-11-09T12:09:00Z">
               <w:r>
                 <w:rPr>
                   <w:rFonts w:ascii="Corbel" w:hAnsi="Corbel"/>
@@ -9795,7 +9795,7 @@
           <w:tblW w:w="9498" w:type="dxa"/>
           <w:tblInd w:w="567" w:type="dxa"/>
           <w:tblLayout w:type="fixed"/>
-          <w:tblPrExChange w:id="164" w:author="Damian Struk" w:date="2024-11-09T13:09:00Z" w16du:dateUtc="2024-11-09T12:09:00Z">
+          <w:tblPrExChange w:id="164" w:author="stella" w:date="2024-11-09T13:09:00Z" w16du:dateUtc="2024-11-09T12:09:00Z">
             <w:tblPrEx>
               <w:tblW w:w="9498" w:type="dxa"/>
               <w:tblInd w:w="567" w:type="dxa"/>
@@ -9806,7 +9806,7 @@
         <w:tc>
           <w:tcPr>
             <w:tcW w:w="709" w:type="dxa"/>
-            <w:tcPrChange w:id="165" w:author="Damian Struk" w:date="2024-11-09T13:09:00Z" w16du:dateUtc="2024-11-09T12:09:00Z">
+            <w:tcPrChange w:id="165" w:author="stella" w:date="2024-11-09T13:09:00Z" w16du:dateUtc="2024-11-09T12:09:00Z">
               <w:tcPr>
                 <w:tcW w:w="709" w:type="dxa"/>
               </w:tcPr>
@@ -9834,7 +9834,7 @@
         <w:tc>
           <w:tcPr>
             <w:tcW w:w="2226" w:type="dxa"/>
-            <w:tcPrChange w:id="166" w:author="Damian Struk" w:date="2024-11-09T13:09:00Z" w16du:dateUtc="2024-11-09T12:09:00Z">
+            <w:tcPrChange w:id="166" w:author="stella" w:date="2024-11-09T13:09:00Z" w16du:dateUtc="2024-11-09T12:09:00Z">
               <w:tcPr>
                 <w:tcW w:w="2226" w:type="dxa"/>
               </w:tcPr>
@@ -9854,7 +9854,7 @@
                 <w:lang w:eastAsia="ja-JP"/>
               </w:rPr>
             </w:pPr>
-            <w:ins w:id="167" w:author="Damian Struk" w:date="2024-11-09T13:09:00Z" w16du:dateUtc="2024-11-09T12:09:00Z">
+            <w:ins w:id="167" w:author="stella" w:date="2024-11-09T13:09:00Z" w16du:dateUtc="2024-11-09T12:09:00Z">
               <w:r>
                 <w:rPr>
                   <w:rFonts w:ascii="Corbel" w:hAnsi="Corbel"/>
@@ -9865,7 +9865,7 @@
                 <w:t>Seznam bankovních účtů</w:t>
               </w:r>
             </w:ins>
-            <w:del w:id="168" w:author="Damian Struk" w:date="2024-11-09T13:09:00Z" w16du:dateUtc="2024-11-09T12:09:00Z">
+            <w:del w:id="168" w:author="stella" w:date="2024-11-09T13:09:00Z" w16du:dateUtc="2024-11-09T12:09:00Z">
               <w:r>
                 <w:rPr>
                   <w:rFonts w:ascii="Corbel" w:hAnsi="Corbel"/>
@@ -9881,7 +9881,7 @@
         <w:tc>
           <w:tcPr>
             <w:tcW w:w="6563" w:type="dxa"/>
-            <w:tcPrChange w:id="169" w:author="Damian Struk" w:date="2024-11-09T13:09:00Z" w16du:dateUtc="2024-11-09T12:09:00Z">
+            <w:tcPrChange w:id="169" w:author="stella" w:date="2024-11-09T13:09:00Z" w16du:dateUtc="2024-11-09T12:09:00Z">
               <w:tcPr>
                 <w:tcW w:w="6563" w:type="dxa"/>
               </w:tcPr>
@@ -9902,7 +9902,7 @@
             </w:pPr>
             <w:bookmarkStart w:id="170" w:name="_Ref417035563"/>
             <w:bookmarkStart w:id="171" w:name="_Ref417035565"/>
-            <w:ins w:id="172" w:author="Damian Struk" w:date="2024-11-09T13:09:00Z" w16du:dateUtc="2024-11-09T12:09:00Z">
+            <w:ins w:id="172" w:author="stella" w:date="2024-11-09T13:09:00Z" w16du:dateUtc="2024-11-09T12:09:00Z">
               <w:r>
                 <w:rPr>
                   <w:rFonts w:ascii="Corbel" w:hAnsi="Corbel"/>
@@ -9998,7 +9998,7 @@
                 <w:color w:val="575757"/>
               </w:rPr>
             </w:r>
-            <w:ins w:id="173" w:author="Damian Struk" w:date="2024-11-09T13:09:00Z" w16du:dateUtc="2024-11-09T12:09:00Z">
+            <w:ins w:id="173" w:author="stella" w:date="2024-11-09T13:09:00Z" w16du:dateUtc="2024-11-09T12:09:00Z">
               <w:r>
                 <w:rPr>
                   <w:rFonts w:ascii="Corbel" w:hAnsi="Corbel"/>
@@ -10030,7 +10030,7 @@
                 <w:t>.</w:t>
               </w:r>
             </w:ins>
-            <w:del w:id="174" w:author="Damian Struk" w:date="2024-11-09T13:09:00Z" w16du:dateUtc="2024-11-09T12:09:00Z">
+            <w:del w:id="174" w:author="stella" w:date="2024-11-09T13:09:00Z" w16du:dateUtc="2024-11-09T12:09:00Z">
               <w:r>
                 <w:rPr>
                   <w:rFonts w:ascii="Corbel" w:hAnsi="Corbel"/>
@@ -10103,7 +10103,7 @@
           <w:tblW w:w="9498" w:type="dxa"/>
           <w:tblInd w:w="567" w:type="dxa"/>
           <w:tblLayout w:type="fixed"/>
-          <w:tblPrExChange w:id="175" w:author="Damian Struk" w:date="2024-11-09T13:09:00Z" w16du:dateUtc="2024-11-09T12:09:00Z">
+          <w:tblPrExChange w:id="175" w:author="stella" w:date="2024-11-09T13:09:00Z" w16du:dateUtc="2024-11-09T12:09:00Z">
             <w:tblPrEx>
               <w:tblW w:w="9498" w:type="dxa"/>
               <w:tblInd w:w="567" w:type="dxa"/>
@@ -10114,7 +10114,7 @@
         <w:tc>
           <w:tcPr>
             <w:tcW w:w="709" w:type="dxa"/>
-            <w:tcPrChange w:id="176" w:author="Damian Struk" w:date="2024-11-09T13:09:00Z" w16du:dateUtc="2024-11-09T12:09:00Z">
+            <w:tcPrChange w:id="176" w:author="stella" w:date="2024-11-09T13:09:00Z" w16du:dateUtc="2024-11-09T12:09:00Z">
               <w:tcPr>
                 <w:tcW w:w="709" w:type="dxa"/>
               </w:tcPr>
@@ -10144,7 +10144,7 @@
         <w:tc>
           <w:tcPr>
             <w:tcW w:w="2226" w:type="dxa"/>
-            <w:tcPrChange w:id="178" w:author="Damian Struk" w:date="2024-11-09T13:09:00Z" w16du:dateUtc="2024-11-09T12:09:00Z">
+            <w:tcPrChange w:id="178" w:author="stella" w:date="2024-11-09T13:09:00Z" w16du:dateUtc="2024-11-09T12:09:00Z">
               <w:tcPr>
                 <w:tcW w:w="2226" w:type="dxa"/>
               </w:tcPr>
@@ -10164,7 +10164,7 @@
                 <w:lang w:eastAsia="ja-JP"/>
               </w:rPr>
             </w:pPr>
-            <w:ins w:id="179" w:author="Damian Struk" w:date="2024-11-09T13:09:00Z" w16du:dateUtc="2024-11-09T12:09:00Z">
+            <w:ins w:id="179" w:author="stella" w:date="2024-11-09T13:09:00Z" w16du:dateUtc="2024-11-09T12:09:00Z">
               <w:r>
                 <w:rPr>
                   <w:rFonts w:ascii="Corbel" w:hAnsi="Corbel"/>
@@ -10175,7 +10175,7 @@
                 <w:t>Seznam majetku</w:t>
               </w:r>
             </w:ins>
-            <w:del w:id="180" w:author="Damian Struk" w:date="2024-11-09T13:09:00Z" w16du:dateUtc="2024-11-09T12:09:00Z">
+            <w:del w:id="180" w:author="stella" w:date="2024-11-09T13:09:00Z" w16du:dateUtc="2024-11-09T12:09:00Z">
               <w:r>
                 <w:rPr>
                   <w:rFonts w:ascii="Corbel" w:hAnsi="Corbel"/>
@@ -10191,7 +10191,7 @@
         <w:tc>
           <w:tcPr>
             <w:tcW w:w="6563" w:type="dxa"/>
-            <w:tcPrChange w:id="181" w:author="Damian Struk" w:date="2024-11-09T13:09:00Z" w16du:dateUtc="2024-11-09T12:09:00Z">
+            <w:tcPrChange w:id="181" w:author="stella" w:date="2024-11-09T13:09:00Z" w16du:dateUtc="2024-11-09T12:09:00Z">
               <w:tcPr>
                 <w:tcW w:w="6563" w:type="dxa"/>
               </w:tcPr>
@@ -10210,7 +10210,7 @@
                 <w:lang w:eastAsia="ja-JP"/>
               </w:rPr>
             </w:pPr>
-            <w:ins w:id="182" w:author="Damian Struk" w:date="2024-11-09T13:09:00Z" w16du:dateUtc="2024-11-09T12:09:00Z">
+            <w:ins w:id="182" w:author="stella" w:date="2024-11-09T13:09:00Z" w16du:dateUtc="2024-11-09T12:09:00Z">
               <w:r>
                 <w:rPr>
                   <w:rFonts w:ascii="Corbel" w:hAnsi="Corbel"/>
@@ -10250,7 +10250,7 @@
                 </w:rPr>
                 <w:t>/2021 ze dne 15. června 2021, vyhotovený Ing. Pavlem Trčkou,</w:t>
               </w:r>
-              <w:del w:id="183" w:author="Jan Kubica" w:date="2024-11-09T20:28:00Z" w16du:dateUtc="2024-11-09T19:28:00Z">
+              <w:del w:id="183" w:author="stella" w:date="2024-11-09T20:28:00Z" w16du:dateUtc="2024-11-09T19:28:00Z">
                 <w:r>
                   <w:rPr>
                     <w:rFonts w:ascii="Corbel" w:hAnsi="Corbel" w:cs="Corbel"/>
@@ -10268,7 +10268,7 @@
                 <w:t>.</w:t>
               </w:r>
             </w:ins>
-            <w:del w:id="184" w:author="Damian Struk" w:date="2024-11-09T13:09:00Z" w16du:dateUtc="2024-11-09T12:09:00Z">
+            <w:del w:id="184" w:author="stella" w:date="2024-11-09T13:09:00Z" w16du:dateUtc="2024-11-09T12:09:00Z">
               <w:r>
                 <w:rPr>
                   <w:rFonts w:ascii="Corbel" w:hAnsi="Corbel"/>
@@ -10392,7 +10392,7 @@
           <w:tblW w:w="9498" w:type="dxa"/>
           <w:tblInd w:w="567" w:type="dxa"/>
           <w:tblLayout w:type="fixed"/>
-          <w:tblPrExChange w:id="185" w:author="Damian Struk" w:date="2024-11-09T13:09:00Z" w16du:dateUtc="2024-11-09T12:09:00Z">
+          <w:tblPrExChange w:id="185" w:author="stella" w:date="2024-11-09T13:09:00Z" w16du:dateUtc="2024-11-09T12:09:00Z">
             <w:tblPrEx>
               <w:tblW w:w="9498" w:type="dxa"/>
               <w:tblInd w:w="567" w:type="dxa"/>
@@ -10403,7 +10403,7 @@
         <w:tc>
           <w:tcPr>
             <w:tcW w:w="709" w:type="dxa"/>
-            <w:tcPrChange w:id="186" w:author="Damian Struk" w:date="2024-11-09T13:09:00Z" w16du:dateUtc="2024-11-09T12:09:00Z">
+            <w:tcPrChange w:id="186" w:author="stella" w:date="2024-11-09T13:09:00Z" w16du:dateUtc="2024-11-09T12:09:00Z">
               <w:tcPr>
                 <w:tcW w:w="709" w:type="dxa"/>
               </w:tcPr>
@@ -10433,7 +10433,7 @@
         <w:tc>
           <w:tcPr>
             <w:tcW w:w="2226" w:type="dxa"/>
-            <w:tcPrChange w:id="188" w:author="Damian Struk" w:date="2024-11-09T13:09:00Z" w16du:dateUtc="2024-11-09T12:09:00Z">
+            <w:tcPrChange w:id="188" w:author="stella" w:date="2024-11-09T13:09:00Z" w16du:dateUtc="2024-11-09T12:09:00Z">
               <w:tcPr>
                 <w:tcW w:w="2226" w:type="dxa"/>
               </w:tcPr>
@@ -10453,7 +10453,7 @@
                 <w:lang w:eastAsia="ja-JP"/>
               </w:rPr>
             </w:pPr>
-            <w:ins w:id="189" w:author="Damian Struk" w:date="2024-11-09T13:09:00Z" w16du:dateUtc="2024-11-09T12:09:00Z">
+            <w:ins w:id="189" w:author="stella" w:date="2024-11-09T13:09:00Z" w16du:dateUtc="2024-11-09T12:09:00Z">
               <w:r>
                 <w:rPr>
                   <w:rFonts w:ascii="Corbel" w:hAnsi="Corbel"/>
@@ -10464,7 +10464,7 @@
                 <w:t>Seznam smluv</w:t>
               </w:r>
             </w:ins>
-            <w:del w:id="190" w:author="Damian Struk" w:date="2024-11-09T13:09:00Z" w16du:dateUtc="2024-11-09T12:09:00Z">
+            <w:del w:id="190" w:author="stella" w:date="2024-11-09T13:09:00Z" w16du:dateUtc="2024-11-09T12:09:00Z">
               <w:r>
                 <w:rPr>
                   <w:rFonts w:ascii="Corbel" w:hAnsi="Corbel"/>
@@ -10480,7 +10480,7 @@
         <w:tc>
           <w:tcPr>
             <w:tcW w:w="6563" w:type="dxa"/>
-            <w:tcPrChange w:id="191" w:author="Damian Struk" w:date="2024-11-09T13:09:00Z" w16du:dateUtc="2024-11-09T12:09:00Z">
+            <w:tcPrChange w:id="191" w:author="stella" w:date="2024-11-09T13:09:00Z" w16du:dateUtc="2024-11-09T12:09:00Z">
               <w:tcPr>
                 <w:tcW w:w="6563" w:type="dxa"/>
               </w:tcPr>
@@ -10498,7 +10498,7 @@
                 <w:lang w:eastAsia="ja-JP"/>
               </w:rPr>
             </w:pPr>
-            <w:ins w:id="192" w:author="Damian Struk" w:date="2024-11-09T13:09:00Z" w16du:dateUtc="2024-11-09T12:09:00Z">
+            <w:ins w:id="192" w:author="stella" w:date="2024-11-09T13:09:00Z" w16du:dateUtc="2024-11-09T12:09:00Z">
               <w:r>
                 <w:rPr>
                   <w:rFonts w:ascii="Corbel" w:hAnsi="Corbel"/>
@@ -10579,7 +10579,7 @@
                 <w:lang w:eastAsia="ja-JP"/>
               </w:rPr>
             </w:r>
-            <w:ins w:id="193" w:author="Damian Struk" w:date="2024-11-09T13:09:00Z" w16du:dateUtc="2024-11-09T12:09:00Z">
+            <w:ins w:id="193" w:author="stella" w:date="2024-11-09T13:09:00Z" w16du:dateUtc="2024-11-09T12:09:00Z">
               <w:r>
                 <w:rPr>
                   <w:rFonts w:ascii="Corbel" w:hAnsi="Corbel"/>
@@ -10613,7 +10613,7 @@
                 <w:t>.</w:t>
               </w:r>
             </w:ins>
-            <w:del w:id="194" w:author="Damian Struk" w:date="2024-11-09T13:09:00Z" w16du:dateUtc="2024-11-09T12:09:00Z">
+            <w:del w:id="194" w:author="stella" w:date="2024-11-09T13:09:00Z" w16du:dateUtc="2024-11-09T12:09:00Z">
               <w:r>
                 <w:rPr>
                   <w:rFonts w:ascii="Corbel" w:hAnsi="Corbel"/>
@@ -10654,7 +10654,7 @@
           <w:tblW w:w="9498" w:type="dxa"/>
           <w:tblInd w:w="567" w:type="dxa"/>
           <w:tblLayout w:type="fixed"/>
-          <w:tblPrExChange w:id="195" w:author="Damian Struk" w:date="2024-11-09T13:09:00Z" w16du:dateUtc="2024-11-09T12:09:00Z">
+          <w:tblPrExChange w:id="195" w:author="stella" w:date="2024-11-09T13:09:00Z" w16du:dateUtc="2024-11-09T12:09:00Z">
             <w:tblPrEx>
               <w:tblW w:w="9498" w:type="dxa"/>
               <w:tblInd w:w="567" w:type="dxa"/>
@@ -10665,7 +10665,7 @@
         <w:tc>
           <w:tcPr>
             <w:tcW w:w="709" w:type="dxa"/>
-            <w:tcPrChange w:id="196" w:author="Damian Struk" w:date="2024-11-09T13:09:00Z" w16du:dateUtc="2024-11-09T12:09:00Z">
+            <w:tcPrChange w:id="196" w:author="stella" w:date="2024-11-09T13:09:00Z" w16du:dateUtc="2024-11-09T12:09:00Z">
               <w:tcPr>
                 <w:tcW w:w="709" w:type="dxa"/>
               </w:tcPr>
@@ -10695,7 +10695,7 @@
         <w:tc>
           <w:tcPr>
             <w:tcW w:w="2226" w:type="dxa"/>
-            <w:tcPrChange w:id="198" w:author="Damian Struk" w:date="2024-11-09T13:09:00Z" w16du:dateUtc="2024-11-09T12:09:00Z">
+            <w:tcPrChange w:id="198" w:author="stella" w:date="2024-11-09T13:09:00Z" w16du:dateUtc="2024-11-09T12:09:00Z">
               <w:tcPr>
                 <w:tcW w:w="2226" w:type="dxa"/>
               </w:tcPr>
@@ -10715,7 +10715,7 @@
                 <w:lang w:eastAsia="ja-JP"/>
               </w:rPr>
             </w:pPr>
-            <w:ins w:id="199" w:author="Damian Struk" w:date="2024-11-09T13:09:00Z" w16du:dateUtc="2024-11-09T12:09:00Z">
+            <w:ins w:id="199" w:author="stella" w:date="2024-11-09T13:09:00Z" w16du:dateUtc="2024-11-09T12:09:00Z">
               <w:r>
                 <w:rPr>
                   <w:rFonts w:ascii="Corbel" w:hAnsi="Corbel"/>
@@ -10726,7 +10726,7 @@
                 <w:t>Sleva</w:t>
               </w:r>
             </w:ins>
-            <w:del w:id="200" w:author="Damian Struk" w:date="2024-11-09T13:09:00Z" w16du:dateUtc="2024-11-09T12:09:00Z">
+            <w:del w:id="200" w:author="stella" w:date="2024-11-09T13:09:00Z" w16du:dateUtc="2024-11-09T12:09:00Z">
               <w:r>
                 <w:rPr>
                   <w:rFonts w:ascii="Corbel" w:hAnsi="Corbel"/>
@@ -10742,7 +10742,7 @@
         <w:tc>
           <w:tcPr>
             <w:tcW w:w="6563" w:type="dxa"/>
-            <w:tcPrChange w:id="201" w:author="Damian Struk" w:date="2024-11-09T13:09:00Z" w16du:dateUtc="2024-11-09T12:09:00Z">
+            <w:tcPrChange w:id="201" w:author="stella" w:date="2024-11-09T13:09:00Z" w16du:dateUtc="2024-11-09T12:09:00Z">
               <w:tcPr>
                 <w:tcW w:w="6563" w:type="dxa"/>
               </w:tcPr>
@@ -10761,7 +10761,7 @@
                 <w:lang w:eastAsia="ja-JP"/>
               </w:rPr>
             </w:pPr>
-            <w:ins w:id="202" w:author="Damian Struk" w:date="2024-11-09T13:09:00Z" w16du:dateUtc="2024-11-09T12:09:00Z">
+            <w:ins w:id="202" w:author="stella" w:date="2024-11-09T13:09:00Z" w16du:dateUtc="2024-11-09T12:09:00Z">
               <w:r>
                 <w:rPr>
                   <w:rFonts w:ascii="Corbel" w:hAnsi="Corbel"/>
@@ -10802,7 +10802,7 @@
                 <w:lang w:eastAsia="ja-JP"/>
               </w:rPr>
             </w:r>
-            <w:ins w:id="203" w:author="Damian Struk" w:date="2024-11-09T13:09:00Z" w16du:dateUtc="2024-11-09T12:09:00Z">
+            <w:ins w:id="203" w:author="stella" w:date="2024-11-09T13:09:00Z" w16du:dateUtc="2024-11-09T12:09:00Z">
               <w:r>
                 <w:rPr>
                   <w:rFonts w:ascii="Corbel" w:hAnsi="Corbel"/>
@@ -10836,7 +10836,7 @@
                 <w:t>.</w:t>
               </w:r>
             </w:ins>
-            <w:del w:id="204" w:author="Damian Struk" w:date="2024-11-09T13:09:00Z" w16du:dateUtc="2024-11-09T12:09:00Z">
+            <w:del w:id="204" w:author="stella" w:date="2024-11-09T13:09:00Z" w16du:dateUtc="2024-11-09T12:09:00Z">
               <w:r>
                 <w:rPr>
                   <w:rFonts w:ascii="Corbel" w:hAnsi="Corbel"/>
@@ -10957,7 +10957,7 @@
           <w:tblW w:w="9498" w:type="dxa"/>
           <w:tblInd w:w="567" w:type="dxa"/>
           <w:tblLayout w:type="fixed"/>
-          <w:tblPrExChange w:id="205" w:author="Damian Struk" w:date="2024-11-09T13:09:00Z" w16du:dateUtc="2024-11-09T12:09:00Z">
+          <w:tblPrExChange w:id="205" w:author="stella" w:date="2024-11-09T13:09:00Z" w16du:dateUtc="2024-11-09T12:09:00Z">
             <w:tblPrEx>
               <w:tblW w:w="9498" w:type="dxa"/>
               <w:tblInd w:w="567" w:type="dxa"/>
@@ -10968,7 +10968,7 @@
         <w:tc>
           <w:tcPr>
             <w:tcW w:w="709" w:type="dxa"/>
-            <w:tcPrChange w:id="206" w:author="Damian Struk" w:date="2024-11-09T13:09:00Z" w16du:dateUtc="2024-11-09T12:09:00Z">
+            <w:tcPrChange w:id="206" w:author="stella" w:date="2024-11-09T13:09:00Z" w16du:dateUtc="2024-11-09T12:09:00Z">
               <w:tcPr>
                 <w:tcW w:w="709" w:type="dxa"/>
               </w:tcPr>
@@ -10996,7 +10996,7 @@
         <w:tc>
           <w:tcPr>
             <w:tcW w:w="2226" w:type="dxa"/>
-            <w:tcPrChange w:id="207" w:author="Damian Struk" w:date="2024-11-09T13:09:00Z" w16du:dateUtc="2024-11-09T12:09:00Z">
+            <w:tcPrChange w:id="207" w:author="stella" w:date="2024-11-09T13:09:00Z" w16du:dateUtc="2024-11-09T12:09:00Z">
               <w:tcPr>
                 <w:tcW w:w="2226" w:type="dxa"/>
               </w:tcPr>
@@ -11016,7 +11016,7 @@
                 <w:lang w:eastAsia="ja-JP"/>
               </w:rPr>
             </w:pPr>
-            <w:ins w:id="208" w:author="Damian Struk" w:date="2024-11-09T13:09:00Z" w16du:dateUtc="2024-11-09T12:09:00Z">
+            <w:ins w:id="208" w:author="stella" w:date="2024-11-09T13:09:00Z" w16du:dateUtc="2024-11-09T12:09:00Z">
               <w:r>
                 <w:rPr>
                   <w:rFonts w:ascii="Corbel" w:hAnsi="Corbel"/>
@@ -11027,7 +11027,7 @@
                 <w:t>Smlouva</w:t>
               </w:r>
             </w:ins>
-            <w:del w:id="209" w:author="Damian Struk" w:date="2024-11-09T13:09:00Z" w16du:dateUtc="2024-11-09T12:09:00Z">
+            <w:del w:id="209" w:author="stella" w:date="2024-11-09T13:09:00Z" w16du:dateUtc="2024-11-09T12:09:00Z">
               <w:r>
                 <w:rPr>
                   <w:rFonts w:ascii="Corbel" w:hAnsi="Corbel"/>
@@ -11043,7 +11043,7 @@
         <w:tc>
           <w:tcPr>
             <w:tcW w:w="6563" w:type="dxa"/>
-            <w:tcPrChange w:id="210" w:author="Damian Struk" w:date="2024-11-09T13:09:00Z" w16du:dateUtc="2024-11-09T12:09:00Z">
+            <w:tcPrChange w:id="210" w:author="stella" w:date="2024-11-09T13:09:00Z" w16du:dateUtc="2024-11-09T12:09:00Z">
               <w:tcPr>
                 <w:tcW w:w="6563" w:type="dxa"/>
               </w:tcPr>
@@ -11062,7 +11062,7 @@
                 <w:lang w:eastAsia="ja-JP"/>
               </w:rPr>
             </w:pPr>
-            <w:ins w:id="211" w:author="Damian Struk" w:date="2024-11-09T13:09:00Z" w16du:dateUtc="2024-11-09T12:09:00Z">
+            <w:ins w:id="211" w:author="stella" w:date="2024-11-09T13:09:00Z" w16du:dateUtc="2024-11-09T12:09:00Z">
               <w:r>
                 <w:rPr>
                   <w:rFonts w:ascii="Corbel" w:hAnsi="Corbel"/>
@@ -11080,7 +11080,7 @@
                 <w:t xml:space="preserve"> včetně veškerých jejích příloh.</w:t>
               </w:r>
             </w:ins>
-            <w:del w:id="212" w:author="Damian Struk" w:date="2024-11-09T13:09:00Z" w16du:dateUtc="2024-11-09T12:09:00Z">
+            <w:del w:id="212" w:author="stella" w:date="2024-11-09T13:09:00Z" w16du:dateUtc="2024-11-09T12:09:00Z">
               <w:r>
                 <w:rPr>
                   <w:rFonts w:ascii="Corbel" w:hAnsi="Corbel"/>
@@ -11161,7 +11161,7 @@
           <w:tblW w:w="9498" w:type="dxa"/>
           <w:tblInd w:w="567" w:type="dxa"/>
           <w:tblLayout w:type="fixed"/>
-          <w:tblPrExChange w:id="213" w:author="Damian Struk" w:date="2024-11-09T13:09:00Z" w16du:dateUtc="2024-11-09T12:09:00Z">
+          <w:tblPrExChange w:id="213" w:author="stella" w:date="2024-11-09T13:09:00Z" w16du:dateUtc="2024-11-09T12:09:00Z">
             <w:tblPrEx>
               <w:tblW w:w="9498" w:type="dxa"/>
               <w:tblInd w:w="567" w:type="dxa"/>
@@ -11172,7 +11172,7 @@
         <w:tc>
           <w:tcPr>
             <w:tcW w:w="709" w:type="dxa"/>
-            <w:tcPrChange w:id="214" w:author="Damian Struk" w:date="2024-11-09T13:09:00Z" w16du:dateUtc="2024-11-09T12:09:00Z">
+            <w:tcPrChange w:id="214" w:author="stella" w:date="2024-11-09T13:09:00Z" w16du:dateUtc="2024-11-09T12:09:00Z">
               <w:tcPr>
                 <w:tcW w:w="709" w:type="dxa"/>
               </w:tcPr>
@@ -11200,7 +11200,7 @@
         <w:tc>
           <w:tcPr>
             <w:tcW w:w="2226" w:type="dxa"/>
-            <w:tcPrChange w:id="215" w:author="Damian Struk" w:date="2024-11-09T13:09:00Z" w16du:dateUtc="2024-11-09T12:09:00Z">
+            <w:tcPrChange w:id="215" w:author="stella" w:date="2024-11-09T13:09:00Z" w16du:dateUtc="2024-11-09T12:09:00Z">
               <w:tcPr>
                 <w:tcW w:w="2226" w:type="dxa"/>
               </w:tcPr>
@@ -11220,7 +11220,7 @@
                 <w:lang w:eastAsia="ja-JP"/>
               </w:rPr>
             </w:pPr>
-            <w:ins w:id="216" w:author="Damian Struk" w:date="2024-11-09T13:09:00Z" w16du:dateUtc="2024-11-09T12:09:00Z">
+            <w:ins w:id="216" w:author="stella" w:date="2024-11-09T13:09:00Z" w16du:dateUtc="2024-11-09T12:09:00Z">
               <w:r>
                 <w:rPr>
                   <w:rFonts w:ascii="Corbel" w:hAnsi="Corbel"/>
@@ -11240,7 +11240,7 @@
                 <w:t xml:space="preserve"> AGROBIOPLYN</w:t>
               </w:r>
             </w:ins>
-            <w:del w:id="217" w:author="Damian Struk" w:date="2024-11-09T13:09:00Z" w16du:dateUtc="2024-11-09T12:09:00Z">
+            <w:del w:id="217" w:author="stella" w:date="2024-11-09T13:09:00Z" w16du:dateUtc="2024-11-09T12:09:00Z">
               <w:r>
                 <w:rPr>
                   <w:rFonts w:ascii="Corbel" w:hAnsi="Corbel"/>
@@ -11256,7 +11256,7 @@
         <w:tc>
           <w:tcPr>
             <w:tcW w:w="6563" w:type="dxa"/>
-            <w:tcPrChange w:id="218" w:author="Damian Struk" w:date="2024-11-09T13:09:00Z" w16du:dateUtc="2024-11-09T12:09:00Z">
+            <w:tcPrChange w:id="218" w:author="stella" w:date="2024-11-09T13:09:00Z" w16du:dateUtc="2024-11-09T12:09:00Z">
               <w:tcPr>
                 <w:tcW w:w="6563" w:type="dxa"/>
               </w:tcPr>
@@ -11275,7 +11275,7 @@
                 <w:lang w:eastAsia="ja-JP"/>
               </w:rPr>
             </w:pPr>
-            <w:ins w:id="219" w:author="Damian Struk" w:date="2024-11-09T13:09:00Z" w16du:dateUtc="2024-11-09T12:09:00Z">
+            <w:ins w:id="219" w:author="stella" w:date="2024-11-09T13:09:00Z" w16du:dateUtc="2024-11-09T12:09:00Z">
               <w:r>
                 <w:rPr>
                   <w:rFonts w:ascii="Corbel" w:hAnsi="Corbel"/>
@@ -11309,7 +11309,7 @@
                 <w:t>i této Smlouvy.</w:t>
               </w:r>
             </w:ins>
-            <w:del w:id="220" w:author="Damian Struk" w:date="2024-11-09T13:09:00Z" w16du:dateUtc="2024-11-09T12:09:00Z">
+            <w:del w:id="220" w:author="stella" w:date="2024-11-09T13:09:00Z" w16du:dateUtc="2024-11-09T12:09:00Z">
               <w:r>
                 <w:rPr>
                   <w:rFonts w:ascii="Corbel" w:hAnsi="Corbel"/>
@@ -11335,7 +11335,7 @@
           <w:tblW w:w="9498" w:type="dxa"/>
           <w:tblInd w:w="567" w:type="dxa"/>
           <w:tblLayout w:type="fixed"/>
-          <w:tblPrExChange w:id="221" w:author="Damian Struk" w:date="2024-11-09T13:09:00Z" w16du:dateUtc="2024-11-09T12:09:00Z">
+          <w:tblPrExChange w:id="221" w:author="stella" w:date="2024-11-09T13:09:00Z" w16du:dateUtc="2024-11-09T12:09:00Z">
             <w:tblPrEx>
               <w:tblW w:w="9498" w:type="dxa"/>
               <w:tblInd w:w="567" w:type="dxa"/>
@@ -11346,7 +11346,7 @@
         <w:tc>
           <w:tcPr>
             <w:tcW w:w="709" w:type="dxa"/>
-            <w:tcPrChange w:id="222" w:author="Damian Struk" w:date="2024-11-09T13:09:00Z" w16du:dateUtc="2024-11-09T12:09:00Z">
+            <w:tcPrChange w:id="222" w:author="stella" w:date="2024-11-09T13:09:00Z" w16du:dateUtc="2024-11-09T12:09:00Z">
               <w:tcPr>
                 <w:tcW w:w="709" w:type="dxa"/>
               </w:tcPr>
@@ -11374,7 +11374,7 @@
         <w:tc>
           <w:tcPr>
             <w:tcW w:w="2226" w:type="dxa"/>
-            <w:tcPrChange w:id="223" w:author="Damian Struk" w:date="2024-11-09T13:09:00Z" w16du:dateUtc="2024-11-09T12:09:00Z">
+            <w:tcPrChange w:id="223" w:author="stella" w:date="2024-11-09T13:09:00Z" w16du:dateUtc="2024-11-09T12:09:00Z">
               <w:tcPr>
                 <w:tcW w:w="2226" w:type="dxa"/>
               </w:tcPr>
@@ -11394,7 +11394,7 @@
                 <w:lang w:eastAsia="ja-JP"/>
               </w:rPr>
             </w:pPr>
-            <w:ins w:id="224" w:author="Damian Struk" w:date="2024-11-09T13:09:00Z" w16du:dateUtc="2024-11-09T12:09:00Z">
+            <w:ins w:id="224" w:author="stella" w:date="2024-11-09T13:09:00Z" w16du:dateUtc="2024-11-09T12:09:00Z">
               <w:r>
                 <w:rPr>
                   <w:rFonts w:ascii="Corbel" w:hAnsi="Corbel"/>
@@ -11414,7 +11414,7 @@
                 <w:t xml:space="preserve"> RELAKA</w:t>
               </w:r>
             </w:ins>
-            <w:del w:id="225" w:author="Damian Struk" w:date="2024-11-09T13:09:00Z" w16du:dateUtc="2024-11-09T12:09:00Z">
+            <w:del w:id="225" w:author="stella" w:date="2024-11-09T13:09:00Z" w16du:dateUtc="2024-11-09T12:09:00Z">
               <w:r>
                 <w:rPr>
                   <w:rFonts w:ascii="Corbel" w:hAnsi="Corbel"/>
@@ -11439,7 +11439,7 @@
         <w:tc>
           <w:tcPr>
             <w:tcW w:w="6563" w:type="dxa"/>
-            <w:tcPrChange w:id="226" w:author="Damian Struk" w:date="2024-11-09T13:09:00Z" w16du:dateUtc="2024-11-09T12:09:00Z">
+            <w:tcPrChange w:id="226" w:author="stella" w:date="2024-11-09T13:09:00Z" w16du:dateUtc="2024-11-09T12:09:00Z">
               <w:tcPr>
                 <w:tcW w:w="6563" w:type="dxa"/>
               </w:tcPr>
@@ -11458,7 +11458,7 @@
                 <w:lang w:eastAsia="ja-JP"/>
               </w:rPr>
             </w:pPr>
-            <w:ins w:id="227" w:author="Damian Struk" w:date="2024-11-09T13:09:00Z" w16du:dateUtc="2024-11-09T12:09:00Z">
+            <w:ins w:id="227" w:author="stella" w:date="2024-11-09T13:09:00Z" w16du:dateUtc="2024-11-09T12:09:00Z">
               <w:r>
                 <w:rPr>
                   <w:rFonts w:ascii="Corbel" w:hAnsi="Corbel"/>
@@ -11492,7 +11492,7 @@
                 <w:t>i této Smlouvy.</w:t>
               </w:r>
             </w:ins>
-            <w:del w:id="228" w:author="Damian Struk" w:date="2024-11-09T13:09:00Z" w16du:dateUtc="2024-11-09T12:09:00Z">
+            <w:del w:id="228" w:author="stella" w:date="2024-11-09T13:09:00Z" w16du:dateUtc="2024-11-09T12:09:00Z">
               <w:r>
                 <w:rPr>
                   <w:rFonts w:ascii="Corbel" w:hAnsi="Corbel"/>
@@ -11534,7 +11534,7 @@
           <w:tblW w:w="9498" w:type="dxa"/>
           <w:tblInd w:w="567" w:type="dxa"/>
           <w:tblLayout w:type="fixed"/>
-          <w:tblPrExChange w:id="229" w:author="Damian Struk" w:date="2024-11-09T13:09:00Z" w16du:dateUtc="2024-11-09T12:09:00Z">
+          <w:tblPrExChange w:id="229" w:author="stella" w:date="2024-11-09T13:09:00Z" w16du:dateUtc="2024-11-09T12:09:00Z">
             <w:tblPrEx>
               <w:tblW w:w="9498" w:type="dxa"/>
               <w:tblInd w:w="567" w:type="dxa"/>
@@ -11545,7 +11545,7 @@
         <w:tc>
           <w:tcPr>
             <w:tcW w:w="709" w:type="dxa"/>
-            <w:tcPrChange w:id="230" w:author="Damian Struk" w:date="2024-11-09T13:09:00Z" w16du:dateUtc="2024-11-09T12:09:00Z">
+            <w:tcPrChange w:id="230" w:author="stella" w:date="2024-11-09T13:09:00Z" w16du:dateUtc="2024-11-09T12:09:00Z">
               <w:tcPr>
                 <w:tcW w:w="709" w:type="dxa"/>
               </w:tcPr>
@@ -11573,7 +11573,7 @@
         <w:tc>
           <w:tcPr>
             <w:tcW w:w="2226" w:type="dxa"/>
-            <w:tcPrChange w:id="231" w:author="Damian Struk" w:date="2024-11-09T13:09:00Z" w16du:dateUtc="2024-11-09T12:09:00Z">
+            <w:tcPrChange w:id="231" w:author="stella" w:date="2024-11-09T13:09:00Z" w16du:dateUtc="2024-11-09T12:09:00Z">
               <w:tcPr>
                 <w:tcW w:w="2226" w:type="dxa"/>
               </w:tcPr>
@@ -11593,7 +11593,7 @@
                 <w:lang w:eastAsia="ja-JP"/>
               </w:rPr>
             </w:pPr>
-            <w:ins w:id="232" w:author="Damian Struk" w:date="2024-11-09T13:09:00Z" w16du:dateUtc="2024-11-09T12:09:00Z">
+            <w:ins w:id="232" w:author="stella" w:date="2024-11-09T13:09:00Z" w16du:dateUtc="2024-11-09T12:09:00Z">
               <w:r>
                 <w:rPr>
                   <w:rFonts w:ascii="Corbel" w:hAnsi="Corbel"/>
@@ -11604,7 +11604,7 @@
                 <w:t>Společnosti</w:t>
               </w:r>
             </w:ins>
-            <w:del w:id="233" w:author="Damian Struk" w:date="2024-11-09T13:09:00Z" w16du:dateUtc="2024-11-09T12:09:00Z">
+            <w:del w:id="233" w:author="stella" w:date="2024-11-09T13:09:00Z" w16du:dateUtc="2024-11-09T12:09:00Z">
               <w:r>
                 <w:rPr>
                   <w:rFonts w:ascii="Corbel" w:hAnsi="Corbel"/>
@@ -11629,7 +11629,7 @@
         <w:tc>
           <w:tcPr>
             <w:tcW w:w="6563" w:type="dxa"/>
-            <w:tcPrChange w:id="234" w:author="Damian Struk" w:date="2024-11-09T13:09:00Z" w16du:dateUtc="2024-11-09T12:09:00Z">
+            <w:tcPrChange w:id="234" w:author="stella" w:date="2024-11-09T13:09:00Z" w16du:dateUtc="2024-11-09T12:09:00Z">
               <w:tcPr>
                 <w:tcW w:w="6563" w:type="dxa"/>
               </w:tcPr>
@@ -11648,7 +11648,7 @@
                 <w:lang w:eastAsia="ja-JP"/>
               </w:rPr>
             </w:pPr>
-            <w:ins w:id="235" w:author="Damian Struk" w:date="2024-11-09T13:09:00Z" w16du:dateUtc="2024-11-09T12:09:00Z">
+            <w:ins w:id="235" w:author="stella" w:date="2024-11-09T13:09:00Z" w16du:dateUtc="2024-11-09T12:09:00Z">
               <w:r>
                 <w:rPr>
                   <w:rFonts w:ascii="Corbel" w:hAnsi="Corbel"/>
@@ -11658,7 +11658,7 @@
                 <w:t>znamená Společnost AGROBIOPLYN a Společnost RELAKA, resp. kteroukoli z nich, pokud tak vyplývá z kontextu.</w:t>
               </w:r>
             </w:ins>
-            <w:del w:id="236" w:author="Damian Struk" w:date="2024-11-09T13:09:00Z" w16du:dateUtc="2024-11-09T12:09:00Z">
+            <w:del w:id="236" w:author="stella" w:date="2024-11-09T13:09:00Z" w16du:dateUtc="2024-11-09T12:09:00Z">
               <w:r>
                 <w:rPr>
                   <w:rFonts w:ascii="Corbel" w:hAnsi="Corbel"/>
@@ -11700,7 +11700,7 @@
           <w:tblW w:w="9498" w:type="dxa"/>
           <w:tblInd w:w="567" w:type="dxa"/>
           <w:tblLayout w:type="fixed"/>
-          <w:tblPrExChange w:id="237" w:author="Damian Struk" w:date="2024-11-09T13:09:00Z" w16du:dateUtc="2024-11-09T12:09:00Z">
+          <w:tblPrExChange w:id="237" w:author="stella" w:date="2024-11-09T13:09:00Z" w16du:dateUtc="2024-11-09T12:09:00Z">
             <w:tblPrEx>
               <w:tblW w:w="9498" w:type="dxa"/>
               <w:tblInd w:w="567" w:type="dxa"/>
@@ -11711,7 +11711,7 @@
         <w:tc>
           <w:tcPr>
             <w:tcW w:w="709" w:type="dxa"/>
-            <w:tcPrChange w:id="238" w:author="Damian Struk" w:date="2024-11-09T13:09:00Z" w16du:dateUtc="2024-11-09T12:09:00Z">
+            <w:tcPrChange w:id="238" w:author="stella" w:date="2024-11-09T13:09:00Z" w16du:dateUtc="2024-11-09T12:09:00Z">
               <w:tcPr>
                 <w:tcW w:w="709" w:type="dxa"/>
               </w:tcPr>
@@ -11739,7 +11739,7 @@
         <w:tc>
           <w:tcPr>
             <w:tcW w:w="2226" w:type="dxa"/>
-            <w:tcPrChange w:id="239" w:author="Damian Struk" w:date="2024-11-09T13:09:00Z" w16du:dateUtc="2024-11-09T12:09:00Z">
+            <w:tcPrChange w:id="239" w:author="stella" w:date="2024-11-09T13:09:00Z" w16du:dateUtc="2024-11-09T12:09:00Z">
               <w:tcPr>
                 <w:tcW w:w="2226" w:type="dxa"/>
               </w:tcPr>
@@ -11759,7 +11759,7 @@
                 <w:lang w:eastAsia="ja-JP"/>
               </w:rPr>
             </w:pPr>
-            <w:ins w:id="240" w:author="Damian Struk" w:date="2024-11-09T13:09:00Z" w16du:dateUtc="2024-11-09T12:09:00Z">
+            <w:ins w:id="240" w:author="stella" w:date="2024-11-09T13:09:00Z" w16du:dateUtc="2024-11-09T12:09:00Z">
               <w:r>
                 <w:rPr>
                   <w:rFonts w:ascii="Corbel" w:hAnsi="Corbel"/>
@@ -11770,7 +11770,7 @@
                 <w:t>Transakce</w:t>
               </w:r>
             </w:ins>
-            <w:del w:id="241" w:author="Damian Struk" w:date="2024-11-09T13:09:00Z" w16du:dateUtc="2024-11-09T12:09:00Z">
+            <w:del w:id="241" w:author="stella" w:date="2024-11-09T13:09:00Z" w16du:dateUtc="2024-11-09T12:09:00Z">
               <w:r>
                 <w:rPr>
                   <w:rFonts w:ascii="Corbel" w:hAnsi="Corbel"/>
@@ -11786,7 +11786,7 @@
         <w:tc>
           <w:tcPr>
             <w:tcW w:w="6563" w:type="dxa"/>
-            <w:tcPrChange w:id="242" w:author="Damian Struk" w:date="2024-11-09T13:09:00Z" w16du:dateUtc="2024-11-09T12:09:00Z">
+            <w:tcPrChange w:id="242" w:author="stella" w:date="2024-11-09T13:09:00Z" w16du:dateUtc="2024-11-09T12:09:00Z">
               <w:tcPr>
                 <w:tcW w:w="6563" w:type="dxa"/>
               </w:tcPr>
@@ -11805,7 +11805,7 @@
                 <w:lang w:eastAsia="ja-JP"/>
               </w:rPr>
             </w:pPr>
-            <w:ins w:id="243" w:author="Damian Struk" w:date="2024-11-09T13:09:00Z" w16du:dateUtc="2024-11-09T12:09:00Z">
+            <w:ins w:id="243" w:author="stella" w:date="2024-11-09T13:09:00Z" w16du:dateUtc="2024-11-09T12:09:00Z">
               <w:r>
                 <w:rPr>
                   <w:rFonts w:ascii="Corbel" w:hAnsi="Corbel"/>
@@ -11815,7 +11815,7 @@
                 <w:t>znamená transakci zamýšlenou touto Smlouvou, tj. nabytí Podílů a 100% majetkové účasti ve Společnostech Kupujícím a veškeré další dílčí transakce zamýšlené touto Smlouvou společně.</w:t>
               </w:r>
             </w:ins>
-            <w:del w:id="244" w:author="Damian Struk" w:date="2024-11-09T13:09:00Z" w16du:dateUtc="2024-11-09T12:09:00Z">
+            <w:del w:id="244" w:author="stella" w:date="2024-11-09T13:09:00Z" w16du:dateUtc="2024-11-09T12:09:00Z">
               <w:r>
                 <w:rPr>
                   <w:rFonts w:ascii="Corbel" w:hAnsi="Corbel"/>
@@ -11833,7 +11833,7 @@
           <w:tblW w:w="9498" w:type="dxa"/>
           <w:tblInd w:w="567" w:type="dxa"/>
           <w:tblLayout w:type="fixed"/>
-          <w:tblPrExChange w:id="245" w:author="Damian Struk" w:date="2024-11-09T13:09:00Z" w16du:dateUtc="2024-11-09T12:09:00Z">
+          <w:tblPrExChange w:id="245" w:author="stella" w:date="2024-11-09T13:09:00Z" w16du:dateUtc="2024-11-09T12:09:00Z">
             <w:tblPrEx>
               <w:tblW w:w="9498" w:type="dxa"/>
               <w:tblInd w:w="567" w:type="dxa"/>
@@ -11844,7 +11844,7 @@
         <w:tc>
           <w:tcPr>
             <w:tcW w:w="709" w:type="dxa"/>
-            <w:tcPrChange w:id="246" w:author="Damian Struk" w:date="2024-11-09T13:09:00Z" w16du:dateUtc="2024-11-09T12:09:00Z">
+            <w:tcPrChange w:id="246" w:author="stella" w:date="2024-11-09T13:09:00Z" w16du:dateUtc="2024-11-09T12:09:00Z">
               <w:tcPr>
                 <w:tcW w:w="709" w:type="dxa"/>
               </w:tcPr>
@@ -11872,7 +11872,7 @@
         <w:tc>
           <w:tcPr>
             <w:tcW w:w="2226" w:type="dxa"/>
-            <w:tcPrChange w:id="247" w:author="Damian Struk" w:date="2024-11-09T13:09:00Z" w16du:dateUtc="2024-11-09T12:09:00Z">
+            <w:tcPrChange w:id="247" w:author="stella" w:date="2024-11-09T13:09:00Z" w16du:dateUtc="2024-11-09T12:09:00Z">
               <w:tcPr>
                 <w:tcW w:w="2226" w:type="dxa"/>
               </w:tcPr>
@@ -11892,7 +11892,7 @@
                 <w:lang w:eastAsia="ja-JP"/>
               </w:rPr>
             </w:pPr>
-            <w:ins w:id="248" w:author="Damian Struk" w:date="2024-11-09T13:09:00Z" w16du:dateUtc="2024-11-09T12:09:00Z">
+            <w:ins w:id="248" w:author="stella" w:date="2024-11-09T13:09:00Z" w16du:dateUtc="2024-11-09T12:09:00Z">
               <w:r>
                 <w:rPr>
                   <w:rFonts w:ascii="Corbel" w:hAnsi="Corbel"/>
@@ -11930,7 +11930,7 @@
                 <w:t xml:space="preserve"> 1</w:t>
               </w:r>
             </w:ins>
-            <w:del w:id="249" w:author="Damian Struk" w:date="2024-11-09T13:09:00Z" w16du:dateUtc="2024-11-09T12:09:00Z">
+            <w:del w:id="249" w:author="stella" w:date="2024-11-09T13:09:00Z" w16du:dateUtc="2024-11-09T12:09:00Z">
               <w:r>
                 <w:rPr>
                   <w:rFonts w:ascii="Corbel" w:hAnsi="Corbel"/>
@@ -11946,7 +11946,7 @@
         <w:tc>
           <w:tcPr>
             <w:tcW w:w="6563" w:type="dxa"/>
-            <w:tcPrChange w:id="250" w:author="Damian Struk" w:date="2024-11-09T13:09:00Z" w16du:dateUtc="2024-11-09T12:09:00Z">
+            <w:tcPrChange w:id="250" w:author="stella" w:date="2024-11-09T13:09:00Z" w16du:dateUtc="2024-11-09T12:09:00Z">
               <w:tcPr>
                 <w:tcW w:w="6563" w:type="dxa"/>
               </w:tcPr>
@@ -11965,7 +11965,7 @@
                 <w:lang w:eastAsia="ja-JP"/>
               </w:rPr>
             </w:pPr>
-            <w:ins w:id="251" w:author="Damian Struk" w:date="2024-11-09T13:09:00Z" w16du:dateUtc="2024-11-09T12:09:00Z">
+            <w:ins w:id="251" w:author="stella" w:date="2024-11-09T13:09:00Z" w16du:dateUtc="2024-11-09T12:09:00Z">
               <w:r>
                 <w:rPr>
                   <w:rFonts w:ascii="Corbel" w:hAnsi="Corbel"/>
@@ -12033,7 +12033,7 @@
                 <w:t xml:space="preserve"> Bank Czech Republic and Slovakia, a.s.</w:t>
               </w:r>
             </w:ins>
-            <w:del w:id="252" w:author="Damian Struk" w:date="2024-11-09T13:09:00Z" w16du:dateUtc="2024-11-09T12:09:00Z">
+            <w:del w:id="252" w:author="stella" w:date="2024-11-09T13:09:00Z" w16du:dateUtc="2024-11-09T12:09:00Z">
               <w:r>
                 <w:rPr>
                   <w:rFonts w:ascii="Corbel" w:hAnsi="Corbel"/>
@@ -12051,7 +12051,7 @@
           <w:tblW w:w="9498" w:type="dxa"/>
           <w:tblInd w:w="567" w:type="dxa"/>
           <w:tblLayout w:type="fixed"/>
-          <w:tblPrExChange w:id="253" w:author="Damian Struk" w:date="2024-11-09T13:09:00Z" w16du:dateUtc="2024-11-09T12:09:00Z">
+          <w:tblPrExChange w:id="253" w:author="stella" w:date="2024-11-09T13:09:00Z" w16du:dateUtc="2024-11-09T12:09:00Z">
             <w:tblPrEx>
               <w:tblW w:w="9498" w:type="dxa"/>
               <w:tblInd w:w="567" w:type="dxa"/>
@@ -12062,7 +12062,7 @@
         <w:tc>
           <w:tcPr>
             <w:tcW w:w="709" w:type="dxa"/>
-            <w:tcPrChange w:id="254" w:author="Damian Struk" w:date="2024-11-09T13:09:00Z" w16du:dateUtc="2024-11-09T12:09:00Z">
+            <w:tcPrChange w:id="254" w:author="stella" w:date="2024-11-09T13:09:00Z" w16du:dateUtc="2024-11-09T12:09:00Z">
               <w:tcPr>
                 <w:tcW w:w="709" w:type="dxa"/>
               </w:tcPr>
@@ -12090,7 +12090,7 @@
         <w:tc>
           <w:tcPr>
             <w:tcW w:w="2226" w:type="dxa"/>
-            <w:tcPrChange w:id="255" w:author="Damian Struk" w:date="2024-11-09T13:09:00Z" w16du:dateUtc="2024-11-09T12:09:00Z">
+            <w:tcPrChange w:id="255" w:author="stella" w:date="2024-11-09T13:09:00Z" w16du:dateUtc="2024-11-09T12:09:00Z">
               <w:tcPr>
                 <w:tcW w:w="2226" w:type="dxa"/>
               </w:tcPr>
@@ -12110,7 +12110,7 @@
                 <w:lang w:eastAsia="en-US"/>
               </w:rPr>
             </w:pPr>
-            <w:ins w:id="256" w:author="Damian Struk" w:date="2024-11-09T13:09:00Z" w16du:dateUtc="2024-11-09T12:09:00Z">
+            <w:ins w:id="256" w:author="stella" w:date="2024-11-09T13:09:00Z" w16du:dateUtc="2024-11-09T12:09:00Z">
               <w:r>
                 <w:rPr>
                   <w:rFonts w:ascii="Corbel" w:hAnsi="Corbel"/>
@@ -12148,7 +12148,7 @@
                 <w:t xml:space="preserve"> 2</w:t>
               </w:r>
             </w:ins>
-            <w:del w:id="257" w:author="Damian Struk" w:date="2024-11-09T13:09:00Z" w16du:dateUtc="2024-11-09T12:09:00Z">
+            <w:del w:id="257" w:author="stella" w:date="2024-11-09T13:09:00Z" w16du:dateUtc="2024-11-09T12:09:00Z">
               <w:r>
                 <w:rPr>
                   <w:rFonts w:ascii="Corbel" w:hAnsi="Corbel"/>
@@ -12191,7 +12191,7 @@
         <w:tc>
           <w:tcPr>
             <w:tcW w:w="6563" w:type="dxa"/>
-            <w:tcPrChange w:id="258" w:author="Damian Struk" w:date="2024-11-09T13:09:00Z" w16du:dateUtc="2024-11-09T12:09:00Z">
+            <w:tcPrChange w:id="258" w:author="stella" w:date="2024-11-09T13:09:00Z" w16du:dateUtc="2024-11-09T12:09:00Z">
               <w:tcPr>
                 <w:tcW w:w="6563" w:type="dxa"/>
               </w:tcPr>
@@ -12210,7 +12210,7 @@
                 <w:lang w:eastAsia="en-US"/>
               </w:rPr>
             </w:pPr>
-            <w:ins w:id="259" w:author="Damian Struk" w:date="2024-11-09T13:09:00Z" w16du:dateUtc="2024-11-09T12:09:00Z">
+            <w:ins w:id="259" w:author="stella" w:date="2024-11-09T13:09:00Z" w16du:dateUtc="2024-11-09T12:09:00Z">
               <w:r>
                 <w:rPr>
                   <w:rFonts w:ascii="Corbel" w:hAnsi="Corbel"/>
@@ -12235,7 +12235,7 @@
                 <w:t>1506790083/0800, vedený u společnosti Česká spořitelna a.s.</w:t>
               </w:r>
             </w:ins>
-            <w:del w:id="260" w:author="Damian Struk" w:date="2024-11-09T13:09:00Z" w16du:dateUtc="2024-11-09T12:09:00Z">
+            <w:del w:id="260" w:author="stella" w:date="2024-11-09T13:09:00Z" w16du:dateUtc="2024-11-09T12:09:00Z">
               <w:r>
                 <w:rPr>
                   <w:rFonts w:ascii="Corbel" w:hAnsi="Corbel"/>
@@ -12301,7 +12301,7 @@
           <w:tblW w:w="9498" w:type="dxa"/>
           <w:tblInd w:w="567" w:type="dxa"/>
           <w:tblLayout w:type="fixed"/>
-          <w:tblPrExChange w:id="261" w:author="Damian Struk" w:date="2024-11-09T13:09:00Z" w16du:dateUtc="2024-11-09T12:09:00Z">
+          <w:tblPrExChange w:id="261" w:author="stella" w:date="2024-11-09T13:09:00Z" w16du:dateUtc="2024-11-09T12:09:00Z">
             <w:tblPrEx>
               <w:tblW w:w="9498" w:type="dxa"/>
               <w:tblInd w:w="567" w:type="dxa"/>
@@ -12312,7 +12312,7 @@
         <w:tc>
           <w:tcPr>
             <w:tcW w:w="709" w:type="dxa"/>
-            <w:tcPrChange w:id="262" w:author="Damian Struk" w:date="2024-11-09T13:09:00Z" w16du:dateUtc="2024-11-09T12:09:00Z">
+            <w:tcPrChange w:id="262" w:author="stella" w:date="2024-11-09T13:09:00Z" w16du:dateUtc="2024-11-09T12:09:00Z">
               <w:tcPr>
                 <w:tcW w:w="709" w:type="dxa"/>
               </w:tcPr>
@@ -12340,7 +12340,7 @@
         <w:tc>
           <w:tcPr>
             <w:tcW w:w="2226" w:type="dxa"/>
-            <w:tcPrChange w:id="263" w:author="Damian Struk" w:date="2024-11-09T13:09:00Z" w16du:dateUtc="2024-11-09T12:09:00Z">
+            <w:tcPrChange w:id="263" w:author="stella" w:date="2024-11-09T13:09:00Z" w16du:dateUtc="2024-11-09T12:09:00Z">
               <w:tcPr>
                 <w:tcW w:w="2226" w:type="dxa"/>
               </w:tcPr>
@@ -12360,7 +12360,7 @@
                 <w:lang w:eastAsia="en-US"/>
               </w:rPr>
             </w:pPr>
-            <w:ins w:id="264" w:author="Damian Struk" w:date="2024-11-09T13:09:00Z" w16du:dateUtc="2024-11-09T12:09:00Z">
+            <w:ins w:id="264" w:author="stella" w:date="2024-11-09T13:09:00Z" w16du:dateUtc="2024-11-09T12:09:00Z">
               <w:r>
                 <w:rPr>
                   <w:rFonts w:ascii="Corbel" w:hAnsi="Corbel"/>
@@ -12398,7 +12398,7 @@
                 <w:t xml:space="preserve"> 3</w:t>
               </w:r>
             </w:ins>
-            <w:del w:id="265" w:author="Damian Struk" w:date="2024-11-09T13:09:00Z" w16du:dateUtc="2024-11-09T12:09:00Z">
+            <w:del w:id="265" w:author="stella" w:date="2024-11-09T13:09:00Z" w16du:dateUtc="2024-11-09T12:09:00Z">
               <w:r>
                 <w:rPr>
                   <w:rFonts w:ascii="Corbel" w:hAnsi="Corbel"/>
@@ -12441,7 +12441,7 @@
         <w:tc>
           <w:tcPr>
             <w:tcW w:w="6563" w:type="dxa"/>
-            <w:tcPrChange w:id="266" w:author="Damian Struk" w:date="2024-11-09T13:09:00Z" w16du:dateUtc="2024-11-09T12:09:00Z">
+            <w:tcPrChange w:id="266" w:author="stella" w:date="2024-11-09T13:09:00Z" w16du:dateUtc="2024-11-09T12:09:00Z">
               <w:tcPr>
                 <w:tcW w:w="6563" w:type="dxa"/>
               </w:tcPr>
@@ -12460,7 +12460,7 @@
                 <w:lang w:eastAsia="en-US"/>
               </w:rPr>
             </w:pPr>
-            <w:ins w:id="267" w:author="Damian Struk" w:date="2024-11-09T13:09:00Z" w16du:dateUtc="2024-11-09T12:09:00Z">
+            <w:ins w:id="267" w:author="stella" w:date="2024-11-09T13:09:00Z" w16du:dateUtc="2024-11-09T12:09:00Z">
               <w:r>
                 <w:rPr>
                   <w:rFonts w:ascii="Corbel" w:hAnsi="Corbel"/>
@@ -12488,7 +12488,7 @@
                 <w:t xml:space="preserve"> Bank Czech Republic and Slovakia a.s. (úschovní účet).</w:t>
               </w:r>
             </w:ins>
-            <w:del w:id="268" w:author="Damian Struk" w:date="2024-11-09T13:09:00Z" w16du:dateUtc="2024-11-09T12:09:00Z">
+            <w:del w:id="268" w:author="stella" w:date="2024-11-09T13:09:00Z" w16du:dateUtc="2024-11-09T12:09:00Z">
               <w:r>
                 <w:rPr>
                   <w:rFonts w:ascii="Corbel" w:hAnsi="Corbel"/>
@@ -12521,7 +12521,7 @@
           <w:tblW w:w="9498" w:type="dxa"/>
           <w:tblInd w:w="567" w:type="dxa"/>
           <w:tblLayout w:type="fixed"/>
-          <w:tblPrExChange w:id="269" w:author="Damian Struk" w:date="2024-11-09T13:09:00Z" w16du:dateUtc="2024-11-09T12:09:00Z">
+          <w:tblPrExChange w:id="269" w:author="stella" w:date="2024-11-09T13:09:00Z" w16du:dateUtc="2024-11-09T12:09:00Z">
             <w:tblPrEx>
               <w:tblW w:w="9498" w:type="dxa"/>
               <w:tblInd w:w="567" w:type="dxa"/>
@@ -12532,7 +12532,7 @@
         <w:tc>
           <w:tcPr>
             <w:tcW w:w="709" w:type="dxa"/>
-            <w:tcPrChange w:id="270" w:author="Damian Struk" w:date="2024-11-09T13:09:00Z" w16du:dateUtc="2024-11-09T12:09:00Z">
+            <w:tcPrChange w:id="270" w:author="stella" w:date="2024-11-09T13:09:00Z" w16du:dateUtc="2024-11-09T12:09:00Z">
               <w:tcPr>
                 <w:tcW w:w="709" w:type="dxa"/>
               </w:tcPr>
@@ -12560,7 +12560,7 @@
         <w:tc>
           <w:tcPr>
             <w:tcW w:w="2226" w:type="dxa"/>
-            <w:tcPrChange w:id="271" w:author="Damian Struk" w:date="2024-11-09T13:09:00Z" w16du:dateUtc="2024-11-09T12:09:00Z">
+            <w:tcPrChange w:id="271" w:author="stella" w:date="2024-11-09T13:09:00Z" w16du:dateUtc="2024-11-09T12:09:00Z">
               <w:tcPr>
                 <w:tcW w:w="2226" w:type="dxa"/>
               </w:tcPr>
@@ -12580,7 +12580,7 @@
                 <w:lang w:eastAsia="en-US"/>
               </w:rPr>
             </w:pPr>
-            <w:ins w:id="272" w:author="Damian Struk" w:date="2024-11-09T13:09:00Z" w16du:dateUtc="2024-11-09T12:09:00Z">
+            <w:ins w:id="272" w:author="stella" w:date="2024-11-09T13:09:00Z" w16du:dateUtc="2024-11-09T12:09:00Z">
               <w:r>
                 <w:rPr>
                   <w:rFonts w:ascii="Corbel" w:hAnsi="Corbel"/>
@@ -12591,7 +12591,7 @@
                 <w:t>Zákon o obchodních korporacích</w:t>
               </w:r>
             </w:ins>
-            <w:del w:id="273" w:author="Damian Struk" w:date="2024-11-09T13:09:00Z" w16du:dateUtc="2024-11-09T12:09:00Z">
+            <w:del w:id="273" w:author="stella" w:date="2024-11-09T13:09:00Z" w16du:dateUtc="2024-11-09T12:09:00Z">
               <w:r>
                 <w:rPr>
                   <w:rFonts w:ascii="Corbel" w:hAnsi="Corbel"/>
@@ -12634,7 +12634,7 @@
         <w:tc>
           <w:tcPr>
             <w:tcW w:w="6563" w:type="dxa"/>
-            <w:tcPrChange w:id="274" w:author="Damian Struk" w:date="2024-11-09T13:09:00Z" w16du:dateUtc="2024-11-09T12:09:00Z">
+            <w:tcPrChange w:id="274" w:author="stella" w:date="2024-11-09T13:09:00Z" w16du:dateUtc="2024-11-09T12:09:00Z">
               <w:tcPr>
                 <w:tcW w:w="6563" w:type="dxa"/>
               </w:tcPr>
@@ -12653,7 +12653,7 @@
                 <w:lang w:eastAsia="en-US"/>
               </w:rPr>
             </w:pPr>
-            <w:ins w:id="275" w:author="Damian Struk" w:date="2024-11-09T13:09:00Z" w16du:dateUtc="2024-11-09T12:09:00Z">
+            <w:ins w:id="275" w:author="stella" w:date="2024-11-09T13:09:00Z" w16du:dateUtc="2024-11-09T12:09:00Z">
               <w:r>
                 <w:rPr>
                   <w:rFonts w:ascii="Corbel" w:hAnsi="Corbel"/>
@@ -12684,7 +12684,7 @@
                 <w:t>družstvech (zákon o obchodních korporacích), ve znění pozdějších předpisů.</w:t>
               </w:r>
             </w:ins>
-            <w:del w:id="276" w:author="Damian Struk" w:date="2024-11-09T13:09:00Z" w16du:dateUtc="2024-11-09T12:09:00Z">
+            <w:del w:id="276" w:author="stella" w:date="2024-11-09T13:09:00Z" w16du:dateUtc="2024-11-09T12:09:00Z">
               <w:r>
                 <w:rPr>
                   <w:rFonts w:ascii="Corbel" w:hAnsi="Corbel"/>
@@ -12702,7 +12702,7 @@
           <w:tblW w:w="9498" w:type="dxa"/>
           <w:tblInd w:w="567" w:type="dxa"/>
           <w:tblLayout w:type="fixed"/>
-          <w:tblPrExChange w:id="277" w:author="Damian Struk" w:date="2024-11-09T13:09:00Z" w16du:dateUtc="2024-11-09T12:09:00Z">
+          <w:tblPrExChange w:id="277" w:author="stella" w:date="2024-11-09T13:09:00Z" w16du:dateUtc="2024-11-09T12:09:00Z">
             <w:tblPrEx>
               <w:tblW w:w="9498" w:type="dxa"/>
               <w:tblInd w:w="567" w:type="dxa"/>
@@ -12713,7 +12713,7 @@
         <w:tc>
           <w:tcPr>
             <w:tcW w:w="709" w:type="dxa"/>
-            <w:tcPrChange w:id="278" w:author="Damian Struk" w:date="2024-11-09T13:09:00Z" w16du:dateUtc="2024-11-09T12:09:00Z">
+            <w:tcPrChange w:id="278" w:author="stella" w:date="2024-11-09T13:09:00Z" w16du:dateUtc="2024-11-09T12:09:00Z">
               <w:tcPr>
                 <w:tcW w:w="709" w:type="dxa"/>
               </w:tcPr>
@@ -12741,7 +12741,7 @@
         <w:tc>
           <w:tcPr>
             <w:tcW w:w="2226" w:type="dxa"/>
-            <w:tcPrChange w:id="279" w:author="Damian Struk" w:date="2024-11-09T13:09:00Z" w16du:dateUtc="2024-11-09T12:09:00Z">
+            <w:tcPrChange w:id="279" w:author="stella" w:date="2024-11-09T13:09:00Z" w16du:dateUtc="2024-11-09T12:09:00Z">
               <w:tcPr>
                 <w:tcW w:w="2226" w:type="dxa"/>
               </w:tcPr>
@@ -12761,7 +12761,7 @@
                 <w:lang w:eastAsia="ja-JP"/>
               </w:rPr>
             </w:pPr>
-            <w:ins w:id="280" w:author="Damian Struk" w:date="2024-11-09T13:09:00Z" w16du:dateUtc="2024-11-09T12:09:00Z">
+            <w:ins w:id="280" w:author="stella" w:date="2024-11-09T13:09:00Z" w16du:dateUtc="2024-11-09T12:09:00Z">
               <w:r>
                 <w:rPr>
                   <w:rFonts w:ascii="Corbel" w:hAnsi="Corbel"/>
@@ -12772,7 +12772,7 @@
                 <w:t>Zákon o registru smluv</w:t>
               </w:r>
             </w:ins>
-            <w:del w:id="281" w:author="Damian Struk" w:date="2024-11-09T13:09:00Z" w16du:dateUtc="2024-11-09T12:09:00Z">
+            <w:del w:id="281" w:author="stella" w:date="2024-11-09T13:09:00Z" w16du:dateUtc="2024-11-09T12:09:00Z">
               <w:r>
                 <w:rPr>
                   <w:rFonts w:ascii="Corbel" w:hAnsi="Corbel"/>
@@ -12788,7 +12788,7 @@
         <w:tc>
           <w:tcPr>
             <w:tcW w:w="6563" w:type="dxa"/>
-            <w:tcPrChange w:id="282" w:author="Damian Struk" w:date="2024-11-09T13:09:00Z" w16du:dateUtc="2024-11-09T12:09:00Z">
+            <w:tcPrChange w:id="282" w:author="stella" w:date="2024-11-09T13:09:00Z" w16du:dateUtc="2024-11-09T12:09:00Z">
               <w:tcPr>
                 <w:tcW w:w="6563" w:type="dxa"/>
               </w:tcPr>
@@ -12807,7 +12807,7 @@
                 <w:lang w:eastAsia="ja-JP"/>
               </w:rPr>
             </w:pPr>
-            <w:ins w:id="283" w:author="Damian Struk" w:date="2024-11-09T13:09:00Z" w16du:dateUtc="2024-11-09T12:09:00Z">
+            <w:ins w:id="283" w:author="stella" w:date="2024-11-09T13:09:00Z" w16du:dateUtc="2024-11-09T12:09:00Z">
               <w:r>
                 <w:rPr>
                   <w:rFonts w:ascii="Corbel" w:hAnsi="Corbel"/>
@@ -12833,7 +12833,7 @@
                 <w:t>.</w:t>
               </w:r>
             </w:ins>
-            <w:del w:id="284" w:author="Damian Struk" w:date="2024-11-09T13:09:00Z" w16du:dateUtc="2024-11-09T12:09:00Z">
+            <w:del w:id="284" w:author="stella" w:date="2024-11-09T13:09:00Z" w16du:dateUtc="2024-11-09T12:09:00Z">
               <w:r>
                 <w:rPr>
                   <w:rFonts w:ascii="Corbel" w:hAnsi="Corbel"/>
@@ -12872,7 +12872,7 @@
           <w:tblW w:w="9498" w:type="dxa"/>
           <w:tblInd w:w="567" w:type="dxa"/>
           <w:tblLayout w:type="fixed"/>
-          <w:tblPrExChange w:id="285" w:author="Damian Struk" w:date="2024-11-09T13:09:00Z" w16du:dateUtc="2024-11-09T12:09:00Z">
+          <w:tblPrExChange w:id="285" w:author="stella" w:date="2024-11-09T13:09:00Z" w16du:dateUtc="2024-11-09T12:09:00Z">
             <w:tblPrEx>
               <w:tblW w:w="9498" w:type="dxa"/>
               <w:tblInd w:w="567" w:type="dxa"/>
@@ -12883,7 +12883,7 @@
         <w:tc>
           <w:tcPr>
             <w:tcW w:w="709" w:type="dxa"/>
-            <w:tcPrChange w:id="286" w:author="Damian Struk" w:date="2024-11-09T13:09:00Z" w16du:dateUtc="2024-11-09T12:09:00Z">
+            <w:tcPrChange w:id="286" w:author="stella" w:date="2024-11-09T13:09:00Z" w16du:dateUtc="2024-11-09T12:09:00Z">
               <w:tcPr>
                 <w:tcW w:w="709" w:type="dxa"/>
               </w:tcPr>
@@ -12911,7 +12911,7 @@
         <w:tc>
           <w:tcPr>
             <w:tcW w:w="2226" w:type="dxa"/>
-            <w:tcPrChange w:id="287" w:author="Damian Struk" w:date="2024-11-09T13:09:00Z" w16du:dateUtc="2024-11-09T12:09:00Z">
+            <w:tcPrChange w:id="287" w:author="stella" w:date="2024-11-09T13:09:00Z" w16du:dateUtc="2024-11-09T12:09:00Z">
               <w:tcPr>
                 <w:tcW w:w="2226" w:type="dxa"/>
               </w:tcPr>
@@ -12931,7 +12931,7 @@
                 <w:lang w:eastAsia="ja-JP"/>
               </w:rPr>
             </w:pPr>
-            <w:ins w:id="288" w:author="Damian Struk" w:date="2024-11-09T13:09:00Z" w16du:dateUtc="2024-11-09T12:09:00Z">
+            <w:ins w:id="288" w:author="stella" w:date="2024-11-09T13:09:00Z" w16du:dateUtc="2024-11-09T12:09:00Z">
               <w:r>
                 <w:rPr>
                   <w:rFonts w:ascii="Corbel" w:hAnsi="Corbel"/>
@@ -12942,7 +12942,7 @@
                 <w:t>Zákon o veřejných rejstřících</w:t>
               </w:r>
             </w:ins>
-            <w:del w:id="289" w:author="Damian Struk" w:date="2024-11-09T13:09:00Z" w16du:dateUtc="2024-11-09T12:09:00Z">
+            <w:del w:id="289" w:author="stella" w:date="2024-11-09T13:09:00Z" w16du:dateUtc="2024-11-09T12:09:00Z">
               <w:r>
                 <w:rPr>
                   <w:rFonts w:ascii="Corbel" w:hAnsi="Corbel"/>
@@ -12958,7 +12958,7 @@
         <w:tc>
           <w:tcPr>
             <w:tcW w:w="6563" w:type="dxa"/>
-            <w:tcPrChange w:id="290" w:author="Damian Struk" w:date="2024-11-09T13:09:00Z" w16du:dateUtc="2024-11-09T12:09:00Z">
+            <w:tcPrChange w:id="290" w:author="stella" w:date="2024-11-09T13:09:00Z" w16du:dateUtc="2024-11-09T12:09:00Z">
               <w:tcPr>
                 <w:tcW w:w="6563" w:type="dxa"/>
               </w:tcPr>
@@ -12977,7 +12977,7 @@
                 <w:lang w:eastAsia="ja-JP"/>
               </w:rPr>
             </w:pPr>
-            <w:ins w:id="291" w:author="Damian Struk" w:date="2024-11-09T13:09:00Z" w16du:dateUtc="2024-11-09T12:09:00Z">
+            <w:ins w:id="291" w:author="stella" w:date="2024-11-09T13:09:00Z" w16du:dateUtc="2024-11-09T12:09:00Z">
               <w:r>
                 <w:rPr>
                   <w:rFonts w:ascii="Corbel" w:hAnsi="Corbel"/>
@@ -13019,7 +13019,7 @@
                 <w:t>, ve znění pozdějších předpisů.</w:t>
               </w:r>
             </w:ins>
-            <w:del w:id="292" w:author="Damian Struk" w:date="2024-11-09T13:09:00Z" w16du:dateUtc="2024-11-09T12:09:00Z">
+            <w:del w:id="292" w:author="stella" w:date="2024-11-09T13:09:00Z" w16du:dateUtc="2024-11-09T12:09:00Z">
               <w:r>
                 <w:rPr>
                   <w:rFonts w:ascii="Corbel" w:hAnsi="Corbel"/>
@@ -13053,7 +13053,7 @@
           <w:tblW w:w="9498" w:type="dxa"/>
           <w:tblInd w:w="567" w:type="dxa"/>
           <w:tblLayout w:type="fixed"/>
-          <w:tblPrExChange w:id="293" w:author="Damian Struk" w:date="2024-11-09T13:09:00Z" w16du:dateUtc="2024-11-09T12:09:00Z">
+          <w:tblPrExChange w:id="293" w:author="stella" w:date="2024-11-09T13:09:00Z" w16du:dateUtc="2024-11-09T12:09:00Z">
             <w:tblPrEx>
               <w:tblW w:w="9498" w:type="dxa"/>
               <w:tblInd w:w="567" w:type="dxa"/>
@@ -13064,7 +13064,7 @@
         <w:tc>
           <w:tcPr>
             <w:tcW w:w="709" w:type="dxa"/>
-            <w:tcPrChange w:id="294" w:author="Damian Struk" w:date="2024-11-09T13:09:00Z" w16du:dateUtc="2024-11-09T12:09:00Z">
+            <w:tcPrChange w:id="294" w:author="stella" w:date="2024-11-09T13:09:00Z" w16du:dateUtc="2024-11-09T12:09:00Z">
               <w:tcPr>
                 <w:tcW w:w="709" w:type="dxa"/>
               </w:tcPr>
@@ -13092,7 +13092,7 @@
         <w:tc>
           <w:tcPr>
             <w:tcW w:w="2226" w:type="dxa"/>
-            <w:tcPrChange w:id="295" w:author="Damian Struk" w:date="2024-11-09T13:09:00Z" w16du:dateUtc="2024-11-09T12:09:00Z">
+            <w:tcPrChange w:id="295" w:author="stella" w:date="2024-11-09T13:09:00Z" w16du:dateUtc="2024-11-09T12:09:00Z">
               <w:tcPr>
                 <w:tcW w:w="2226" w:type="dxa"/>
               </w:tcPr>
@@ -13112,7 +13112,7 @@
                 <w:lang w:eastAsia="ja-JP"/>
               </w:rPr>
             </w:pPr>
-            <w:ins w:id="296" w:author="Damian Struk" w:date="2024-11-09T13:09:00Z" w16du:dateUtc="2024-11-09T12:09:00Z">
+            <w:ins w:id="296" w:author="stella" w:date="2024-11-09T13:09:00Z" w16du:dateUtc="2024-11-09T12:09:00Z">
               <w:r>
                 <w:rPr>
                   <w:rFonts w:ascii="Corbel" w:hAnsi="Corbel"/>
@@ -13123,7 +13123,7 @@
                 <w:t>Záruky</w:t>
               </w:r>
             </w:ins>
-            <w:del w:id="297" w:author="Damian Struk" w:date="2024-11-09T13:09:00Z" w16du:dateUtc="2024-11-09T12:09:00Z">
+            <w:del w:id="297" w:author="stella" w:date="2024-11-09T13:09:00Z" w16du:dateUtc="2024-11-09T12:09:00Z">
               <w:r>
                 <w:rPr>
                   <w:rFonts w:ascii="Corbel" w:hAnsi="Corbel"/>
@@ -13139,7 +13139,7 @@
         <w:tc>
           <w:tcPr>
             <w:tcW w:w="6563" w:type="dxa"/>
-            <w:tcPrChange w:id="298" w:author="Damian Struk" w:date="2024-11-09T13:09:00Z" w16du:dateUtc="2024-11-09T12:09:00Z">
+            <w:tcPrChange w:id="298" w:author="stella" w:date="2024-11-09T13:09:00Z" w16du:dateUtc="2024-11-09T12:09:00Z">
               <w:tcPr>
                 <w:tcW w:w="6563" w:type="dxa"/>
               </w:tcPr>
@@ -13158,7 +13158,7 @@
                 <w:lang w:eastAsia="ja-JP"/>
               </w:rPr>
             </w:pPr>
-            <w:ins w:id="299" w:author="Damian Struk" w:date="2024-11-09T13:09:00Z" w16du:dateUtc="2024-11-09T12:09:00Z">
+            <w:ins w:id="299" w:author="stella" w:date="2024-11-09T13:09:00Z" w16du:dateUtc="2024-11-09T12:09:00Z">
               <w:r>
                 <w:rPr>
                   <w:rFonts w:ascii="Corbel" w:hAnsi="Corbel"/>
@@ -13199,7 +13199,7 @@
                 <w:lang w:eastAsia="ja-JP"/>
               </w:rPr>
             </w:r>
-            <w:ins w:id="300" w:author="Damian Struk" w:date="2024-11-09T13:09:00Z" w16du:dateUtc="2024-11-09T12:09:00Z">
+            <w:ins w:id="300" w:author="stella" w:date="2024-11-09T13:09:00Z" w16du:dateUtc="2024-11-09T12:09:00Z">
               <w:r>
                 <w:rPr>
                   <w:rFonts w:ascii="Corbel" w:hAnsi="Corbel"/>
@@ -13233,7 +13233,7 @@
                 <w:t xml:space="preserve">. </w:t>
               </w:r>
             </w:ins>
-            <w:del w:id="301" w:author="Damian Struk" w:date="2024-11-09T13:09:00Z" w16du:dateUtc="2024-11-09T12:09:00Z">
+            <w:del w:id="301" w:author="stella" w:date="2024-11-09T13:09:00Z" w16du:dateUtc="2024-11-09T12:09:00Z">
               <w:r>
                 <w:rPr>
                   <w:rFonts w:ascii="Corbel" w:hAnsi="Corbel"/>
@@ -13283,7 +13283,7 @@
           <w:tblW w:w="9498" w:type="dxa"/>
           <w:tblInd w:w="567" w:type="dxa"/>
           <w:tblLayout w:type="fixed"/>
-          <w:tblPrExChange w:id="302" w:author="Damian Struk" w:date="2024-11-09T13:09:00Z" w16du:dateUtc="2024-11-09T12:09:00Z">
+          <w:tblPrExChange w:id="302" w:author="stella" w:date="2024-11-09T13:09:00Z" w16du:dateUtc="2024-11-09T12:09:00Z">
             <w:tblPrEx>
               <w:tblW w:w="9498" w:type="dxa"/>
               <w:tblInd w:w="567" w:type="dxa"/>
@@ -13294,7 +13294,7 @@
         <w:tc>
           <w:tcPr>
             <w:tcW w:w="709" w:type="dxa"/>
-            <w:tcPrChange w:id="303" w:author="Damian Struk" w:date="2024-11-09T13:09:00Z" w16du:dateUtc="2024-11-09T12:09:00Z">
+            <w:tcPrChange w:id="303" w:author="stella" w:date="2024-11-09T13:09:00Z" w16du:dateUtc="2024-11-09T12:09:00Z">
               <w:tcPr>
                 <w:tcW w:w="709" w:type="dxa"/>
               </w:tcPr>
@@ -13322,7 +13322,7 @@
         <w:tc>
           <w:tcPr>
             <w:tcW w:w="2226" w:type="dxa"/>
-            <w:tcPrChange w:id="304" w:author="Damian Struk" w:date="2024-11-09T13:09:00Z" w16du:dateUtc="2024-11-09T12:09:00Z">
+            <w:tcPrChange w:id="304" w:author="stella" w:date="2024-11-09T13:09:00Z" w16du:dateUtc="2024-11-09T12:09:00Z">
               <w:tcPr>
                 <w:tcW w:w="2226" w:type="dxa"/>
               </w:tcPr>
@@ -13342,7 +13342,7 @@
                 <w:lang w:eastAsia="ja-JP"/>
               </w:rPr>
             </w:pPr>
-            <w:del w:id="305" w:author="Damian Struk" w:date="2024-11-09T13:09:00Z" w16du:dateUtc="2024-11-09T12:09:00Z">
+            <w:del w:id="305" w:author="stella" w:date="2024-11-09T13:09:00Z" w16du:dateUtc="2024-11-09T12:09:00Z">
               <w:r>
                 <w:rPr>
                   <w:rFonts w:ascii="Corbel" w:hAnsi="Corbel"/>
@@ -13358,7 +13358,7 @@
         <w:tc>
           <w:tcPr>
             <w:tcW w:w="6563" w:type="dxa"/>
-            <w:tcPrChange w:id="306" w:author="Damian Struk" w:date="2024-11-09T13:09:00Z" w16du:dateUtc="2024-11-09T12:09:00Z">
+            <w:tcPrChange w:id="306" w:author="stella" w:date="2024-11-09T13:09:00Z" w16du:dateUtc="2024-11-09T12:09:00Z">
               <w:tcPr>
                 <w:tcW w:w="6563" w:type="dxa"/>
               </w:tcPr>
@@ -13377,7 +13377,7 @@
                 <w:lang w:eastAsia="ja-JP"/>
               </w:rPr>
             </w:pPr>
-            <w:del w:id="307" w:author="Damian Struk" w:date="2024-11-09T13:09:00Z" w16du:dateUtc="2024-11-09T12:09:00Z">
+            <w:del w:id="307" w:author="stella" w:date="2024-11-09T13:09:00Z" w16du:dateUtc="2024-11-09T12:09:00Z">
               <w:r>
                 <w:rPr>
                   <w:rFonts w:ascii="Corbel" w:hAnsi="Corbel"/>
@@ -21761,10 +21761,10 @@
           <w:numId w:val="7"/>
         </w:numPr>
         <w:rPr>
-          <w:del w:id="359" w:author="Damian Struk" w:date="2024-11-09T13:09:00Z" w16du:dateUtc="2024-11-09T12:09:00Z"/>
-        </w:rPr>
-      </w:pPr>
-      <w:del w:id="360" w:author="Damian Struk" w:date="2024-11-09T13:09:00Z" w16du:dateUtc="2024-11-09T12:09:00Z">
+          <w:del w:id="359" w:author="stella" w:date="2024-11-09T13:09:00Z" w16du:dateUtc="2024-11-09T12:09:00Z"/>
+        </w:rPr>
+      </w:pPr>
+      <w:del w:id="360" w:author="stella" w:date="2024-11-09T13:09:00Z" w16du:dateUtc="2024-11-09T12:09:00Z">
         <w:r>
           <w:delText>částk</w:delText>
         </w:r>
@@ -21790,14 +21790,14 @@
         <w:pStyle w:val="Heading3"/>
         <w:widowControl w:val="0"/>
         <w:rPr>
-          <w:del w:id="361" w:author="Damian Struk" w:date="2024-11-09T13:09:00Z" w16du:dateUtc="2024-11-09T12:09:00Z"/>
-          <w:rFonts w:ascii="Corbel" w:hAnsi="Corbel"/>
-          <w:color w:val="575757"/>
-          <w:sz w:val="22"/>
-          <w:szCs w:val="22"/>
-        </w:rPr>
-      </w:pPr>
-      <w:del w:id="362" w:author="Damian Struk" w:date="2024-11-09T13:09:00Z" w16du:dateUtc="2024-11-09T12:09:00Z">
+          <w:del w:id="361" w:author="stella" w:date="2024-11-09T13:09:00Z" w16du:dateUtc="2024-11-09T12:09:00Z"/>
+          <w:rFonts w:ascii="Corbel" w:hAnsi="Corbel"/>
+          <w:color w:val="575757"/>
+          <w:sz w:val="22"/>
+          <w:szCs w:val="22"/>
+        </w:rPr>
+      </w:pPr>
+      <w:del w:id="362" w:author="stella" w:date="2024-11-09T13:09:00Z" w16du:dateUtc="2024-11-09T12:09:00Z">
         <w:r>
           <w:rPr>
             <w:rFonts w:ascii="Corbel" w:hAnsi="Corbel"/>
@@ -29560,14 +29560,14 @@
         <w:pStyle w:val="Heading3"/>
         <w:widowControl w:val="0"/>
         <w:rPr>
-          <w:del w:id="416" w:author="Damian Struk" w:date="2024-11-09T13:09:00Z" w16du:dateUtc="2024-11-09T12:09:00Z"/>
-          <w:rFonts w:ascii="Corbel" w:hAnsi="Corbel"/>
-          <w:color w:val="575757"/>
-          <w:sz w:val="22"/>
-          <w:szCs w:val="22"/>
-        </w:rPr>
-      </w:pPr>
-      <w:del w:id="417" w:author="Damian Struk" w:date="2024-11-09T13:09:00Z" w16du:dateUtc="2024-11-09T12:09:00Z">
+          <w:del w:id="416" w:author="stella" w:date="2024-11-09T13:09:00Z" w16du:dateUtc="2024-11-09T12:09:00Z"/>
+          <w:rFonts w:ascii="Corbel" w:hAnsi="Corbel"/>
+          <w:color w:val="575757"/>
+          <w:sz w:val="22"/>
+          <w:szCs w:val="22"/>
+        </w:rPr>
+      </w:pPr>
+      <w:del w:id="417" w:author="stella" w:date="2024-11-09T13:09:00Z" w16du:dateUtc="2024-11-09T12:09:00Z">
         <w:r>
           <w:rPr>
             <w:rFonts w:ascii="Corbel" w:hAnsi="Corbel"/>
@@ -34555,7 +34555,7 @@
         </w:rPr>
         <w:t xml:space="preserve">Rámcová smlouva o poskytování platebních služeb s Fio banka a.s. </w:t>
       </w:r>
-      <w:del w:id="418" w:author="Jan Kubica" w:date="2024-11-09T20:28:00Z" w16du:dateUtc="2024-11-09T19:28:00Z">
+      <w:del w:id="418" w:author="stella" w:date="2024-11-09T20:28:00Z" w16du:dateUtc="2024-11-09T19:28:00Z">
         <w:r>
           <w:rPr>
             <w:rFonts w:ascii="Corbel" w:hAnsi="Corbel"/>
@@ -47657,11 +47657,11 @@
 
 <file path=word/people.xml><?xml version="1.0" encoding="utf-8"?>
 <w15:people xmlns:wpc="http://schemas.microsoft.com/office/word/2010/wordprocessingCanvas" xmlns:cx="http://schemas.microsoft.com/office/drawing/2014/chartex" xmlns:cx1="http://schemas.microsoft.com/office/drawing/2015/9/8/chartex" xmlns:cx2="http://schemas.microsoft.com/office/drawing/2015/10/21/chartex" xmlns:cx3="http://schemas.microsoft.com/office/drawing/2016/5/9/chartex" xmlns:cx4="http://schemas.microsoft.com/office/drawing/2016/5/10/chartex" xmlns:cx5="http://schemas.microsoft.com/office/drawing/2016/5/11/chartex" xmlns:cx6="http://schemas.microsoft.com/office/drawing/2016/5/12/chartex" xmlns:cx7="http://schemas.microsoft.com/office/drawing/2016/5/13/chartex" xmlns:cx8="http://schemas.microsoft.com/office/drawing/2016/5/14/chartex" xmlns:mc="http://schemas.openxmlformats.org/markup-compatibility/2006" xmlns:aink="http://schemas.microsoft.com/office/drawing/2016/ink" xmlns:am3d="http://schemas.microsoft.com/office/drawing/2017/model3d" xmlns:o="urn:schemas-microsoft-com:office:office" xmlns:oel="http://schemas.microsoft.com/office/2019/extlst" xmlns:r="http://schemas.openxmlformats.org/officeDocument/2006/relationships" xmlns:m="http://schemas.openxmlformats.org/officeDocument/2006/math" xmlns:v="urn:schemas-microsoft-com:vml" xmlns:wp14="http://schemas.microsoft.com/office/word/2010/wordprocessingDrawing" xmlns:wp="http://schemas.openxmlformats.org/drawingml/2006/wordprocessingDrawing" xmlns:w10="urn:schemas-microsoft-com:office:word" xmlns:w="http://schemas.openxmlformats.org/wordprocessingml/2006/main" xmlns:w14="http://schemas.microsoft.com/office/word/2010/wordml" xmlns:w15="http://schemas.microsoft.com/office/word/2012/wordml" xmlns:w16cex="http://schemas.microsoft.com/office/word/2018/wordml/cex" xmlns:w16cid="http://schemas.microsoft.com/office/word/2016/wordml/cid" xmlns:w16="http://schemas.microsoft.com/office/word/2018/wordml" xmlns:w16du="http://schemas.microsoft.com/office/word/2023/wordml/word16du" xmlns:w16sdtdh="http://schemas.microsoft.com/office/word/2020/wordml/sdtdatahash" xmlns:w16sdtfl="http://schemas.microsoft.com/office/word/2024/wordml/sdtformatlock" xmlns:w16se="http://schemas.microsoft.com/office/word/2015/wordml/symex" xmlns:wpg="http://schemas.microsoft.com/office/word/2010/wordprocessingGroup" xmlns:wpi="http://schemas.microsoft.com/office/word/2010/wordprocessingInk" xmlns:wne="http://schemas.microsoft.com/office/word/2006/wordml" xmlns:wps="http://schemas.microsoft.com/office/word/2010/wordprocessingShape" mc:Ignorable="w14 w15 w16se w16cid w16 w16cex w16sdtdh w16sdtfl w16du wp14">
-  <w15:person w15:author="Damian Struk">
-    <w15:presenceInfo w15:providerId="AD" w15:userId="S::damian.struk@singledraft.onmicrosoft.com::3ab11056-ad66-4607-81dd-b32869b9ccbf"/>
+  <w15:person w15:author="stella">
+    <w15:presenceInfo w15:providerId="stella" w15:userId="stella"/>
   </w15:person>
-  <w15:person w15:author="Jan Kubica">
-    <w15:presenceInfo w15:providerId="None" w15:userId="Jan Kubica"/>
+  <w15:person w15:author="stella">
+    <w15:presenceInfo w15:providerId="stella" w15:userId="stella"/>
   </w15:person>
 </w15:people>
 </file>

</xml_diff>